<commit_message>
Update resume across all formats
Co-Authored-By: Claude Opus 4.5 <noreply@anthropic.com>
</commit_message>
<xml_diff>
--- a/Peter-Bartsch-Resume.docx
+++ b/Peter-Bartsch-Resume.docx
@@ -13,9 +13,10 @@
       </w:pPr>
       <w:r>
         <w:rPr>
-          <w:rtl w:val="0"/>
-        </w:rPr>
-        <w:t xml:space="preserve">Product designer specializing in enterprise design systems and complex data products. 15 years hands-on work—from solo IC at $3M startup to senior designer at $38B enterprise. Research, prototyping, systematic design, and occasional team building along the way.</w:t>
+          <w:rFonts w:ascii="Arial Unicode MS" w:cs="Arial Unicode MS" w:eastAsia="Arial Unicode MS" w:hAnsi="Arial Unicode MS"/>
+          <w:rtl w:val="0"/>
+        </w:rPr>
+        <w:t xml:space="preserve">Product designer who ships. 15+ years building 0→1 products and scaling design systems—from solo founder to employee #28 at hypergrowth startup to senior IC at $38B enterprise. Research-driven, prototype-obsessed, comfortable with ambiguity.</w:t>
       </w:r>
       <w:r>
         <w:rPr>
@@ -34,12 +35,6 @@
       </w:pPr>
       <w:r>
         <w:rPr>
-          <w:rtl w:val="0"/>
-        </w:rPr>
-        <w:br w:type="textWrapping"/>
-      </w:r>
-      <w:r>
-        <w:rPr>
           <w:color w:val="999999"/>
           <w:rtl w:val="0"/>
         </w:rPr>
@@ -49,7 +44,7 @@
     <w:p>
       <w:pPr>
         <w:spacing w:after="240" w:before="240" w:line="240" w:lineRule="auto"/>
-        <w:ind w:left="-630.0000000000001" w:right="-623.3333333333348" w:firstLine="0"/>
+        <w:ind w:left="-630.0000000000001" w:right="0" w:firstLine="0"/>
         <w:jc w:val="both"/>
         <w:rPr/>
       </w:pPr>
@@ -67,7 +62,7 @@
         </w:rPr>
         <w:t xml:space="preserve"> | Aug 2024 - Present </w:t>
         <w:br w:type="textWrapping"/>
-        <w:t xml:space="preserve">Open-source modular shelter system that transforms parking spaces into productive environments—from saunas to urban farms.</w:t>
+        <w:t xml:space="preserve">Treating AI as my technical co-founder, learning how to compress timelines, work across disciplines, and ship products that traditionally require full teams. Building open-source modular shelter systems that transform parking spot sized spaces into productive environments.</w:t>
       </w:r>
     </w:p>
     <w:p>
@@ -77,33 +72,32 @@
           <w:numId w:val="3"/>
         </w:numPr>
         <w:spacing w:after="0" w:afterAutospacing="0" w:before="240" w:line="240" w:lineRule="auto"/>
-        <w:ind w:left="720" w:right="-623.3333333333348" w:hanging="360"/>
-        <w:jc w:val="both"/>
-        <w:rPr>
-          <w:color w:val="434343"/>
-        </w:rPr>
-      </w:pPr>
-      <w:r>
-        <w:rPr>
-          <w:rFonts w:ascii="Arial Unicode MS" w:cs="Arial Unicode MS" w:eastAsia="Arial Unicode MS" w:hAnsi="Arial Unicode MS"/>
-          <w:b w:val="1"/>
-          <w:bCs w:val="1"/>
-          <w:rtl w:val="0"/>
-        </w:rPr>
-        <w:t xml:space="preserve">Designed and built complete product ecosystem from 0→1</w:t>
-      </w:r>
-      <w:r>
-        <w:rPr>
-          <w:rtl w:val="0"/>
-        </w:rPr>
-        <w:t xml:space="preserve">: </w:t>
-      </w:r>
-      <w:r>
-        <w:rPr>
-          <w:color w:val="434343"/>
-          <w:rtl w:val="0"/>
-        </w:rPr>
-        <w:t xml:space="preserve">5 modular shelter variants with full CAD/3D models (OnShape), physical working prototype, web platform, and multi-tier business model—leveraging AI tools (Claude, Cursor) as technical co-founder to accelerate development across design, engineering, and strategy</w:t>
+        <w:ind w:left="720" w:hanging="360"/>
+        <w:rPr>
+          <w:color w:val="434343"/>
+          <w:sz w:val="20"/>
+          <w:szCs w:val="20"/>
+        </w:rPr>
+      </w:pPr>
+      <w:r>
+        <w:rPr>
+          <w:b w:val="1"/>
+          <w:bCs w:val="1"/>
+          <w:color w:val="434343"/>
+          <w:sz w:val="20"/>
+          <w:szCs w:val="20"/>
+          <w:rtl w:val="0"/>
+        </w:rPr>
+        <w:t xml:space="preserve">Created complete product ecosystem solo in 18 months</w:t>
+      </w:r>
+      <w:r>
+        <w:rPr>
+          <w:color w:val="434343"/>
+          <w:sz w:val="20"/>
+          <w:szCs w:val="20"/>
+          <w:rtl w:val="0"/>
+        </w:rPr>
+        <w:t xml:space="preserve">: brand identity inspired by early 2000s open-source culture, 3 websites (thios.co, blog, store), 5 shelter variants with CAD models, physical prototype, and handbook generating first revenue</w:t>
       </w:r>
     </w:p>
     <w:p>
@@ -113,32 +107,68 @@
           <w:numId w:val="3"/>
         </w:numPr>
         <w:spacing w:after="0" w:afterAutospacing="0" w:before="0" w:beforeAutospacing="0" w:line="240" w:lineRule="auto"/>
-        <w:ind w:left="720" w:right="-623.3333333333348" w:hanging="360"/>
-        <w:jc w:val="both"/>
-        <w:rPr>
-          <w:color w:val="434343"/>
-        </w:rPr>
-      </w:pPr>
-      <w:r>
-        <w:rPr>
-          <w:b w:val="1"/>
-          <w:bCs w:val="1"/>
-          <w:rtl w:val="0"/>
-        </w:rPr>
-        <w:t xml:space="preserve">Launched first revenue-generating product</w:t>
-      </w:r>
-      <w:r>
-        <w:rPr>
-          <w:rtl w:val="0"/>
-        </w:rPr>
-        <w:t xml:space="preserve">:</w:t>
-      </w:r>
-      <w:r>
-        <w:rPr>
-          <w:color w:val="434343"/>
-          <w:rtl w:val="0"/>
-        </w:rPr>
-        <w:t xml:space="preserve"> Whole Thiosphere Handbook—200+ page build guide with architectural drawings, cut lists, and assembly instructions, targeting 2,000 early customers with lifetime updates</w:t>
+        <w:ind w:left="720" w:hanging="360"/>
+        <w:rPr>
+          <w:color w:val="434343"/>
+          <w:sz w:val="20"/>
+          <w:szCs w:val="20"/>
+        </w:rPr>
+      </w:pPr>
+      <w:r>
+        <w:rPr>
+          <w:b w:val="1"/>
+          <w:bCs w:val="1"/>
+          <w:color w:val="434343"/>
+          <w:sz w:val="20"/>
+          <w:szCs w:val="20"/>
+          <w:rtl w:val="0"/>
+        </w:rPr>
+        <w:t xml:space="preserve">Applied full career toolkit simultaneously</w:t>
+      </w:r>
+      <w:r>
+        <w:rPr>
+          <w:rFonts w:ascii="Arial Unicode MS" w:cs="Arial Unicode MS" w:eastAsia="Arial Unicode MS" w:hAnsi="Arial Unicode MS"/>
+          <w:color w:val="434343"/>
+          <w:sz w:val="20"/>
+          <w:szCs w:val="20"/>
+          <w:rtl w:val="0"/>
+        </w:rPr>
+        <w:t xml:space="preserve">—product strategy, marketing, and design execution using GitHub Copilot → Cursor → Anti Gravity progression; proving experienced generalists can operate across traditional role boundaries with AI partnership</w:t>
+      </w:r>
+    </w:p>
+    <w:p>
+      <w:pPr>
+        <w:numPr>
+          <w:ilvl w:val="0"/>
+          <w:numId w:val="3"/>
+        </w:numPr>
+        <w:spacing w:after="0" w:afterAutospacing="0" w:before="0" w:beforeAutospacing="0" w:line="240" w:lineRule="auto"/>
+        <w:ind w:left="720" w:hanging="360"/>
+        <w:rPr>
+          <w:color w:val="434343"/>
+          <w:sz w:val="20"/>
+          <w:szCs w:val="20"/>
+        </w:rPr>
+      </w:pPr>
+      <w:r>
+        <w:rPr>
+          <w:b w:val="1"/>
+          <w:bCs w:val="1"/>
+          <w:color w:val="434343"/>
+          <w:sz w:val="20"/>
+          <w:szCs w:val="20"/>
+          <w:rtl w:val="0"/>
+        </w:rPr>
+        <w:t xml:space="preserve">Established AI-augmented workflows</w:t>
+      </w:r>
+      <w:r>
+        <w:rPr>
+          <w:color w:val="434343"/>
+          <w:sz w:val="20"/>
+          <w:szCs w:val="20"/>
+          <w:rtl w:val="0"/>
+        </w:rPr>
+        <w:t xml:space="preserve">: Obsidian MD + AI for project management and research synthesis; Figma Make for design-to-code; compressed prototyping cycles 70% through conversational development in Cursor and Anti-Gravity &amp; Claude Code</w:t>
       </w:r>
     </w:p>
     <w:p>
@@ -148,26 +178,36 @@
           <w:numId w:val="3"/>
         </w:numPr>
         <w:spacing w:after="240" w:before="0" w:beforeAutospacing="0" w:line="240" w:lineRule="auto"/>
-        <w:ind w:left="720" w:right="-623.3333333333348" w:hanging="360"/>
-        <w:jc w:val="both"/>
-        <w:rPr>
-          <w:color w:val="434343"/>
-        </w:rPr>
-      </w:pPr>
-      <w:r>
-        <w:rPr>
-          <w:b w:val="1"/>
-          <w:bCs w:val="1"/>
-          <w:rtl w:val="0"/>
-        </w:rPr>
-        <w:t xml:space="preserve">Applied AI-augmented workflows</w:t>
-      </w:r>
-      <w:r>
-        <w:rPr>
-          <w:color w:val="434343"/>
-          <w:rtl w:val="0"/>
-        </w:rPr>
-        <w:t xml:space="preserve"> across entire development cycle—concept validation, CAD modeling, web development, technical documentation—demonstrating practical AI integration as force multiplier for product development</w:t>
+        <w:ind w:left="720" w:hanging="360"/>
+        <w:rPr>
+          <w:color w:val="434343"/>
+        </w:rPr>
+      </w:pPr>
+      <w:r>
+        <w:rPr>
+          <w:b w:val="1"/>
+          <w:bCs w:val="1"/>
+          <w:color w:val="434343"/>
+          <w:sz w:val="20"/>
+          <w:szCs w:val="20"/>
+          <w:rtl w:val="0"/>
+        </w:rPr>
+        <w:t xml:space="preserve">Outcomes</w:t>
+      </w:r>
+      <w:r>
+        <w:rPr>
+          <w:color w:val="434343"/>
+          <w:sz w:val="20"/>
+          <w:szCs w:val="20"/>
+          <w:rtl w:val="0"/>
+        </w:rPr>
+        <w:t xml:space="preserve">: Validated AI as practical force multiplier for startups; demonstrating how to maintain product quality while working at solo-founder velocity; any prototype is possible</w:t>
+      </w:r>
+      <w:r>
+        <w:rPr>
+          <w:color w:val="434343"/>
+          <w:rtl w:val="0"/>
+        </w:rPr>
         <w:br w:type="textWrapping"/>
       </w:r>
       <w:r>
@@ -180,6 +220,141 @@
       <w:pPr>
         <w:spacing w:after="240" w:before="240" w:line="240" w:lineRule="auto"/>
         <w:ind w:left="-630.0000000000001" w:right="-623.3333333333348" w:firstLine="0"/>
+        <w:rPr/>
+      </w:pPr>
+      <w:r>
+        <w:rPr>
+          <w:b w:val="1"/>
+          <w:bCs w:val="1"/>
+          <w:rtl w:val="0"/>
+        </w:rPr>
+        <w:t xml:space="preserve">FOURKITES | Lead UX / Manager</w:t>
+      </w:r>
+      <w:r>
+        <w:rPr>
+          <w:rtl w:val="0"/>
+        </w:rPr>
+        <w:t xml:space="preserve"> | Jan 2017 - Jan 2020</w:t>
+        <w:br w:type="textWrapping"/>
+        <w:t xml:space="preserve">Employee #28 during hypergrowth ($3M to $100M ARR). Built design function from scratch—founding designer to 10-person global team.</w:t>
+      </w:r>
+    </w:p>
+    <w:p>
+      <w:pPr>
+        <w:numPr>
+          <w:ilvl w:val="0"/>
+          <w:numId w:val="1"/>
+        </w:numPr>
+        <w:spacing w:after="0" w:afterAutospacing="0" w:before="240" w:line="240" w:lineRule="auto"/>
+        <w:ind w:left="720" w:hanging="360"/>
+        <w:rPr>
+          <w:color w:val="434343"/>
+          <w:sz w:val="20"/>
+          <w:szCs w:val="20"/>
+        </w:rPr>
+      </w:pPr>
+      <w:r>
+        <w:rPr>
+          <w:rFonts w:ascii="Arial Unicode MS" w:cs="Arial Unicode MS" w:eastAsia="Arial Unicode MS" w:hAnsi="Arial Unicode MS"/>
+          <w:b w:val="1"/>
+          <w:bCs w:val="1"/>
+          <w:color w:val="434343"/>
+          <w:sz w:val="20"/>
+          <w:szCs w:val="20"/>
+          <w:rtl w:val="0"/>
+        </w:rPr>
+        <w:t xml:space="preserve">Designed flagship products from 0→1</w:t>
+      </w:r>
+      <w:r>
+        <w:rPr>
+          <w:color w:val="434343"/>
+          <w:sz w:val="20"/>
+          <w:szCs w:val="20"/>
+          <w:rtl w:val="0"/>
+        </w:rPr>
+        <w:t xml:space="preserve">: Real-time supply chain control tower and related mobile apps processing 10M+ daily tracking events for 30+ Fortune 2000 companies (Anheuser-Busch, Georgia-Pacific, Tyson); products became primary driver of 3x customer expansion</w:t>
+      </w:r>
+    </w:p>
+    <w:p>
+      <w:pPr>
+        <w:numPr>
+          <w:ilvl w:val="0"/>
+          <w:numId w:val="1"/>
+        </w:numPr>
+        <w:spacing w:after="0" w:afterAutospacing="0" w:before="0" w:beforeAutospacing="0" w:line="240" w:lineRule="auto"/>
+        <w:ind w:left="720" w:hanging="360"/>
+        <w:rPr>
+          <w:color w:val="434343"/>
+          <w:sz w:val="20"/>
+          <w:szCs w:val="20"/>
+        </w:rPr>
+      </w:pPr>
+      <w:r>
+        <w:rPr>
+          <w:b w:val="1"/>
+          <w:bCs w:val="1"/>
+          <w:color w:val="434343"/>
+          <w:sz w:val="20"/>
+          <w:szCs w:val="20"/>
+          <w:rtl w:val="0"/>
+        </w:rPr>
+        <w:t xml:space="preserve">Led bespoke predictive analytics dashboard products</w:t>
+      </w:r>
+      <w:r>
+        <w:rPr>
+          <w:color w:val="434343"/>
+          <w:sz w:val="20"/>
+          <w:szCs w:val="20"/>
+          <w:rtl w:val="0"/>
+        </w:rPr>
+        <w:t xml:space="preserve"> identifying shipment delays 6-12 hours earlier than competitors; increased customer retention 41% and expanded average contract value $120K annually</w:t>
+      </w:r>
+    </w:p>
+    <w:p>
+      <w:pPr>
+        <w:numPr>
+          <w:ilvl w:val="0"/>
+          <w:numId w:val="1"/>
+        </w:numPr>
+        <w:spacing w:after="240" w:before="0" w:beforeAutospacing="0" w:line="240" w:lineRule="auto"/>
+        <w:ind w:left="720" w:hanging="360"/>
+        <w:rPr>
+          <w:color w:val="434343"/>
+        </w:rPr>
+      </w:pPr>
+      <w:r>
+        <w:rPr>
+          <w:b w:val="1"/>
+          <w:bCs w:val="1"/>
+          <w:color w:val="434343"/>
+          <w:sz w:val="20"/>
+          <w:szCs w:val="20"/>
+          <w:rtl w:val="0"/>
+        </w:rPr>
+        <w:t xml:space="preserve">Scaled design org</w:t>
+      </w:r>
+      <w:r>
+        <w:rPr>
+          <w:color w:val="434343"/>
+          <w:sz w:val="20"/>
+          <w:szCs w:val="20"/>
+          <w:rtl w:val="0"/>
+        </w:rPr>
+        <w:t xml:space="preserve">: Hired and managed team across Chicago and Chennai; established component library, design operations, and hiring framework—reduced design inconsistencies 65% while maintaining startup velocity</w:t>
+      </w:r>
+      <w:r>
+        <w:rPr>
+          <w:b w:val="1"/>
+          <w:bCs w:val="1"/>
+          <w:rtl w:val="0"/>
+        </w:rPr>
+        <w:br w:type="textWrapping"/>
+      </w:r>
+    </w:p>
+    <w:p>
+      <w:pPr>
+        <w:spacing w:after="240" w:before="240" w:line="240" w:lineRule="auto"/>
+        <w:ind w:left="-630.0000000000001" w:right="0" w:firstLine="0"/>
         <w:jc w:val="both"/>
         <w:rPr/>
       </w:pPr>
@@ -197,7 +372,7 @@
         </w:rPr>
         <w:t xml:space="preserve"> | Aug 2020 - Jul 2024 </w:t>
         <w:br w:type="textWrapping"/>
-        <w:t xml:space="preserve">Led UX modernization across enterprise digital products serving agricultural, construction, and forestry markets globally. Embedded with product teams to establish design standards and drive subscription revenue growth.</w:t>
+        <w:t xml:space="preserve">Embedded with product teams to modernize 20-year-old systems and drive subscription revenue. Proving enterprise design can move fast when you have the right frameworks.</w:t>
       </w:r>
     </w:p>
     <w:p>
@@ -207,55 +382,33 @@
           <w:numId w:val="3"/>
         </w:numPr>
         <w:spacing w:after="0" w:afterAutospacing="0" w:before="240" w:line="240" w:lineRule="auto"/>
-        <w:ind w:left="720" w:right="-623.3333333333348" w:hanging="360"/>
-        <w:jc w:val="both"/>
-        <w:rPr>
-          <w:color w:val="434343"/>
-        </w:rPr>
-      </w:pPr>
-      <w:r>
-        <w:rPr>
-          <w:b w:val="1"/>
-          <w:bCs w:val="1"/>
-          <w:rtl w:val="0"/>
-        </w:rPr>
-        <w:t xml:space="preserve">Redesigned 20-year-old license management system</w:t>
-      </w:r>
-      <w:r>
-        <w:rPr>
-          <w:color w:val="434343"/>
-          <w:rtl w:val="0"/>
-        </w:rPr>
-        <w:t xml:space="preserve"> serving 500K+ users across 12 languages, increasing authenticated engagement 34% and reducing support tickets 16%—enabling $3.8B in subscription revenue from Automation and AI services</w:t>
-      </w:r>
-    </w:p>
-    <w:p>
-      <w:pPr>
-        <w:numPr>
-          <w:ilvl w:val="0"/>
-          <w:numId w:val="3"/>
-        </w:numPr>
-        <w:spacing w:after="0" w:afterAutospacing="0" w:before="0" w:beforeAutospacing="0" w:line="240" w:lineRule="auto"/>
-        <w:ind w:left="720" w:right="-623.3333333333348" w:hanging="360"/>
-        <w:jc w:val="both"/>
-        <w:rPr>
-          <w:color w:val="434343"/>
-        </w:rPr>
-      </w:pPr>
-      <w:r>
-        <w:rPr>
-          <w:b w:val="1"/>
-          <w:bCs w:val="1"/>
-          <w:rtl w:val="0"/>
-        </w:rPr>
-        <w:t xml:space="preserve">Created unified account and navigation framework</w:t>
-      </w:r>
-      <w:r>
-        <w:rPr>
-          <w:color w:val="434343"/>
-          <w:rtl w:val="0"/>
-        </w:rPr>
-        <w:t xml:space="preserve"> deployed across all digital touchpoints (web, mobile, embedded) for 8 product lines—consolidated fragmented experiences into single customer view with equipment data, improving dealer support efficiency 28%</w:t>
+        <w:ind w:left="720" w:hanging="360"/>
+        <w:rPr>
+          <w:color w:val="434343"/>
+          <w:sz w:val="20"/>
+          <w:szCs w:val="20"/>
+        </w:rPr>
+      </w:pPr>
+      <w:r>
+        <w:rPr>
+          <w:b w:val="1"/>
+          <w:bCs w:val="1"/>
+          <w:color w:val="434343"/>
+          <w:sz w:val="20"/>
+          <w:szCs w:val="20"/>
+          <w:rtl w:val="0"/>
+        </w:rPr>
+        <w:t xml:space="preserve">Redesigned license management system</w:t>
+      </w:r>
+      <w:r>
+        <w:rPr>
+          <w:color w:val="434343"/>
+          <w:sz w:val="20"/>
+          <w:szCs w:val="20"/>
+          <w:rtl w:val="0"/>
+        </w:rPr>
+        <w:t xml:space="preserve"> serving 500K+ users across 12 languages—increased authenticated engagement 34%, reduced support tickets 16%, enabled $3.8B in subscription revenue from Automation and AI services</w:t>
+        <w:br w:type="textWrapping"/>
       </w:r>
     </w:p>
     <w:p>
@@ -265,152 +418,82 @@
           <w:numId w:val="3"/>
         </w:numPr>
         <w:spacing w:after="240" w:before="0" w:beforeAutospacing="0" w:line="240" w:lineRule="auto"/>
-        <w:ind w:left="720" w:right="-623.3333333333348" w:hanging="360"/>
-        <w:jc w:val="both"/>
-        <w:rPr>
-          <w:color w:val="434343"/>
-          <w:u w:val="none"/>
-        </w:rPr>
-      </w:pPr>
-      <w:r>
-        <w:rPr>
-          <w:b w:val="1"/>
-          <w:bCs w:val="1"/>
-          <w:rtl w:val="0"/>
-        </w:rPr>
-        <w:t xml:space="preserve">Established enterprise design system</w:t>
-      </w:r>
-      <w:r>
-        <w:rPr>
-          <w:rtl w:val="0"/>
-        </w:rPr>
-        <w:t xml:space="preserve"> </w:t>
-      </w:r>
-      <w:r>
-        <w:rPr>
-          <w:color w:val="434343"/>
-          <w:rtl w:val="0"/>
-        </w:rPr>
-        <w:t xml:space="preserve">in Figma spanning 6 brands and 40+ product teams globally, reducing design-to-development handoff time 45% through standardized components and documentation</w:t>
-        <w:br w:type="textWrapping"/>
+        <w:ind w:left="720" w:hanging="360"/>
+        <w:rPr>
+          <w:color w:val="434343"/>
+          <w:sz w:val="20"/>
+          <w:szCs w:val="20"/>
+        </w:rPr>
+      </w:pPr>
+      <w:r>
+        <w:rPr>
+          <w:b w:val="1"/>
+          <w:bCs w:val="1"/>
+          <w:color w:val="434343"/>
+          <w:sz w:val="20"/>
+          <w:szCs w:val="20"/>
+          <w:rtl w:val="0"/>
+        </w:rPr>
+        <w:t xml:space="preserve">Built unified account and navigation framework</w:t>
+      </w:r>
+      <w:r>
+        <w:rPr>
+          <w:color w:val="434343"/>
+          <w:sz w:val="20"/>
+          <w:szCs w:val="20"/>
+          <w:rtl w:val="0"/>
+        </w:rPr>
+        <w:t xml:space="preserve"> deployed across 8 product lines (web, mobile, embedded)—consolidated fragmented experiences into single customer view, improved dealer support efficiency 28%</w:t>
       </w:r>
     </w:p>
     <w:p>
       <w:pPr>
         <w:spacing w:after="240" w:before="240" w:line="240" w:lineRule="auto"/>
-        <w:ind w:left="-630.0000000000001" w:right="-623.3333333333348" w:firstLine="0"/>
-        <w:rPr/>
-      </w:pPr>
-      <w:r>
-        <w:rPr>
-          <w:b w:val="1"/>
-          <w:bCs w:val="1"/>
-          <w:rtl w:val="0"/>
-        </w:rPr>
-        <w:t xml:space="preserve">FOURKITES | Lead UX / Manager</w:t>
-      </w:r>
-      <w:r>
-        <w:rPr>
-          <w:rtl w:val="0"/>
-        </w:rPr>
-        <w:t xml:space="preserve"> | Jan 2017 - Jan 2020</w:t>
-        <w:br w:type="textWrapping"/>
-        <w:t xml:space="preserve">Employee #28 at supply chain visibility startup during hypergrowth ($3M to $100M ARR). Built and led design function from founding designer to 10-person global team.</w:t>
+        <w:rPr>
+          <w:color w:val="434343"/>
+          <w:sz w:val="20"/>
+          <w:szCs w:val="20"/>
+        </w:rPr>
+      </w:pPr>
+      <w:r>
+        <w:rPr>
+          <w:rtl w:val="0"/>
+        </w:rPr>
       </w:r>
     </w:p>
     <w:p>
       <w:pPr>
         <w:numPr>
           <w:ilvl w:val="0"/>
-          <w:numId w:val="1"/>
+          <w:numId w:val="3"/>
         </w:numPr>
-        <w:spacing w:after="0" w:afterAutospacing="0" w:before="240" w:line="240" w:lineRule="auto"/>
-        <w:ind w:left="720" w:right="-360" w:hanging="360"/>
-        <w:jc w:val="both"/>
-        <w:rPr>
-          <w:color w:val="434343"/>
-          <w:u w:val="none"/>
-        </w:rPr>
-      </w:pPr>
-      <w:r>
-        <w:rPr>
-          <w:b w:val="1"/>
-          <w:bCs w:val="1"/>
-          <w:rtl w:val="0"/>
-        </w:rPr>
-        <w:t xml:space="preserve">Designed real-time supply chain control tower</w:t>
-      </w:r>
-      <w:r>
-        <w:rPr>
-          <w:color w:val="434343"/>
-          <w:rtl w:val="0"/>
-        </w:rPr>
-        <w:t xml:space="preserve"> processing 10M+ daily tracking events for 30+ Fortune 2000 companies (Anheuser-Busch, Georgia-Pacific, Tyson Foods)—became company's flagship product driving 3x customer expansion</w:t>
-      </w:r>
-      <w:r>
-        <w:rPr>
-          <w:rtl w:val="0"/>
-        </w:rPr>
-      </w:r>
-    </w:p>
-    <w:p>
-      <w:pPr>
-        <w:numPr>
-          <w:ilvl w:val="0"/>
-          <w:numId w:val="1"/>
-        </w:numPr>
-        <w:spacing w:after="0" w:afterAutospacing="0" w:before="0" w:beforeAutospacing="0" w:line="240" w:lineRule="auto"/>
-        <w:ind w:left="720" w:right="-360" w:hanging="360"/>
-        <w:jc w:val="both"/>
-        <w:rPr>
-          <w:color w:val="434343"/>
-          <w:u w:val="none"/>
-        </w:rPr>
-      </w:pPr>
-      <w:r>
-        <w:rPr>
-          <w:b w:val="1"/>
-          <w:bCs w:val="1"/>
-          <w:rtl w:val="0"/>
-        </w:rPr>
-        <w:t xml:space="preserve">Led predictive analytics dashboard</w:t>
-      </w:r>
-      <w:r>
-        <w:rPr>
-          <w:color w:val="434343"/>
-          <w:rtl w:val="0"/>
-        </w:rPr>
-        <w:t xml:space="preserve"> that identified shipment delays 6-12 hours earlier than competitors, increasing customer retention 41% and expanding average contract value $120K annually</w:t>
-      </w:r>
-    </w:p>
-    <w:p>
-      <w:pPr>
-        <w:numPr>
-          <w:ilvl w:val="0"/>
-          <w:numId w:val="1"/>
-        </w:numPr>
-        <w:spacing w:after="240" w:before="0" w:beforeAutospacing="0" w:line="240" w:lineRule="auto"/>
-        <w:ind w:left="720" w:right="-360" w:hanging="360"/>
-        <w:jc w:val="both"/>
-        <w:rPr>
-          <w:color w:val="434343"/>
-          <w:u w:val="none"/>
-        </w:rPr>
-      </w:pPr>
-      <w:r>
-        <w:rPr>
-          <w:b w:val="1"/>
-          <w:bCs w:val="1"/>
-          <w:rtl w:val="0"/>
-        </w:rPr>
-        <w:t xml:space="preserve">Scaled design team from 1 to 10</w:t>
-      </w:r>
-      <w:r>
-        <w:rPr>
-          <w:color w:val="434343"/>
-          <w:rtl w:val="0"/>
-        </w:rPr>
-        <w:t xml:space="preserve"> across Chicago and Chennai offices while establishing hiring framework, design operations, and component library that reduced design inconsistencies 65%</w:t>
+        <w:spacing w:after="240" w:before="240" w:line="240" w:lineRule="auto"/>
+        <w:ind w:left="720" w:hanging="360"/>
+        <w:rPr>
+          <w:color w:val="434343"/>
+          <w:sz w:val="20"/>
+          <w:szCs w:val="20"/>
+        </w:rPr>
+      </w:pPr>
+      <w:r>
+        <w:rPr>
+          <w:b w:val="1"/>
+          <w:bCs w:val="1"/>
+          <w:color w:val="434343"/>
+          <w:sz w:val="20"/>
+          <w:szCs w:val="20"/>
+          <w:rtl w:val="0"/>
+        </w:rPr>
+        <w:t xml:space="preserve">Established enterprise design system</w:t>
+      </w:r>
+      <w:r>
+        <w:rPr>
+          <w:color w:val="434343"/>
+          <w:sz w:val="20"/>
+          <w:szCs w:val="20"/>
+          <w:rtl w:val="0"/>
+        </w:rPr>
+        <w:t xml:space="preserve"> in Figma spanning 6 brands and 40+ product teams globally—reduced design-to-development handoff time 45% through standardized components that actually shipped</w:t>
       </w:r>
       <w:r>
         <w:rPr>
@@ -446,7 +529,7 @@
         </w:rPr>
         <w:t xml:space="preserve"> | Jan 2014 - Jan 2017 </w:t>
         <w:br w:type="textWrapping"/>
-        <w:t xml:space="preserve">Led UX and Agile transformation for Fortune 500 digital products across healthcare and pharmaceutical sectors.</w:t>
+        <w:t xml:space="preserve">Led digital product design for Fortune 500 healthcare and pharmaceutical clients. Fast iteration in slow-moving industries.</w:t>
       </w:r>
     </w:p>
     <w:p>
@@ -456,16 +539,20 @@
           <w:numId w:val="4"/>
         </w:numPr>
         <w:spacing w:after="0" w:afterAutospacing="0" w:before="240" w:line="240" w:lineRule="auto"/>
-        <w:ind w:left="720" w:right="-623.3333333333348" w:hanging="360"/>
-        <w:jc w:val="both"/>
-        <w:rPr>
-          <w:u w:val="none"/>
-        </w:rPr>
-      </w:pPr>
-      <w:r>
-        <w:rPr>
-          <w:b w:val="1"/>
-          <w:bCs w:val="1"/>
+        <w:ind w:left="720" w:hanging="360"/>
+        <w:rPr>
+          <w:color w:val="434343"/>
+          <w:sz w:val="20"/>
+          <w:szCs w:val="20"/>
+        </w:rPr>
+      </w:pPr>
+      <w:r>
+        <w:rPr>
+          <w:b w:val="1"/>
+          <w:bCs w:val="1"/>
+          <w:color w:val="434343"/>
+          <w:sz w:val="20"/>
+          <w:szCs w:val="20"/>
           <w:rtl w:val="0"/>
         </w:rPr>
         <w:t xml:space="preserve">Designed 6 internal portals for AbbVie</w:t>
@@ -473,9 +560,11 @@
       <w:r>
         <w:rPr>
           <w:color w:val="434343"/>
-          <w:rtl w:val="0"/>
-        </w:rPr>
-        <w:t xml:space="preserve"> supporting 200K+ users across clinical trials and patient support programs—improved medication adherence tracking and reduced hospital readmissions 12% through simplified workflows</w:t>
+          <w:sz w:val="20"/>
+          <w:szCs w:val="20"/>
+          <w:rtl w:val="0"/>
+        </w:rPr>
+        <w:t xml:space="preserve"> supporting 200K+ users across clinical trials and patient support programs—improved medication adherence tracking, reduced hospital readmissions 12%</w:t>
       </w:r>
     </w:p>
     <w:p>
@@ -485,16 +574,20 @@
           <w:numId w:val="4"/>
         </w:numPr>
         <w:spacing w:after="0" w:afterAutospacing="0" w:before="0" w:beforeAutospacing="0" w:line="240" w:lineRule="auto"/>
-        <w:ind w:left="720" w:right="-623.3333333333348" w:hanging="360"/>
-        <w:jc w:val="both"/>
-        <w:rPr>
-          <w:u w:val="none"/>
-        </w:rPr>
-      </w:pPr>
-      <w:r>
-        <w:rPr>
-          <w:b w:val="1"/>
-          <w:bCs w:val="1"/>
+        <w:ind w:left="720" w:hanging="360"/>
+        <w:rPr>
+          <w:color w:val="434343"/>
+          <w:sz w:val="20"/>
+          <w:szCs w:val="20"/>
+        </w:rPr>
+      </w:pPr>
+      <w:r>
+        <w:rPr>
+          <w:b w:val="1"/>
+          <w:bCs w:val="1"/>
+          <w:color w:val="434343"/>
+          <w:sz w:val="20"/>
+          <w:szCs w:val="20"/>
           <w:rtl w:val="0"/>
         </w:rPr>
         <w:t xml:space="preserve">Rebuilt OptumRx pharmacy formulary platform</w:t>
@@ -502,9 +595,11 @@
       <w:r>
         <w:rPr>
           <w:color w:val="434343"/>
-          <w:rtl w:val="0"/>
-        </w:rPr>
-        <w:t xml:space="preserve"> processing 1.4B prescriptions annually—created company's first patient-facing product, reducing fulfillment errors 15% through improved drug interaction warnings and onboarding</w:t>
+          <w:sz w:val="20"/>
+          <w:szCs w:val="20"/>
+          <w:rtl w:val="0"/>
+        </w:rPr>
+        <w:t xml:space="preserve"> processing 1.4B prescriptions annually—created company's first patient-facing product, reduced fulfillment errors 15% through improved drug interaction warnings</w:t>
       </w:r>
     </w:p>
     <w:p>
@@ -514,16 +609,20 @@
           <w:numId w:val="4"/>
         </w:numPr>
         <w:spacing w:after="240" w:before="0" w:beforeAutospacing="0" w:line="240" w:lineRule="auto"/>
-        <w:ind w:left="720" w:right="-623.3333333333348" w:hanging="360"/>
-        <w:jc w:val="both"/>
-        <w:rPr>
-          <w:u w:val="none"/>
-        </w:rPr>
-      </w:pPr>
-      <w:r>
-        <w:rPr>
-          <w:b w:val="1"/>
-          <w:bCs w:val="1"/>
+        <w:ind w:left="720" w:hanging="360"/>
+        <w:rPr>
+          <w:color w:val="434343"/>
+          <w:sz w:val="20"/>
+          <w:szCs w:val="20"/>
+        </w:rPr>
+      </w:pPr>
+      <w:r>
+        <w:rPr>
+          <w:b w:val="1"/>
+          <w:bCs w:val="1"/>
+          <w:color w:val="434343"/>
+          <w:sz w:val="20"/>
+          <w:szCs w:val="20"/>
           <w:rtl w:val="0"/>
         </w:rPr>
         <w:t xml:space="preserve">Established Lean UX and Agile practices</w:t>
@@ -531,6 +630,8 @@
       <w:r>
         <w:rPr>
           <w:color w:val="434343"/>
+          <w:sz w:val="20"/>
+          <w:szCs w:val="20"/>
           <w:rtl w:val="0"/>
         </w:rPr>
         <w:t xml:space="preserve"> across client engagements while mentoring junior designers and leading cross-functional design sprints</w:t>
@@ -576,6 +677,7 @@
         <w:rPr>
           <w:b w:val="1"/>
           <w:bCs w:val="1"/>
+          <w:color w:val="999999"/>
         </w:rPr>
       </w:pPr>
       <w:r>
@@ -599,16 +701,19 @@
         </w:numPr>
         <w:spacing w:after="0" w:afterAutospacing="0" w:before="240" w:lineRule="auto"/>
         <w:ind w:left="720" w:hanging="360"/>
-        <w:jc w:val="both"/>
-        <w:rPr>
-          <w:color w:val="434343"/>
-        </w:rPr>
-      </w:pPr>
-      <w:r>
-        <w:rPr>
-          <w:b w:val="1"/>
-          <w:bCs w:val="1"/>
-          <w:color w:val="434343"/>
+        <w:rPr>
+          <w:color w:val="434343"/>
+          <w:sz w:val="20"/>
+          <w:szCs w:val="20"/>
+        </w:rPr>
+      </w:pPr>
+      <w:r>
+        <w:rPr>
+          <w:b w:val="1"/>
+          <w:bCs w:val="1"/>
+          <w:color w:val="434343"/>
+          <w:sz w:val="20"/>
+          <w:szCs w:val="20"/>
           <w:rtl w:val="0"/>
         </w:rPr>
         <w:t xml:space="preserve">Nokia HERE Maps</w:t>
@@ -616,6 +721,8 @@
       <w:r>
         <w:rPr>
           <w:color w:val="434343"/>
+          <w:sz w:val="20"/>
+          <w:szCs w:val="20"/>
           <w:rtl w:val="0"/>
         </w:rPr>
         <w:t xml:space="preserve"> | Product Marketing Manager (2012-2014) - Led UX integration of acquired Trapster app, improving onboarding completion 33%</w:t>
@@ -630,16 +737,19 @@
         </w:numPr>
         <w:spacing w:after="0" w:afterAutospacing="0" w:before="0" w:beforeAutospacing="0" w:lineRule="auto"/>
         <w:ind w:left="720" w:hanging="360"/>
-        <w:jc w:val="both"/>
-        <w:rPr>
-          <w:color w:val="434343"/>
-        </w:rPr>
-      </w:pPr>
-      <w:r>
-        <w:rPr>
-          <w:b w:val="1"/>
-          <w:bCs w:val="1"/>
-          <w:color w:val="434343"/>
+        <w:rPr>
+          <w:color w:val="434343"/>
+          <w:sz w:val="20"/>
+          <w:szCs w:val="20"/>
+        </w:rPr>
+      </w:pPr>
+      <w:r>
+        <w:rPr>
+          <w:b w:val="1"/>
+          <w:bCs w:val="1"/>
+          <w:color w:val="434343"/>
+          <w:sz w:val="20"/>
+          <w:szCs w:val="20"/>
           <w:rtl w:val="0"/>
         </w:rPr>
         <w:t xml:space="preserve">Gogo Inflight WiFi</w:t>
@@ -647,9 +757,11 @@
       <w:r>
         <w:rPr>
           <w:color w:val="434343"/>
-          <w:rtl w:val="0"/>
-        </w:rPr>
-        <w:t xml:space="preserve"> | Product Manager (2008-2012) - Launched connectivity services across 6 major airlines; developed sponsored flight tracker generating recurring revenue streams</w:t>
+          <w:sz w:val="20"/>
+          <w:szCs w:val="20"/>
+          <w:rtl w:val="0"/>
+        </w:rPr>
+        <w:t xml:space="preserve"> | Product Manager (2008-2012) - Launched connectivity across 6 major airlines; developed sponsored flight tracker generating recurring revenue</w:t>
         <w:br w:type="textWrapping"/>
       </w:r>
     </w:p>
@@ -661,16 +773,19 @@
         </w:numPr>
         <w:spacing w:after="240" w:before="0" w:beforeAutospacing="0" w:lineRule="auto"/>
         <w:ind w:left="720" w:hanging="360"/>
-        <w:jc w:val="both"/>
-        <w:rPr>
-          <w:color w:val="434343"/>
-        </w:rPr>
-      </w:pPr>
-      <w:r>
-        <w:rPr>
-          <w:b w:val="1"/>
-          <w:bCs w:val="1"/>
-          <w:color w:val="434343"/>
+        <w:rPr>
+          <w:color w:val="434343"/>
+          <w:sz w:val="20"/>
+          <w:szCs w:val="20"/>
+        </w:rPr>
+      </w:pPr>
+      <w:r>
+        <w:rPr>
+          <w:b w:val="1"/>
+          <w:bCs w:val="1"/>
+          <w:color w:val="434343"/>
+          <w:sz w:val="20"/>
+          <w:szCs w:val="20"/>
           <w:rtl w:val="0"/>
         </w:rPr>
         <w:t xml:space="preserve">Cognistar</w:t>
@@ -678,6 +793,8 @@
       <w:r>
         <w:rPr>
           <w:color w:val="434343"/>
+          <w:sz w:val="20"/>
+          <w:szCs w:val="20"/>
           <w:rtl w:val="0"/>
         </w:rPr>
         <w:t xml:space="preserve"> | Co-Founder (2001-2008) - Built digital production and UX for legal education startup; raised $3M, achieved $2M+ annual revenue before acquisition</w:t>
@@ -693,44 +810,186 @@
         <w:ind w:left="-630" w:right="-720" w:firstLine="0"/>
         <w:jc w:val="both"/>
         <w:rPr>
-          <w:color w:val="434343"/>
-          <w:sz w:val="20"/>
-          <w:szCs w:val="20"/>
-        </w:rPr>
-      </w:pPr>
-      <w:r>
-        <w:rPr>
           <w:color w:val="999999"/>
+        </w:rPr>
+      </w:pPr>
+      <w:r>
+        <w:rPr>
+          <w:rtl w:val="0"/>
+        </w:rPr>
+      </w:r>
+    </w:p>
+    <w:p>
+      <w:pPr>
+        <w:ind w:left="-630" w:right="0" w:firstLine="0"/>
+        <w:rPr>
+          <w:color w:val="434343"/>
+          <w:sz w:val="20"/>
+          <w:szCs w:val="20"/>
+        </w:rPr>
+      </w:pPr>
+      <w:r>
+        <w:rPr>
+          <w:color w:val="999999"/>
           <w:rtl w:val="0"/>
         </w:rPr>
         <w:t xml:space="preserve">SKILLS</w:t>
       </w:r>
       <w:r>
         <w:rPr>
+          <w:rtl w:val="0"/>
+        </w:rPr>
+      </w:r>
+    </w:p>
+    <w:p>
+      <w:pPr>
+        <w:rPr>
+          <w:b w:val="1"/>
+          <w:bCs w:val="1"/>
+          <w:color w:val="434343"/>
+        </w:rPr>
+      </w:pPr>
+      <w:r>
+        <w:rPr>
+          <w:b w:val="1"/>
+          <w:bCs w:val="1"/>
+          <w:color w:val="434343"/>
+          <w:rtl w:val="0"/>
+        </w:rPr>
+        <w:t xml:space="preserve">Design Leadership</w:t>
+      </w:r>
+    </w:p>
+    <w:p>
+      <w:pPr>
+        <w:ind w:left="360" w:firstLine="0"/>
+        <w:rPr>
           <w:color w:val="999999"/>
-          <w:sz w:val="16"/>
-          <w:szCs w:val="16"/>
-          <w:rtl w:val="0"/>
-        </w:rPr>
-        <w:br w:type="textWrapping"/>
-      </w:r>
-      <w:r>
-        <w:rPr>
-          <w:b w:val="1"/>
-          <w:bCs w:val="1"/>
-          <w:color w:val="434343"/>
-          <w:rtl w:val="0"/>
-        </w:rPr>
-        <w:t xml:space="preserve">Design Leadership:</w:t>
-      </w:r>
-      <w:r>
-        <w:rPr>
-          <w:color w:val="434343"/>
-          <w:sz w:val="20"/>
-          <w:szCs w:val="20"/>
-          <w:rtl w:val="0"/>
-        </w:rPr>
-        <w:t xml:space="preserve"> Enterprise Design Systems • Cross-functional Team Building • Design Operations • Information Architecture • Data Visualization • Accessibility (WCAG 2.1)</w:t>
+        </w:rPr>
+      </w:pPr>
+      <w:r>
+        <w:rPr>
+          <w:color w:val="434343"/>
+          <w:sz w:val="20"/>
+          <w:szCs w:val="20"/>
+          <w:rtl w:val="0"/>
+        </w:rPr>
+        <w:t xml:space="preserve">Enterprise Design Systems • Cross-functional Team Building • Design Operations • Information Architecture • Data Visualization • Accessibility (WCAG 2.1)</w:t>
+      </w:r>
+      <w:r>
+        <w:rPr>
+          <w:rtl w:val="0"/>
+        </w:rPr>
+      </w:r>
+    </w:p>
+    <w:p>
+      <w:pPr>
+        <w:ind w:left="-630" w:right="0" w:firstLine="0"/>
+        <w:rPr>
+          <w:color w:val="434343"/>
+          <w:sz w:val="8"/>
+          <w:szCs w:val="8"/>
+        </w:rPr>
+      </w:pPr>
+      <w:r>
+        <w:rPr>
+          <w:rtl w:val="0"/>
+        </w:rPr>
+      </w:r>
+    </w:p>
+    <w:p>
+      <w:pPr>
+        <w:rPr>
+          <w:b w:val="1"/>
+          <w:bCs w:val="1"/>
+          <w:color w:val="434343"/>
+        </w:rPr>
+      </w:pPr>
+      <w:r>
+        <w:rPr>
+          <w:b w:val="1"/>
+          <w:bCs w:val="1"/>
+          <w:color w:val="434343"/>
+          <w:rtl w:val="0"/>
+        </w:rPr>
+        <w:t xml:space="preserve">Research &amp; Strategy</w:t>
+      </w:r>
+    </w:p>
+    <w:p>
+      <w:pPr>
+        <w:ind w:left="360" w:firstLine="0"/>
+        <w:rPr>
+          <w:color w:val="999999"/>
+        </w:rPr>
+      </w:pPr>
+      <w:r>
+        <w:rPr>
+          <w:color w:val="434343"/>
+          <w:sz w:val="20"/>
+          <w:szCs w:val="20"/>
+          <w:rtl w:val="0"/>
+        </w:rPr>
+        <w:t xml:space="preserve">User Research • Usability Testing • Journey Mapping • Design Sprints • Lean UX • Agile/Scrum</w:t>
+      </w:r>
+      <w:r>
+        <w:rPr>
+          <w:rtl w:val="0"/>
+        </w:rPr>
+      </w:r>
+    </w:p>
+    <w:p>
+      <w:pPr>
+        <w:ind w:left="-630" w:right="0" w:firstLine="0"/>
+        <w:rPr>
+          <w:color w:val="434343"/>
+          <w:sz w:val="8"/>
+          <w:szCs w:val="8"/>
+        </w:rPr>
+      </w:pPr>
+      <w:r>
+        <w:rPr>
+          <w:rtl w:val="0"/>
+        </w:rPr>
+      </w:r>
+    </w:p>
+    <w:p>
+      <w:pPr>
+        <w:ind w:left="0" w:right="0" w:firstLine="0"/>
+        <w:rPr>
+          <w:b w:val="1"/>
+          <w:bCs w:val="1"/>
+          <w:color w:val="434343"/>
+        </w:rPr>
+      </w:pPr>
+      <w:r>
+        <w:rPr>
+          <w:b w:val="1"/>
+          <w:bCs w:val="1"/>
+          <w:color w:val="434343"/>
+          <w:rtl w:val="0"/>
+        </w:rPr>
+        <w:t xml:space="preserve">Tools</w:t>
+      </w:r>
+    </w:p>
+    <w:p>
+      <w:pPr>
+        <w:ind w:left="360" w:right="0" w:firstLine="0"/>
+        <w:rPr>
+          <w:color w:val="434343"/>
+        </w:rPr>
+      </w:pPr>
+      <w:r>
+        <w:rPr>
+          <w:color w:val="434343"/>
+          <w:sz w:val="20"/>
+          <w:szCs w:val="20"/>
+          <w:rtl w:val="0"/>
+        </w:rPr>
+        <w:t xml:space="preserve">Figma • Adobe Creative Suite • CAD/3D (OnShape) • HTML/CSS • AI Tools (Claude, Cursor) • Prototyping • AI-Augmented Workflows • AI-Integrated Design • Blender 3D</w:t>
+      </w:r>
+      <w:r>
+        <w:rPr>
+          <w:rtl w:val="0"/>
+        </w:rPr>
       </w:r>
     </w:p>
     <w:p>
@@ -738,28 +997,13 @@
         <w:ind w:left="-630" w:right="-720" w:firstLine="0"/>
         <w:jc w:val="both"/>
         <w:rPr>
-          <w:color w:val="434343"/>
-          <w:sz w:val="20"/>
-          <w:szCs w:val="20"/>
-        </w:rPr>
-      </w:pPr>
-      <w:r>
-        <w:rPr>
-          <w:b w:val="1"/>
-          <w:bCs w:val="1"/>
-          <w:color w:val="434343"/>
-          <w:rtl w:val="0"/>
-        </w:rPr>
-        <w:t xml:space="preserve">Research &amp; Strategy:</w:t>
-      </w:r>
-      <w:r>
-        <w:rPr>
-          <w:color w:val="434343"/>
-          <w:sz w:val="20"/>
-          <w:szCs w:val="20"/>
-          <w:rtl w:val="0"/>
-        </w:rPr>
-        <w:t xml:space="preserve"> User Research • Usability Testing • Journey Mapping • Design Sprints • Lean UX • Agile/Scrum</w:t>
+          <w:color w:val="999999"/>
+        </w:rPr>
+      </w:pPr>
+      <w:r>
+        <w:rPr>
+          <w:rtl w:val="0"/>
+        </w:rPr>
       </w:r>
     </w:p>
     <w:p>
@@ -767,32 +1011,58 @@
         <w:ind w:left="-630" w:right="-720" w:firstLine="0"/>
         <w:jc w:val="both"/>
         <w:rPr>
-          <w:sz w:val="20"/>
-          <w:szCs w:val="20"/>
-        </w:rPr>
-      </w:pPr>
-      <w:r>
-        <w:rPr>
-          <w:b w:val="1"/>
-          <w:bCs w:val="1"/>
-          <w:color w:val="434343"/>
-          <w:rtl w:val="0"/>
-        </w:rPr>
-        <w:t xml:space="preserve">Tools:</w:t>
-      </w:r>
-      <w:r>
-        <w:rPr>
-          <w:color w:val="434343"/>
-          <w:sz w:val="20"/>
-          <w:szCs w:val="20"/>
-          <w:rtl w:val="0"/>
-        </w:rPr>
-        <w:t xml:space="preserve"> Figma • Adobe Creative Suite • CAD/3D (OnShape) • HTML/CSS • AI Tools (Claude, Cursor) • Prototyping • AI-Augmented Workflows • AI-Integrated Design</w:t>
-      </w:r>
-      <w:r>
-        <w:rPr>
-          <w:rtl w:val="0"/>
-        </w:rPr>
+          <w:color w:val="434343"/>
+          <w:sz w:val="20"/>
+          <w:szCs w:val="20"/>
+        </w:rPr>
+      </w:pPr>
+      <w:r>
+        <w:rPr>
+          <w:color w:val="999999"/>
+          <w:rtl w:val="0"/>
+        </w:rPr>
+        <w:t xml:space="preserve">EDUCATION</w:t>
+        <w:br w:type="textWrapping"/>
+      </w:r>
+      <w:r>
+        <w:rPr>
+          <w:b w:val="1"/>
+          <w:bCs w:val="1"/>
+          <w:color w:val="434343"/>
+          <w:sz w:val="20"/>
+          <w:szCs w:val="20"/>
+          <w:rtl w:val="0"/>
+        </w:rPr>
+        <w:t xml:space="preserve">Arizona State University</w:t>
+      </w:r>
+      <w:r>
+        <w:rPr>
+          <w:color w:val="434343"/>
+          <w:sz w:val="20"/>
+          <w:szCs w:val="20"/>
+          <w:rtl w:val="0"/>
+        </w:rPr>
+        <w:t xml:space="preserve"> </w:t>
+      </w:r>
+      <w:r>
+        <w:rPr>
+          <w:b w:val="1"/>
+          <w:bCs w:val="1"/>
+          <w:color w:val="434343"/>
+          <w:sz w:val="20"/>
+          <w:szCs w:val="20"/>
+          <w:rtl w:val="0"/>
+        </w:rPr>
+        <w:t xml:space="preserve">| </w:t>
+      </w:r>
+      <w:r>
+        <w:rPr>
+          <w:color w:val="434343"/>
+          <w:sz w:val="20"/>
+          <w:szCs w:val="20"/>
+          <w:rtl w:val="0"/>
+        </w:rPr>
+        <w:t xml:space="preserve">Bachelor of Arts, Humanities and Architectural Theory</w:t>
       </w:r>
     </w:p>
     <w:p>
@@ -800,7 +1070,7 @@
         <w:ind w:left="-630" w:right="-720" w:firstLine="0"/>
         <w:jc w:val="both"/>
         <w:rPr>
-          <w:color w:val="999999"/>
+          <w:color w:val="666666"/>
         </w:rPr>
       </w:pPr>
       <w:r>
@@ -822,58 +1092,7 @@
           <w:color w:val="999999"/>
           <w:rtl w:val="0"/>
         </w:rPr>
-        <w:t xml:space="preserve">EDUCATION</w:t>
-      </w:r>
-    </w:p>
-    <w:p>
-      <w:pPr>
-        <w:ind w:left="360" w:right="-720" w:hanging="990"/>
-        <w:rPr>
-          <w:color w:val="434343"/>
-          <w:sz w:val="26"/>
-          <w:szCs w:val="26"/>
-        </w:rPr>
-      </w:pPr>
-      <w:r>
-        <w:rPr>
-          <w:b w:val="1"/>
-          <w:bCs w:val="1"/>
-          <w:sz w:val="24"/>
-          <w:szCs w:val="24"/>
-          <w:rtl w:val="0"/>
-        </w:rPr>
-        <w:t xml:space="preserve">Arizona State University</w:t>
-      </w:r>
-      <w:r>
-        <w:rPr>
-          <w:sz w:val="24"/>
-          <w:szCs w:val="24"/>
-          <w:rtl w:val="0"/>
-        </w:rPr>
-        <w:t xml:space="preserve"> </w:t>
-      </w:r>
-      <w:r>
-        <w:rPr>
-          <w:b w:val="1"/>
-          <w:bCs w:val="1"/>
-          <w:color w:val="434343"/>
-          <w:rtl w:val="0"/>
-        </w:rPr>
-        <w:t xml:space="preserve">| </w:t>
-      </w:r>
-      <w:r>
-        <w:rPr>
-          <w:color w:val="434343"/>
-          <w:sz w:val="24"/>
-          <w:szCs w:val="24"/>
-          <w:rtl w:val="0"/>
-        </w:rPr>
-        <w:t xml:space="preserve">Bachelor of Arts, Humanities and Architectural Theory</w:t>
-      </w:r>
-      <w:r>
-        <w:rPr>
-          <w:rtl w:val="0"/>
-        </w:rPr>
+        <w:t xml:space="preserve">COMMUNITY</w:t>
       </w:r>
     </w:p>
     <w:p>
@@ -881,59 +1100,30 @@
         <w:ind w:left="-630" w:right="-720" w:firstLine="0"/>
         <w:jc w:val="both"/>
         <w:rPr>
-          <w:color w:val="666666"/>
-        </w:rPr>
-      </w:pPr>
-      <w:r>
-        <w:rPr>
-          <w:rtl w:val="0"/>
-        </w:rPr>
-      </w:r>
-    </w:p>
-    <w:p>
-      <w:pPr>
-        <w:ind w:left="-630" w:right="-720" w:firstLine="0"/>
-        <w:jc w:val="both"/>
-        <w:rPr>
-          <w:color w:val="999999"/>
-        </w:rPr>
-      </w:pPr>
-      <w:r>
-        <w:rPr>
-          <w:color w:val="999999"/>
-          <w:rtl w:val="0"/>
-        </w:rPr>
-        <w:t xml:space="preserve">COMMUNITY</w:t>
-      </w:r>
-    </w:p>
-    <w:p>
-      <w:pPr>
-        <w:ind w:left="-630" w:right="-720" w:firstLine="0"/>
-        <w:jc w:val="both"/>
-        <w:rPr>
-          <w:color w:val="434343"/>
-        </w:rPr>
-      </w:pPr>
-      <w:r>
-        <w:rPr>
-          <w:b w:val="1"/>
-          <w:bCs w:val="1"/>
+          <w:color w:val="434343"/>
+          <w:sz w:val="20"/>
+          <w:szCs w:val="20"/>
+        </w:rPr>
+      </w:pPr>
+      <w:r>
+        <w:rPr>
+          <w:b w:val="1"/>
+          <w:bCs w:val="1"/>
+          <w:color w:val="434343"/>
+          <w:sz w:val="20"/>
+          <w:szCs w:val="20"/>
           <w:rtl w:val="0"/>
         </w:rPr>
         <w:t xml:space="preserve">Board Director | </w:t>
       </w:r>
       <w:r>
         <w:rPr>
-          <w:rtl w:val="0"/>
-        </w:rPr>
-        <w:t xml:space="preserve">How Weird Street Faire 501(c)(3) </w:t>
-      </w:r>
-      <w:r>
-        <w:rPr>
-          <w:color w:val="434343"/>
-          <w:rtl w:val="0"/>
-        </w:rPr>
-        <w:t xml:space="preserve">SF street fair with successful 20+ year run (2004 - 2024)</w:t>
+          <w:color w:val="434343"/>
+          <w:sz w:val="20"/>
+          <w:szCs w:val="20"/>
+          <w:rtl w:val="0"/>
+        </w:rPr>
+        <w:t xml:space="preserve">How Weird Street Faire 501(c)(3) SF street fair with successful 20 year run (2004 - 2024)</w:t>
       </w:r>
     </w:p>
     <w:sectPr>
@@ -971,14 +1161,14 @@
       <w:spacing w:before="0" w:line="240" w:lineRule="auto"/>
       <w:ind w:left="-630" w:right="-720" w:firstLine="0"/>
       <w:rPr>
-        <w:color w:val="999999"/>
+        <w:color w:val="434343"/>
       </w:rPr>
     </w:pPr>
     <w:bookmarkStart w:colFirst="0" w:colLast="0" w:name="_v1qdw49vp2i" w:id="0"/>
     <w:bookmarkEnd w:id="0"/>
     <w:r>
       <w:rPr>
-        <w:color w:val="999999"/>
+        <w:color w:val="434343"/>
         <w:rtl w:val="0"/>
       </w:rPr>
       <w:t xml:space="preserve">PETER BARTSCH</w:t>

</xml_diff>

<commit_message>
Update resume PDF and all export formats
Aligned with website: new summary, core contributor to design system,
grounded Thios intro, $1B+ valuation language. Formats: PDF, DOCX,
EPUB, ODT, RTF, TXT, MD.

Co-Authored-By: Claude Opus 4.6 (1M context) <noreply@anthropic.com>
</commit_message>
<xml_diff>
--- a/Peter-Bartsch-Resume.docx
+++ b/Peter-Bartsch-Resume.docx
@@ -4,7 +4,7 @@
   <w:body>
     <w:p>
       <w:pPr>
-        <w:spacing w:after="240" w:before="240" w:lineRule="auto"/>
+        <w:spacing w:after="240" w:before="240" w:line="240" w:lineRule="auto"/>
         <w:ind w:left="-630.0000000000001" w:right="-623.3333333333348" w:firstLine="0"/>
         <w:rPr>
           <w:sz w:val="8"/>
@@ -13,10 +13,14 @@
       </w:pPr>
       <w:r>
         <w:rPr>
-          <w:rFonts w:ascii="Arial Unicode MS" w:cs="Arial Unicode MS" w:eastAsia="Arial Unicode MS" w:hAnsi="Arial Unicode MS"/>
-          <w:rtl w:val="0"/>
-        </w:rPr>
-        <w:t xml:space="preserve">Product designer who ships. 15+ years building 0→1 products and scaling design systems—from solo founder to employee #28 at hypergrowth startup to senior IC at $38B enterprise. Research-driven, prototype-obsessed, comfortable with ambiguity.</w:t>
+          <w:rFonts w:ascii="Nova Mono" w:cs="Nova Mono" w:eastAsia="Nova Mono" w:hAnsi="Nova Mono"/>
+          <w:color w:val="141413"/>
+          <w:sz w:val="21"/>
+          <w:szCs w:val="21"/>
+          <w:highlight w:val="white"/>
+          <w:rtl w:val="0"/>
+        </w:rPr>
+        <w:t xml:space="preserve">Staff Product Designer — Enterprise Platforms &amp; 0→1. Led design for $3.8B platform at Deere (500K users). Built design org 1→10 at FourKites through $3M→$100M ARR ($1B+ valuation). 15 years shipping enterprise systems that actually get adopted.</w:t>
       </w:r>
       <w:r>
         <w:rPr>
@@ -62,7 +66,504 @@
         </w:rPr>
         <w:t xml:space="preserve"> | Aug 2024 - Present </w:t>
         <w:br w:type="textWrapping"/>
-        <w:t xml:space="preserve">Treating AI as my technical co-founder, learning how to compress timelines, work across disciplines, and ship products that traditionally require full teams. Building open-source modular shelter systems that transform parking spot sized spaces into productive environments.</w:t>
+      </w:r>
+      <w:r>
+        <w:rPr>
+          <w:rFonts w:ascii="Roboto" w:cs="Roboto" w:eastAsia="Roboto" w:hAnsi="Roboto"/>
+          <w:color w:val="141413"/>
+          <w:sz w:val="21"/>
+          <w:szCs w:val="21"/>
+          <w:highlight w:val="white"/>
+          <w:rtl w:val="0"/>
+        </w:rPr>
+        <w:t xml:space="preserve">Between enterprise roles — shipped a complete product ecosystem solo using AI tooling to demonstrate full-stack design range.</w:t>
+      </w:r>
+      <w:r>
+        <w:rPr>
+          <w:rtl w:val="0"/>
+        </w:rPr>
+      </w:r>
+    </w:p>
+    <w:p>
+      <w:pPr>
+        <w:numPr>
+          <w:ilvl w:val="0"/>
+          <w:numId w:val="2"/>
+        </w:numPr>
+        <w:spacing w:after="0" w:afterAutospacing="0" w:before="240" w:line="240" w:lineRule="auto"/>
+        <w:ind w:left="720" w:hanging="360"/>
+        <w:rPr>
+          <w:color w:val="434343"/>
+          <w:sz w:val="20"/>
+          <w:szCs w:val="20"/>
+        </w:rPr>
+      </w:pPr>
+      <w:r>
+        <w:rPr>
+          <w:b w:val="1"/>
+          <w:bCs w:val="1"/>
+          <w:color w:val="434343"/>
+          <w:sz w:val="20"/>
+          <w:szCs w:val="20"/>
+          <w:rtl w:val="0"/>
+        </w:rPr>
+        <w:t xml:space="preserve">Created complete product ecosystem solo in 18 months</w:t>
+      </w:r>
+      <w:r>
+        <w:rPr>
+          <w:color w:val="434343"/>
+          <w:sz w:val="20"/>
+          <w:szCs w:val="20"/>
+          <w:rtl w:val="0"/>
+        </w:rPr>
+        <w:t xml:space="preserve">: brand identity inspired by early 2000s open-source culture, 3 websites (thios.co, blog, store), 5 shelter variants with CAD models, physical prototype, and handbook generating first revenue</w:t>
+      </w:r>
+    </w:p>
+    <w:p>
+      <w:pPr>
+        <w:numPr>
+          <w:ilvl w:val="0"/>
+          <w:numId w:val="2"/>
+        </w:numPr>
+        <w:spacing w:after="0" w:afterAutospacing="0" w:before="0" w:beforeAutospacing="0" w:line="240" w:lineRule="auto"/>
+        <w:ind w:left="720" w:hanging="360"/>
+        <w:rPr>
+          <w:color w:val="434343"/>
+          <w:sz w:val="20"/>
+          <w:szCs w:val="20"/>
+        </w:rPr>
+      </w:pPr>
+      <w:r>
+        <w:rPr>
+          <w:b w:val="1"/>
+          <w:bCs w:val="1"/>
+          <w:color w:val="434343"/>
+          <w:sz w:val="20"/>
+          <w:szCs w:val="20"/>
+          <w:rtl w:val="0"/>
+        </w:rPr>
+        <w:t xml:space="preserve">Applied full career toolkit simultaneously</w:t>
+      </w:r>
+      <w:r>
+        <w:rPr>
+          <w:rFonts w:ascii="Arial Unicode MS" w:cs="Arial Unicode MS" w:eastAsia="Arial Unicode MS" w:hAnsi="Arial Unicode MS"/>
+          <w:color w:val="434343"/>
+          <w:sz w:val="20"/>
+          <w:szCs w:val="20"/>
+          <w:rtl w:val="0"/>
+        </w:rPr>
+        <w:t xml:space="preserve">—product strategy, marketing, and design execution using GitHub Copilot → Cursor → Anti Gravity progression; proving experienced generalists can operate across traditional role boundaries with AI partnership</w:t>
+      </w:r>
+    </w:p>
+    <w:p>
+      <w:pPr>
+        <w:numPr>
+          <w:ilvl w:val="0"/>
+          <w:numId w:val="2"/>
+        </w:numPr>
+        <w:spacing w:after="0" w:afterAutospacing="0" w:before="0" w:beforeAutospacing="0" w:line="240" w:lineRule="auto"/>
+        <w:ind w:left="720" w:hanging="360"/>
+        <w:rPr>
+          <w:color w:val="434343"/>
+          <w:sz w:val="20"/>
+          <w:szCs w:val="20"/>
+        </w:rPr>
+      </w:pPr>
+      <w:r>
+        <w:rPr>
+          <w:b w:val="1"/>
+          <w:bCs w:val="1"/>
+          <w:color w:val="434343"/>
+          <w:sz w:val="20"/>
+          <w:szCs w:val="20"/>
+          <w:rtl w:val="0"/>
+        </w:rPr>
+        <w:t xml:space="preserve">Established AI-augmented workflows</w:t>
+      </w:r>
+      <w:r>
+        <w:rPr>
+          <w:color w:val="434343"/>
+          <w:sz w:val="20"/>
+          <w:szCs w:val="20"/>
+          <w:rtl w:val="0"/>
+        </w:rPr>
+        <w:t xml:space="preserve">: Obsidian MD + AI for project management and research synthesis; Figma Make for design-to-code; compressed prototyping cycles 70% through conversational development in Cursor and Anti-Gravity &amp; Claude Code</w:t>
+      </w:r>
+    </w:p>
+    <w:p>
+      <w:pPr>
+        <w:numPr>
+          <w:ilvl w:val="0"/>
+          <w:numId w:val="2"/>
+        </w:numPr>
+        <w:spacing w:after="240" w:before="0" w:beforeAutospacing="0" w:line="240" w:lineRule="auto"/>
+        <w:ind w:left="720" w:hanging="360"/>
+        <w:rPr>
+          <w:color w:val="434343"/>
+        </w:rPr>
+      </w:pPr>
+      <w:r>
+        <w:rPr>
+          <w:b w:val="1"/>
+          <w:bCs w:val="1"/>
+          <w:color w:val="434343"/>
+          <w:sz w:val="20"/>
+          <w:szCs w:val="20"/>
+          <w:rtl w:val="0"/>
+        </w:rPr>
+        <w:t xml:space="preserve">Outcomes</w:t>
+      </w:r>
+      <w:r>
+        <w:rPr>
+          <w:color w:val="434343"/>
+          <w:sz w:val="20"/>
+          <w:szCs w:val="20"/>
+          <w:rtl w:val="0"/>
+        </w:rPr>
+        <w:t xml:space="preserve">: Validated AI as practical force multiplier for startups; demonstrating how to maintain product quality while working at solo-founder velocity; any prototype is possible</w:t>
+      </w:r>
+      <w:r>
+        <w:rPr>
+          <w:rtl w:val="0"/>
+        </w:rPr>
+      </w:r>
+    </w:p>
+    <w:p>
+      <w:pPr>
+        <w:spacing w:after="240" w:before="240" w:line="240" w:lineRule="auto"/>
+        <w:ind w:left="-630.0000000000001" w:right="-623.3333333333348" w:firstLine="0"/>
+        <w:rPr/>
+      </w:pPr>
+      <w:r>
+        <w:rPr>
+          <w:b w:val="1"/>
+          <w:bCs w:val="1"/>
+          <w:rtl w:val="0"/>
+        </w:rPr>
+        <w:t xml:space="preserve">FOURKITES | Lead UX / Manager</w:t>
+      </w:r>
+      <w:r>
+        <w:rPr>
+          <w:rtl w:val="0"/>
+        </w:rPr>
+        <w:t xml:space="preserve"> | Jan 2017 - Jan 2020</w:t>
+        <w:br w:type="textWrapping"/>
+        <w:t xml:space="preserve">Employee #28 during hypergrowth, $3M to $100M ARR (</w:t>
+      </w:r>
+      <w:r>
+        <w:rPr>
+          <w:color w:val="333333"/>
+          <w:sz w:val="24"/>
+          <w:szCs w:val="24"/>
+          <w:shd w:fill="fafafa" w:val="clear"/>
+          <w:rtl w:val="0"/>
+        </w:rPr>
+        <w:t xml:space="preserve">$1B+ valuation</w:t>
+      </w:r>
+      <w:r>
+        <w:rPr>
+          <w:rtl w:val="0"/>
+        </w:rPr>
+        <w:t xml:space="preserve">). Built design function from scratch—founding designer to 10-person global team.</w:t>
+      </w:r>
+    </w:p>
+    <w:p>
+      <w:pPr>
+        <w:numPr>
+          <w:ilvl w:val="0"/>
+          <w:numId w:val="1"/>
+        </w:numPr>
+        <w:spacing w:after="0" w:afterAutospacing="0" w:before="240" w:line="240" w:lineRule="auto"/>
+        <w:ind w:left="720" w:hanging="360"/>
+        <w:rPr>
+          <w:color w:val="434343"/>
+          <w:sz w:val="20"/>
+          <w:szCs w:val="20"/>
+        </w:rPr>
+      </w:pPr>
+      <w:r>
+        <w:rPr>
+          <w:rFonts w:ascii="Arial Unicode MS" w:cs="Arial Unicode MS" w:eastAsia="Arial Unicode MS" w:hAnsi="Arial Unicode MS"/>
+          <w:b w:val="1"/>
+          <w:bCs w:val="1"/>
+          <w:color w:val="434343"/>
+          <w:sz w:val="20"/>
+          <w:szCs w:val="20"/>
+          <w:rtl w:val="0"/>
+        </w:rPr>
+        <w:t xml:space="preserve">Designed flagship products from 0→1</w:t>
+      </w:r>
+      <w:r>
+        <w:rPr>
+          <w:color w:val="434343"/>
+          <w:sz w:val="20"/>
+          <w:szCs w:val="20"/>
+          <w:rtl w:val="0"/>
+        </w:rPr>
+        <w:t xml:space="preserve">: Real-time supply chain control tower and related mobile apps processing 10M+ daily tracking events for 30+ Fortune 2000 companies (Anheuser-Busch, Georgia-Pacific, Tyson); products became primary driver of 3x customer expansion</w:t>
+      </w:r>
+    </w:p>
+    <w:p>
+      <w:pPr>
+        <w:numPr>
+          <w:ilvl w:val="0"/>
+          <w:numId w:val="1"/>
+        </w:numPr>
+        <w:spacing w:after="0" w:afterAutospacing="0" w:before="0" w:beforeAutospacing="0" w:line="240" w:lineRule="auto"/>
+        <w:ind w:left="720" w:hanging="360"/>
+        <w:rPr>
+          <w:color w:val="434343"/>
+          <w:sz w:val="20"/>
+          <w:szCs w:val="20"/>
+        </w:rPr>
+      </w:pPr>
+      <w:r>
+        <w:rPr>
+          <w:b w:val="1"/>
+          <w:bCs w:val="1"/>
+          <w:color w:val="434343"/>
+          <w:sz w:val="20"/>
+          <w:szCs w:val="20"/>
+          <w:rtl w:val="0"/>
+        </w:rPr>
+        <w:t xml:space="preserve">Led bespoke predictive analytics dashboard products</w:t>
+      </w:r>
+      <w:r>
+        <w:rPr>
+          <w:color w:val="434343"/>
+          <w:sz w:val="20"/>
+          <w:szCs w:val="20"/>
+          <w:rtl w:val="0"/>
+        </w:rPr>
+        <w:t xml:space="preserve"> identifying shipment delays 6-12 hours earlier than competitors; increased customer retention 41% and expanded average contract value $120K annually</w:t>
+      </w:r>
+    </w:p>
+    <w:p>
+      <w:pPr>
+        <w:numPr>
+          <w:ilvl w:val="0"/>
+          <w:numId w:val="1"/>
+        </w:numPr>
+        <w:spacing w:after="240" w:before="0" w:beforeAutospacing="0" w:line="240" w:lineRule="auto"/>
+        <w:ind w:left="720" w:hanging="360"/>
+        <w:rPr>
+          <w:color w:val="434343"/>
+        </w:rPr>
+      </w:pPr>
+      <w:r>
+        <w:rPr>
+          <w:b w:val="1"/>
+          <w:bCs w:val="1"/>
+          <w:color w:val="434343"/>
+          <w:sz w:val="20"/>
+          <w:szCs w:val="20"/>
+          <w:rtl w:val="0"/>
+        </w:rPr>
+        <w:t xml:space="preserve">Scaled design org</w:t>
+      </w:r>
+      <w:r>
+        <w:rPr>
+          <w:color w:val="434343"/>
+          <w:sz w:val="20"/>
+          <w:szCs w:val="20"/>
+          <w:rtl w:val="0"/>
+        </w:rPr>
+        <w:t xml:space="preserve">: Hired and managed team across Chicago and Chennai; established component library, design operations, and hiring framework—reduced design inconsistencies 65% while maintaining startup velocity</w:t>
+      </w:r>
+      <w:r>
+        <w:rPr>
+          <w:rtl w:val="0"/>
+        </w:rPr>
+      </w:r>
+    </w:p>
+    <w:p>
+      <w:pPr>
+        <w:spacing w:after="240" w:before="240" w:line="240" w:lineRule="auto"/>
+        <w:ind w:left="-630.0000000000001" w:right="0" w:firstLine="0"/>
+        <w:jc w:val="both"/>
+        <w:rPr/>
+      </w:pPr>
+      <w:r>
+        <w:rPr>
+          <w:b w:val="1"/>
+          <w:bCs w:val="1"/>
+          <w:rtl w:val="0"/>
+        </w:rPr>
+        <w:t xml:space="preserve">JOHN DEERE | Senior Lead UX; Digital Customer Experience</w:t>
+      </w:r>
+      <w:r>
+        <w:rPr>
+          <w:rtl w:val="0"/>
+        </w:rPr>
+        <w:t xml:space="preserve"> | Aug 2020 - Jul 2024 </w:t>
+        <w:br w:type="textWrapping"/>
+        <w:t xml:space="preserve">Embedded with product teams to modernize 20-year-old systems and drive subscription revenue. Proving enterprise design can move fast when you have the right frameworks.</w:t>
+      </w:r>
+    </w:p>
+    <w:p>
+      <w:pPr>
+        <w:numPr>
+          <w:ilvl w:val="0"/>
+          <w:numId w:val="2"/>
+        </w:numPr>
+        <w:spacing w:after="0" w:afterAutospacing="0" w:before="240" w:line="240" w:lineRule="auto"/>
+        <w:ind w:left="720" w:hanging="360"/>
+        <w:rPr>
+          <w:color w:val="434343"/>
+          <w:sz w:val="20"/>
+          <w:szCs w:val="20"/>
+        </w:rPr>
+      </w:pPr>
+      <w:r>
+        <w:rPr>
+          <w:b w:val="1"/>
+          <w:bCs w:val="1"/>
+          <w:color w:val="434343"/>
+          <w:sz w:val="20"/>
+          <w:szCs w:val="20"/>
+          <w:rtl w:val="0"/>
+        </w:rPr>
+        <w:t xml:space="preserve">Redesigned license management system</w:t>
+      </w:r>
+      <w:r>
+        <w:rPr>
+          <w:color w:val="434343"/>
+          <w:sz w:val="20"/>
+          <w:szCs w:val="20"/>
+          <w:rtl w:val="0"/>
+        </w:rPr>
+        <w:t xml:space="preserve"> serving 500K+ users across 12 languages—increased authenticated engagement 34%, reduced support tickets 16%, enabled $3.8B in subscription revenue from Automation and AI services</w:t>
+        <w:br w:type="textWrapping"/>
+      </w:r>
+      <w:r>
+        <w:rPr>
+          <w:rtl w:val="0"/>
+        </w:rPr>
+      </w:r>
+    </w:p>
+    <w:p>
+      <w:pPr>
+        <w:numPr>
+          <w:ilvl w:val="0"/>
+          <w:numId w:val="2"/>
+        </w:numPr>
+        <w:spacing w:after="0" w:afterAutospacing="0" w:before="0" w:beforeAutospacing="0" w:line="240" w:lineRule="auto"/>
+        <w:ind w:left="720" w:hanging="360"/>
+        <w:rPr>
+          <w:color w:val="434343"/>
+          <w:sz w:val="20"/>
+          <w:szCs w:val="20"/>
+        </w:rPr>
+      </w:pPr>
+      <w:r>
+        <w:rPr>
+          <w:b w:val="1"/>
+          <w:bCs w:val="1"/>
+          <w:color w:val="434343"/>
+          <w:sz w:val="20"/>
+          <w:szCs w:val="20"/>
+          <w:rtl w:val="0"/>
+        </w:rPr>
+        <w:t xml:space="preserve">Built unified account and navigation framework</w:t>
+      </w:r>
+      <w:r>
+        <w:rPr>
+          <w:color w:val="434343"/>
+          <w:sz w:val="20"/>
+          <w:szCs w:val="20"/>
+          <w:rtl w:val="0"/>
+        </w:rPr>
+        <w:t xml:space="preserve"> deployed across 8 product lines (web, mobile, embedded)—consolidated fragmented experiences into single customer view, improved dealer support efficiency 28%</w:t>
+        <w:br w:type="textWrapping"/>
+      </w:r>
+      <w:r>
+        <w:rPr>
+          <w:rtl w:val="0"/>
+        </w:rPr>
+      </w:r>
+    </w:p>
+    <w:p>
+      <w:pPr>
+        <w:numPr>
+          <w:ilvl w:val="0"/>
+          <w:numId w:val="2"/>
+        </w:numPr>
+        <w:spacing w:after="240" w:before="0" w:beforeAutospacing="0" w:line="240" w:lineRule="auto"/>
+        <w:ind w:left="720" w:hanging="360"/>
+        <w:rPr>
+          <w:color w:val="434343"/>
+          <w:sz w:val="20"/>
+          <w:szCs w:val="20"/>
+        </w:rPr>
+      </w:pPr>
+      <w:r>
+        <w:rPr>
+          <w:rFonts w:ascii="Roboto" w:cs="Roboto" w:eastAsia="Roboto" w:hAnsi="Roboto"/>
+          <w:b w:val="1"/>
+          <w:bCs w:val="1"/>
+          <w:color w:val="141413"/>
+          <w:sz w:val="21"/>
+          <w:szCs w:val="21"/>
+          <w:highlight w:val="white"/>
+          <w:rtl w:val="0"/>
+        </w:rPr>
+        <w:t xml:space="preserve">Core contributor</w:t>
+      </w:r>
+      <w:r>
+        <w:rPr>
+          <w:rFonts w:ascii="Roboto" w:cs="Roboto" w:eastAsia="Roboto" w:hAnsi="Roboto"/>
+          <w:color w:val="141413"/>
+          <w:sz w:val="21"/>
+          <w:szCs w:val="21"/>
+          <w:highlight w:val="white"/>
+          <w:rtl w:val="0"/>
+        </w:rPr>
+        <w:t xml:space="preserve"> to enterprise design system in Figma spanning 6 brands</w:t>
+      </w:r>
+      <w:r>
+        <w:rPr>
+          <w:color w:val="434343"/>
+          <w:sz w:val="20"/>
+          <w:szCs w:val="20"/>
+          <w:rtl w:val="0"/>
+        </w:rPr>
+        <w:t xml:space="preserve"> and 40+ product teams globally—reduced design-to-development handoff time 45% through standardized components that actually shipped</w:t>
+      </w:r>
+      <w:r>
+        <w:rPr>
+          <w:rtl w:val="0"/>
+        </w:rPr>
+      </w:r>
+    </w:p>
+    <w:p>
+      <w:pPr>
+        <w:spacing w:after="240" w:before="240" w:line="240" w:lineRule="auto"/>
+        <w:ind w:left="-540.0000000000001" w:right="-623.3333333333348" w:firstLine="0"/>
+        <w:rPr/>
+      </w:pPr>
+      <w:r>
+        <w:rPr>
+          <w:b w:val="1"/>
+          <w:bCs w:val="1"/>
+          <w:rtl w:val="0"/>
+        </w:rPr>
+        <w:br w:type="textWrapping"/>
+      </w:r>
+      <w:r>
+        <w:rPr>
+          <w:b w:val="1"/>
+          <w:bCs w:val="1"/>
+          <w:rtl w:val="0"/>
+        </w:rPr>
+        <w:t xml:space="preserve">MAVENWAVE PARTNERS | Senior UX + Agile Lead (Consultant)</w:t>
+      </w:r>
+      <w:r>
+        <w:rPr>
+          <w:rtl w:val="0"/>
+        </w:rPr>
+        <w:t xml:space="preserve"> | Jan 2014 - Jan 2017 </w:t>
+        <w:br w:type="textWrapping"/>
+        <w:t xml:space="preserve">Led digital product design for Fortune 500 healthcare and pharmaceutical clients. Fast iteration in slow-moving industries.</w:t>
       </w:r>
     </w:p>
     <w:p>
@@ -88,16 +589,16 @@
           <w:szCs w:val="20"/>
           <w:rtl w:val="0"/>
         </w:rPr>
-        <w:t xml:space="preserve">Created complete product ecosystem solo in 18 months</w:t>
-      </w:r>
-      <w:r>
-        <w:rPr>
-          <w:color w:val="434343"/>
-          <w:sz w:val="20"/>
-          <w:szCs w:val="20"/>
-          <w:rtl w:val="0"/>
-        </w:rPr>
-        <w:t xml:space="preserve">: brand identity inspired by early 2000s open-source culture, 3 websites (thios.co, blog, store), 5 shelter variants with CAD models, physical prototype, and handbook generating first revenue</w:t>
+        <w:t xml:space="preserve">Designed 6 internal portals for AbbVie</w:t>
+      </w:r>
+      <w:r>
+        <w:rPr>
+          <w:color w:val="434343"/>
+          <w:sz w:val="20"/>
+          <w:szCs w:val="20"/>
+          <w:rtl w:val="0"/>
+        </w:rPr>
+        <w:t xml:space="preserve"> supporting 200K+ users across clinical trials and patient support programs—improved medication adherence tracking, reduced hospital readmissions 12%</w:t>
       </w:r>
     </w:p>
     <w:p>
@@ -123,52 +624,16 @@
           <w:szCs w:val="20"/>
           <w:rtl w:val="0"/>
         </w:rPr>
-        <w:t xml:space="preserve">Applied full career toolkit simultaneously</w:t>
-      </w:r>
-      <w:r>
-        <w:rPr>
-          <w:rFonts w:ascii="Arial Unicode MS" w:cs="Arial Unicode MS" w:eastAsia="Arial Unicode MS" w:hAnsi="Arial Unicode MS"/>
-          <w:color w:val="434343"/>
-          <w:sz w:val="20"/>
-          <w:szCs w:val="20"/>
-          <w:rtl w:val="0"/>
-        </w:rPr>
-        <w:t xml:space="preserve">—product strategy, marketing, and design execution using GitHub Copilot → Cursor → Anti Gravity progression; proving experienced generalists can operate across traditional role boundaries with AI partnership</w:t>
-      </w:r>
-    </w:p>
-    <w:p>
-      <w:pPr>
-        <w:numPr>
-          <w:ilvl w:val="0"/>
-          <w:numId w:val="3"/>
-        </w:numPr>
-        <w:spacing w:after="0" w:afterAutospacing="0" w:before="0" w:beforeAutospacing="0" w:line="240" w:lineRule="auto"/>
-        <w:ind w:left="720" w:hanging="360"/>
-        <w:rPr>
-          <w:color w:val="434343"/>
-          <w:sz w:val="20"/>
-          <w:szCs w:val="20"/>
-        </w:rPr>
-      </w:pPr>
-      <w:r>
-        <w:rPr>
-          <w:b w:val="1"/>
-          <w:bCs w:val="1"/>
-          <w:color w:val="434343"/>
-          <w:sz w:val="20"/>
-          <w:szCs w:val="20"/>
-          <w:rtl w:val="0"/>
-        </w:rPr>
-        <w:t xml:space="preserve">Established AI-augmented workflows</w:t>
-      </w:r>
-      <w:r>
-        <w:rPr>
-          <w:color w:val="434343"/>
-          <w:sz w:val="20"/>
-          <w:szCs w:val="20"/>
-          <w:rtl w:val="0"/>
-        </w:rPr>
-        <w:t xml:space="preserve">: Obsidian MD + AI for project management and research synthesis; Figma Make for design-to-code; compressed prototyping cycles 70% through conversational development in Cursor and Anti-Gravity &amp; Claude Code</w:t>
+        <w:t xml:space="preserve">Rebuilt OptumRx pharmacy formulary platform</w:t>
+      </w:r>
+      <w:r>
+        <w:rPr>
+          <w:color w:val="434343"/>
+          <w:sz w:val="20"/>
+          <w:szCs w:val="20"/>
+          <w:rtl w:val="0"/>
+        </w:rPr>
+        <w:t xml:space="preserve"> processing 1.4B prescriptions annually—created company's first patient-facing product, reduced fulfillment errors 15% through improved drug interaction warnings</w:t>
       </w:r>
     </w:p>
     <w:p>
@@ -181,437 +646,6 @@
         <w:ind w:left="720" w:hanging="360"/>
         <w:rPr>
           <w:color w:val="434343"/>
-        </w:rPr>
-      </w:pPr>
-      <w:r>
-        <w:rPr>
-          <w:b w:val="1"/>
-          <w:bCs w:val="1"/>
-          <w:color w:val="434343"/>
-          <w:sz w:val="20"/>
-          <w:szCs w:val="20"/>
-          <w:rtl w:val="0"/>
-        </w:rPr>
-        <w:t xml:space="preserve">Outcomes</w:t>
-      </w:r>
-      <w:r>
-        <w:rPr>
-          <w:color w:val="434343"/>
-          <w:sz w:val="20"/>
-          <w:szCs w:val="20"/>
-          <w:rtl w:val="0"/>
-        </w:rPr>
-        <w:t xml:space="preserve">: Validated AI as practical force multiplier for startups; demonstrating how to maintain product quality while working at solo-founder velocity; any prototype is possible</w:t>
-      </w:r>
-      <w:r>
-        <w:rPr>
-          <w:color w:val="434343"/>
-          <w:rtl w:val="0"/>
-        </w:rPr>
-        <w:br w:type="textWrapping"/>
-      </w:r>
-      <w:r>
-        <w:rPr>
-          <w:rtl w:val="0"/>
-        </w:rPr>
-      </w:r>
-    </w:p>
-    <w:p>
-      <w:pPr>
-        <w:spacing w:after="240" w:before="240" w:line="240" w:lineRule="auto"/>
-        <w:ind w:left="-630.0000000000001" w:right="-623.3333333333348" w:firstLine="0"/>
-        <w:rPr/>
-      </w:pPr>
-      <w:r>
-        <w:rPr>
-          <w:b w:val="1"/>
-          <w:bCs w:val="1"/>
-          <w:rtl w:val="0"/>
-        </w:rPr>
-        <w:t xml:space="preserve">FOURKITES | Lead UX / Manager</w:t>
-      </w:r>
-      <w:r>
-        <w:rPr>
-          <w:rtl w:val="0"/>
-        </w:rPr>
-        <w:t xml:space="preserve"> | Jan 2017 - Jan 2020</w:t>
-        <w:br w:type="textWrapping"/>
-        <w:t xml:space="preserve">Employee #28 during hypergrowth ($3M to $100M ARR). Built design function from scratch—founding designer to 10-person global team.</w:t>
-      </w:r>
-    </w:p>
-    <w:p>
-      <w:pPr>
-        <w:numPr>
-          <w:ilvl w:val="0"/>
-          <w:numId w:val="1"/>
-        </w:numPr>
-        <w:spacing w:after="0" w:afterAutospacing="0" w:before="240" w:line="240" w:lineRule="auto"/>
-        <w:ind w:left="720" w:hanging="360"/>
-        <w:rPr>
-          <w:color w:val="434343"/>
-          <w:sz w:val="20"/>
-          <w:szCs w:val="20"/>
-        </w:rPr>
-      </w:pPr>
-      <w:r>
-        <w:rPr>
-          <w:rFonts w:ascii="Arial Unicode MS" w:cs="Arial Unicode MS" w:eastAsia="Arial Unicode MS" w:hAnsi="Arial Unicode MS"/>
-          <w:b w:val="1"/>
-          <w:bCs w:val="1"/>
-          <w:color w:val="434343"/>
-          <w:sz w:val="20"/>
-          <w:szCs w:val="20"/>
-          <w:rtl w:val="0"/>
-        </w:rPr>
-        <w:t xml:space="preserve">Designed flagship products from 0→1</w:t>
-      </w:r>
-      <w:r>
-        <w:rPr>
-          <w:color w:val="434343"/>
-          <w:sz w:val="20"/>
-          <w:szCs w:val="20"/>
-          <w:rtl w:val="0"/>
-        </w:rPr>
-        <w:t xml:space="preserve">: Real-time supply chain control tower and related mobile apps processing 10M+ daily tracking events for 30+ Fortune 2000 companies (Anheuser-Busch, Georgia-Pacific, Tyson); products became primary driver of 3x customer expansion</w:t>
-      </w:r>
-    </w:p>
-    <w:p>
-      <w:pPr>
-        <w:numPr>
-          <w:ilvl w:val="0"/>
-          <w:numId w:val="1"/>
-        </w:numPr>
-        <w:spacing w:after="0" w:afterAutospacing="0" w:before="0" w:beforeAutospacing="0" w:line="240" w:lineRule="auto"/>
-        <w:ind w:left="720" w:hanging="360"/>
-        <w:rPr>
-          <w:color w:val="434343"/>
-          <w:sz w:val="20"/>
-          <w:szCs w:val="20"/>
-        </w:rPr>
-      </w:pPr>
-      <w:r>
-        <w:rPr>
-          <w:b w:val="1"/>
-          <w:bCs w:val="1"/>
-          <w:color w:val="434343"/>
-          <w:sz w:val="20"/>
-          <w:szCs w:val="20"/>
-          <w:rtl w:val="0"/>
-        </w:rPr>
-        <w:t xml:space="preserve">Led bespoke predictive analytics dashboard products</w:t>
-      </w:r>
-      <w:r>
-        <w:rPr>
-          <w:color w:val="434343"/>
-          <w:sz w:val="20"/>
-          <w:szCs w:val="20"/>
-          <w:rtl w:val="0"/>
-        </w:rPr>
-        <w:t xml:space="preserve"> identifying shipment delays 6-12 hours earlier than competitors; increased customer retention 41% and expanded average contract value $120K annually</w:t>
-      </w:r>
-    </w:p>
-    <w:p>
-      <w:pPr>
-        <w:numPr>
-          <w:ilvl w:val="0"/>
-          <w:numId w:val="1"/>
-        </w:numPr>
-        <w:spacing w:after="240" w:before="0" w:beforeAutospacing="0" w:line="240" w:lineRule="auto"/>
-        <w:ind w:left="720" w:hanging="360"/>
-        <w:rPr>
-          <w:color w:val="434343"/>
-        </w:rPr>
-      </w:pPr>
-      <w:r>
-        <w:rPr>
-          <w:b w:val="1"/>
-          <w:bCs w:val="1"/>
-          <w:color w:val="434343"/>
-          <w:sz w:val="20"/>
-          <w:szCs w:val="20"/>
-          <w:rtl w:val="0"/>
-        </w:rPr>
-        <w:t xml:space="preserve">Scaled design org</w:t>
-      </w:r>
-      <w:r>
-        <w:rPr>
-          <w:color w:val="434343"/>
-          <w:sz w:val="20"/>
-          <w:szCs w:val="20"/>
-          <w:rtl w:val="0"/>
-        </w:rPr>
-        <w:t xml:space="preserve">: Hired and managed team across Chicago and Chennai; established component library, design operations, and hiring framework—reduced design inconsistencies 65% while maintaining startup velocity</w:t>
-      </w:r>
-      <w:r>
-        <w:rPr>
-          <w:b w:val="1"/>
-          <w:bCs w:val="1"/>
-          <w:rtl w:val="0"/>
-        </w:rPr>
-        <w:br w:type="textWrapping"/>
-      </w:r>
-    </w:p>
-    <w:p>
-      <w:pPr>
-        <w:spacing w:after="240" w:before="240" w:line="240" w:lineRule="auto"/>
-        <w:ind w:left="-630.0000000000001" w:right="0" w:firstLine="0"/>
-        <w:jc w:val="both"/>
-        <w:rPr/>
-      </w:pPr>
-      <w:r>
-        <w:rPr>
-          <w:b w:val="1"/>
-          <w:bCs w:val="1"/>
-          <w:rtl w:val="0"/>
-        </w:rPr>
-        <w:t xml:space="preserve">JOHN DEERE | Senior Lead UX; Digital Customer Experience</w:t>
-      </w:r>
-      <w:r>
-        <w:rPr>
-          <w:rtl w:val="0"/>
-        </w:rPr>
-        <w:t xml:space="preserve"> | Aug 2020 - Jul 2024 </w:t>
-        <w:br w:type="textWrapping"/>
-        <w:t xml:space="preserve">Embedded with product teams to modernize 20-year-old systems and drive subscription revenue. Proving enterprise design can move fast when you have the right frameworks.</w:t>
-      </w:r>
-    </w:p>
-    <w:p>
-      <w:pPr>
-        <w:numPr>
-          <w:ilvl w:val="0"/>
-          <w:numId w:val="3"/>
-        </w:numPr>
-        <w:spacing w:after="0" w:afterAutospacing="0" w:before="240" w:line="240" w:lineRule="auto"/>
-        <w:ind w:left="720" w:hanging="360"/>
-        <w:rPr>
-          <w:color w:val="434343"/>
-          <w:sz w:val="20"/>
-          <w:szCs w:val="20"/>
-        </w:rPr>
-      </w:pPr>
-      <w:r>
-        <w:rPr>
-          <w:b w:val="1"/>
-          <w:bCs w:val="1"/>
-          <w:color w:val="434343"/>
-          <w:sz w:val="20"/>
-          <w:szCs w:val="20"/>
-          <w:rtl w:val="0"/>
-        </w:rPr>
-        <w:t xml:space="preserve">Redesigned license management system</w:t>
-      </w:r>
-      <w:r>
-        <w:rPr>
-          <w:color w:val="434343"/>
-          <w:sz w:val="20"/>
-          <w:szCs w:val="20"/>
-          <w:rtl w:val="0"/>
-        </w:rPr>
-        <w:t xml:space="preserve"> serving 500K+ users across 12 languages—increased authenticated engagement 34%, reduced support tickets 16%, enabled $3.8B in subscription revenue from Automation and AI services</w:t>
-        <w:br w:type="textWrapping"/>
-      </w:r>
-    </w:p>
-    <w:p>
-      <w:pPr>
-        <w:numPr>
-          <w:ilvl w:val="0"/>
-          <w:numId w:val="3"/>
-        </w:numPr>
-        <w:spacing w:after="240" w:before="0" w:beforeAutospacing="0" w:line="240" w:lineRule="auto"/>
-        <w:ind w:left="720" w:hanging="360"/>
-        <w:rPr>
-          <w:color w:val="434343"/>
-          <w:sz w:val="20"/>
-          <w:szCs w:val="20"/>
-        </w:rPr>
-      </w:pPr>
-      <w:r>
-        <w:rPr>
-          <w:b w:val="1"/>
-          <w:bCs w:val="1"/>
-          <w:color w:val="434343"/>
-          <w:sz w:val="20"/>
-          <w:szCs w:val="20"/>
-          <w:rtl w:val="0"/>
-        </w:rPr>
-        <w:t xml:space="preserve">Built unified account and navigation framework</w:t>
-      </w:r>
-      <w:r>
-        <w:rPr>
-          <w:color w:val="434343"/>
-          <w:sz w:val="20"/>
-          <w:szCs w:val="20"/>
-          <w:rtl w:val="0"/>
-        </w:rPr>
-        <w:t xml:space="preserve"> deployed across 8 product lines (web, mobile, embedded)—consolidated fragmented experiences into single customer view, improved dealer support efficiency 28%</w:t>
-      </w:r>
-    </w:p>
-    <w:p>
-      <w:pPr>
-        <w:spacing w:after="240" w:before="240" w:line="240" w:lineRule="auto"/>
-        <w:rPr>
-          <w:color w:val="434343"/>
-          <w:sz w:val="20"/>
-          <w:szCs w:val="20"/>
-        </w:rPr>
-      </w:pPr>
-      <w:r>
-        <w:rPr>
-          <w:rtl w:val="0"/>
-        </w:rPr>
-      </w:r>
-    </w:p>
-    <w:p>
-      <w:pPr>
-        <w:numPr>
-          <w:ilvl w:val="0"/>
-          <w:numId w:val="3"/>
-        </w:numPr>
-        <w:spacing w:after="240" w:before="240" w:line="240" w:lineRule="auto"/>
-        <w:ind w:left="720" w:hanging="360"/>
-        <w:rPr>
-          <w:color w:val="434343"/>
-          <w:sz w:val="20"/>
-          <w:szCs w:val="20"/>
-        </w:rPr>
-      </w:pPr>
-      <w:r>
-        <w:rPr>
-          <w:b w:val="1"/>
-          <w:bCs w:val="1"/>
-          <w:color w:val="434343"/>
-          <w:sz w:val="20"/>
-          <w:szCs w:val="20"/>
-          <w:rtl w:val="0"/>
-        </w:rPr>
-        <w:t xml:space="preserve">Established enterprise design system</w:t>
-      </w:r>
-      <w:r>
-        <w:rPr>
-          <w:color w:val="434343"/>
-          <w:sz w:val="20"/>
-          <w:szCs w:val="20"/>
-          <w:rtl w:val="0"/>
-        </w:rPr>
-        <w:t xml:space="preserve"> in Figma spanning 6 brands and 40+ product teams globally—reduced design-to-development handoff time 45% through standardized components that actually shipped</w:t>
-      </w:r>
-      <w:r>
-        <w:rPr>
-          <w:rtl w:val="0"/>
-        </w:rPr>
-      </w:r>
-    </w:p>
-    <w:p>
-      <w:pPr>
-        <w:spacing w:after="240" w:before="240" w:line="240" w:lineRule="auto"/>
-        <w:ind w:left="-540.0000000000001" w:right="-623.3333333333348" w:firstLine="0"/>
-        <w:rPr/>
-      </w:pPr>
-      <w:r>
-        <w:rPr>
-          <w:b w:val="1"/>
-          <w:bCs w:val="1"/>
-          <w:rtl w:val="0"/>
-        </w:rPr>
-        <w:br w:type="textWrapping"/>
-      </w:r>
-      <w:r>
-        <w:rPr>
-          <w:b w:val="1"/>
-          <w:bCs w:val="1"/>
-          <w:rtl w:val="0"/>
-        </w:rPr>
-        <w:t xml:space="preserve">MAVENWAVE PARTNERS | Senior UX + Agile Lead (Consultant)</w:t>
-      </w:r>
-      <w:r>
-        <w:rPr>
-          <w:rtl w:val="0"/>
-        </w:rPr>
-        <w:t xml:space="preserve"> | Jan 2014 - Jan 2017 </w:t>
-        <w:br w:type="textWrapping"/>
-        <w:t xml:space="preserve">Led digital product design for Fortune 500 healthcare and pharmaceutical clients. Fast iteration in slow-moving industries.</w:t>
-      </w:r>
-    </w:p>
-    <w:p>
-      <w:pPr>
-        <w:numPr>
-          <w:ilvl w:val="0"/>
-          <w:numId w:val="4"/>
-        </w:numPr>
-        <w:spacing w:after="0" w:afterAutospacing="0" w:before="240" w:line="240" w:lineRule="auto"/>
-        <w:ind w:left="720" w:hanging="360"/>
-        <w:rPr>
-          <w:color w:val="434343"/>
-          <w:sz w:val="20"/>
-          <w:szCs w:val="20"/>
-        </w:rPr>
-      </w:pPr>
-      <w:r>
-        <w:rPr>
-          <w:b w:val="1"/>
-          <w:bCs w:val="1"/>
-          <w:color w:val="434343"/>
-          <w:sz w:val="20"/>
-          <w:szCs w:val="20"/>
-          <w:rtl w:val="0"/>
-        </w:rPr>
-        <w:t xml:space="preserve">Designed 6 internal portals for AbbVie</w:t>
-      </w:r>
-      <w:r>
-        <w:rPr>
-          <w:color w:val="434343"/>
-          <w:sz w:val="20"/>
-          <w:szCs w:val="20"/>
-          <w:rtl w:val="0"/>
-        </w:rPr>
-        <w:t xml:space="preserve"> supporting 200K+ users across clinical trials and patient support programs—improved medication adherence tracking, reduced hospital readmissions 12%</w:t>
-      </w:r>
-    </w:p>
-    <w:p>
-      <w:pPr>
-        <w:numPr>
-          <w:ilvl w:val="0"/>
-          <w:numId w:val="4"/>
-        </w:numPr>
-        <w:spacing w:after="0" w:afterAutospacing="0" w:before="0" w:beforeAutospacing="0" w:line="240" w:lineRule="auto"/>
-        <w:ind w:left="720" w:hanging="360"/>
-        <w:rPr>
-          <w:color w:val="434343"/>
-          <w:sz w:val="20"/>
-          <w:szCs w:val="20"/>
-        </w:rPr>
-      </w:pPr>
-      <w:r>
-        <w:rPr>
-          <w:b w:val="1"/>
-          <w:bCs w:val="1"/>
-          <w:color w:val="434343"/>
-          <w:sz w:val="20"/>
-          <w:szCs w:val="20"/>
-          <w:rtl w:val="0"/>
-        </w:rPr>
-        <w:t xml:space="preserve">Rebuilt OptumRx pharmacy formulary platform</w:t>
-      </w:r>
-      <w:r>
-        <w:rPr>
-          <w:color w:val="434343"/>
-          <w:sz w:val="20"/>
-          <w:szCs w:val="20"/>
-          <w:rtl w:val="0"/>
-        </w:rPr>
-        <w:t xml:space="preserve"> processing 1.4B prescriptions annually—created company's first patient-facing product, reduced fulfillment errors 15% through improved drug interaction warnings</w:t>
-      </w:r>
-    </w:p>
-    <w:p>
-      <w:pPr>
-        <w:numPr>
-          <w:ilvl w:val="0"/>
-          <w:numId w:val="4"/>
-        </w:numPr>
-        <w:spacing w:after="240" w:before="0" w:beforeAutospacing="0" w:line="240" w:lineRule="auto"/>
-        <w:ind w:left="720" w:hanging="360"/>
-        <w:rPr>
-          <w:color w:val="434343"/>
           <w:sz w:val="20"/>
           <w:szCs w:val="20"/>
         </w:rPr>
@@ -635,169 +669,6 @@
           <w:rtl w:val="0"/>
         </w:rPr>
         <w:t xml:space="preserve"> across client engagements while mentoring junior designers and leading cross-functional design sprints</w:t>
-      </w:r>
-      <w:r>
-        <w:rPr>
-          <w:rtl w:val="0"/>
-        </w:rPr>
-      </w:r>
-    </w:p>
-    <w:p>
-      <w:pPr>
-        <w:ind w:left="-630" w:right="-720" w:firstLine="0"/>
-        <w:jc w:val="both"/>
-        <w:rPr>
-          <w:color w:val="666666"/>
-        </w:rPr>
-      </w:pPr>
-      <w:r>
-        <w:rPr>
-          <w:rtl w:val="0"/>
-        </w:rPr>
-      </w:r>
-    </w:p>
-    <w:p>
-      <w:pPr>
-        <w:ind w:left="-630" w:right="-720" w:firstLine="0"/>
-        <w:jc w:val="both"/>
-        <w:rPr>
-          <w:color w:val="666666"/>
-        </w:rPr>
-      </w:pPr>
-      <w:r>
-        <w:rPr>
-          <w:rtl w:val="0"/>
-        </w:rPr>
-      </w:r>
-    </w:p>
-    <w:p>
-      <w:pPr>
-        <w:ind w:left="-630" w:right="-720" w:firstLine="0"/>
-        <w:jc w:val="both"/>
-        <w:rPr>
-          <w:b w:val="1"/>
-          <w:bCs w:val="1"/>
-          <w:color w:val="999999"/>
-        </w:rPr>
-      </w:pPr>
-      <w:r>
-        <w:rPr>
-          <w:color w:val="999999"/>
-          <w:rtl w:val="0"/>
-        </w:rPr>
-        <w:t xml:space="preserve">EARLIER EXPERIENCE | 2001 - 2014</w:t>
-      </w:r>
-      <w:r>
-        <w:rPr>
-          <w:rtl w:val="0"/>
-        </w:rPr>
-      </w:r>
-    </w:p>
-    <w:p>
-      <w:pPr>
-        <w:numPr>
-          <w:ilvl w:val="0"/>
-          <w:numId w:val="2"/>
-        </w:numPr>
-        <w:spacing w:after="0" w:afterAutospacing="0" w:before="240" w:lineRule="auto"/>
-        <w:ind w:left="720" w:hanging="360"/>
-        <w:rPr>
-          <w:color w:val="434343"/>
-          <w:sz w:val="20"/>
-          <w:szCs w:val="20"/>
-        </w:rPr>
-      </w:pPr>
-      <w:r>
-        <w:rPr>
-          <w:b w:val="1"/>
-          <w:bCs w:val="1"/>
-          <w:color w:val="434343"/>
-          <w:sz w:val="20"/>
-          <w:szCs w:val="20"/>
-          <w:rtl w:val="0"/>
-        </w:rPr>
-        <w:t xml:space="preserve">Nokia HERE Maps</w:t>
-      </w:r>
-      <w:r>
-        <w:rPr>
-          <w:color w:val="434343"/>
-          <w:sz w:val="20"/>
-          <w:szCs w:val="20"/>
-          <w:rtl w:val="0"/>
-        </w:rPr>
-        <w:t xml:space="preserve"> | Product Marketing Manager (2012-2014) - Led UX integration of acquired Trapster app, improving onboarding completion 33%</w:t>
-        <w:br w:type="textWrapping"/>
-      </w:r>
-    </w:p>
-    <w:p>
-      <w:pPr>
-        <w:numPr>
-          <w:ilvl w:val="0"/>
-          <w:numId w:val="2"/>
-        </w:numPr>
-        <w:spacing w:after="0" w:afterAutospacing="0" w:before="0" w:beforeAutospacing="0" w:lineRule="auto"/>
-        <w:ind w:left="720" w:hanging="360"/>
-        <w:rPr>
-          <w:color w:val="434343"/>
-          <w:sz w:val="20"/>
-          <w:szCs w:val="20"/>
-        </w:rPr>
-      </w:pPr>
-      <w:r>
-        <w:rPr>
-          <w:b w:val="1"/>
-          <w:bCs w:val="1"/>
-          <w:color w:val="434343"/>
-          <w:sz w:val="20"/>
-          <w:szCs w:val="20"/>
-          <w:rtl w:val="0"/>
-        </w:rPr>
-        <w:t xml:space="preserve">Gogo Inflight WiFi</w:t>
-      </w:r>
-      <w:r>
-        <w:rPr>
-          <w:color w:val="434343"/>
-          <w:sz w:val="20"/>
-          <w:szCs w:val="20"/>
-          <w:rtl w:val="0"/>
-        </w:rPr>
-        <w:t xml:space="preserve"> | Product Manager (2008-2012) - Launched connectivity across 6 major airlines; developed sponsored flight tracker generating recurring revenue</w:t>
-        <w:br w:type="textWrapping"/>
-      </w:r>
-    </w:p>
-    <w:p>
-      <w:pPr>
-        <w:numPr>
-          <w:ilvl w:val="0"/>
-          <w:numId w:val="2"/>
-        </w:numPr>
-        <w:spacing w:after="240" w:before="0" w:beforeAutospacing="0" w:lineRule="auto"/>
-        <w:ind w:left="720" w:hanging="360"/>
-        <w:rPr>
-          <w:color w:val="434343"/>
-          <w:sz w:val="20"/>
-          <w:szCs w:val="20"/>
-        </w:rPr>
-      </w:pPr>
-      <w:r>
-        <w:rPr>
-          <w:b w:val="1"/>
-          <w:bCs w:val="1"/>
-          <w:color w:val="434343"/>
-          <w:sz w:val="20"/>
-          <w:szCs w:val="20"/>
-          <w:rtl w:val="0"/>
-        </w:rPr>
-        <w:t xml:space="preserve">Cognistar</w:t>
-      </w:r>
-      <w:r>
-        <w:rPr>
-          <w:color w:val="434343"/>
-          <w:sz w:val="20"/>
-          <w:szCs w:val="20"/>
-          <w:rtl w:val="0"/>
-        </w:rPr>
-        <w:t xml:space="preserve"> | Co-Founder (2001-2008) - Built digital production and UX for legal education startup; raised $3M, achieved $2M+ annual revenue before acquisition</w:t>
       </w:r>
       <w:r>
         <w:rPr>
@@ -1568,116 +1439,6 @@
       </w:rPr>
     </w:lvl>
   </w:abstractNum>
-  <w:abstractNum w:abstractNumId="4">
-    <w:lvl w:ilvl="0">
-      <w:start w:val="1"/>
-      <w:numFmt w:val="bullet"/>
-      <w:lvlText w:val="●"/>
-      <w:lvlJc w:val="left"/>
-      <w:pPr>
-        <w:ind w:left="720" w:hanging="360"/>
-      </w:pPr>
-      <w:rPr>
-        <w:u w:val="none"/>
-      </w:rPr>
-    </w:lvl>
-    <w:lvl w:ilvl="1">
-      <w:start w:val="1"/>
-      <w:numFmt w:val="bullet"/>
-      <w:lvlText w:val="○"/>
-      <w:lvlJc w:val="left"/>
-      <w:pPr>
-        <w:ind w:left="1440" w:hanging="360"/>
-      </w:pPr>
-      <w:rPr>
-        <w:u w:val="none"/>
-      </w:rPr>
-    </w:lvl>
-    <w:lvl w:ilvl="2">
-      <w:start w:val="1"/>
-      <w:numFmt w:val="bullet"/>
-      <w:lvlText w:val="■"/>
-      <w:lvlJc w:val="left"/>
-      <w:pPr>
-        <w:ind w:left="2160" w:hanging="360"/>
-      </w:pPr>
-      <w:rPr>
-        <w:u w:val="none"/>
-      </w:rPr>
-    </w:lvl>
-    <w:lvl w:ilvl="3">
-      <w:start w:val="1"/>
-      <w:numFmt w:val="bullet"/>
-      <w:lvlText w:val="●"/>
-      <w:lvlJc w:val="left"/>
-      <w:pPr>
-        <w:ind w:left="2880" w:hanging="360"/>
-      </w:pPr>
-      <w:rPr>
-        <w:u w:val="none"/>
-      </w:rPr>
-    </w:lvl>
-    <w:lvl w:ilvl="4">
-      <w:start w:val="1"/>
-      <w:numFmt w:val="bullet"/>
-      <w:lvlText w:val="○"/>
-      <w:lvlJc w:val="left"/>
-      <w:pPr>
-        <w:ind w:left="3600" w:hanging="360"/>
-      </w:pPr>
-      <w:rPr>
-        <w:u w:val="none"/>
-      </w:rPr>
-    </w:lvl>
-    <w:lvl w:ilvl="5">
-      <w:start w:val="1"/>
-      <w:numFmt w:val="bullet"/>
-      <w:lvlText w:val="■"/>
-      <w:lvlJc w:val="left"/>
-      <w:pPr>
-        <w:ind w:left="4320" w:hanging="360"/>
-      </w:pPr>
-      <w:rPr>
-        <w:u w:val="none"/>
-      </w:rPr>
-    </w:lvl>
-    <w:lvl w:ilvl="6">
-      <w:start w:val="1"/>
-      <w:numFmt w:val="bullet"/>
-      <w:lvlText w:val="●"/>
-      <w:lvlJc w:val="left"/>
-      <w:pPr>
-        <w:ind w:left="5040" w:hanging="360"/>
-      </w:pPr>
-      <w:rPr>
-        <w:u w:val="none"/>
-      </w:rPr>
-    </w:lvl>
-    <w:lvl w:ilvl="7">
-      <w:start w:val="1"/>
-      <w:numFmt w:val="bullet"/>
-      <w:lvlText w:val="○"/>
-      <w:lvlJc w:val="left"/>
-      <w:pPr>
-        <w:ind w:left="5760" w:hanging="360"/>
-      </w:pPr>
-      <w:rPr>
-        <w:u w:val="none"/>
-      </w:rPr>
-    </w:lvl>
-    <w:lvl w:ilvl="8">
-      <w:start w:val="1"/>
-      <w:numFmt w:val="bullet"/>
-      <w:lvlText w:val="■"/>
-      <w:lvlJc w:val="left"/>
-      <w:pPr>
-        <w:ind w:left="6480" w:hanging="360"/>
-      </w:pPr>
-      <w:rPr>
-        <w:u w:val="none"/>
-      </w:rPr>
-    </w:lvl>
-  </w:abstractNum>
   <w:num w:numId="1">
     <w:abstractNumId w:val="1"/>
   </w:num>
@@ -1686,9 +1447,6 @@
   </w:num>
   <w:num w:numId="3">
     <w:abstractNumId w:val="3"/>
-  </w:num>
-  <w:num w:numId="4">
-    <w:abstractNumId w:val="4"/>
   </w:num>
 </w:numbering>
 </file>

</xml_diff>

<commit_message>
resume(binaries): regenerate docx/pdf/odt/rtf/txt/epub to match trimmed .md
All six download formats were stale at Mar 31, still showing the old
"validated AI as practical force multiplier" Thios framing. The .md was
trimmed in c56bffa (intro summary trim + Thios 6 → 3 bullets); these
binaries now match.

Verified docx + txt contain the new "5-surface agent-native design system"
phrasing and zero stale phrases. PDF integrity confirmed (valid 2-page
US Letter). All 6 formats deployed and reachable on live.

Co-Authored-By: Claude Opus 4.7 (1M context) <noreply@anthropic.com>
</commit_message>
<xml_diff>
--- a/Peter-Bartsch-Resume.docx
+++ b/Peter-Bartsch-Resume.docx
@@ -13,14 +13,14 @@
       </w:pPr>
       <w:r>
         <w:rPr>
-          <w:rFonts w:ascii="Nova Mono" w:cs="Nova Mono" w:eastAsia="Nova Mono" w:hAnsi="Nova Mono"/>
-          <w:color w:val="141413"/>
-          <w:sz w:val="21"/>
-          <w:szCs w:val="21"/>
-          <w:highlight w:val="white"/>
-          <w:rtl w:val="0"/>
-        </w:rPr>
-        <w:t xml:space="preserve">Staff Product Designer — Enterprise Platforms &amp; 0→1. Led design for $3.8B platform at Deere (500K users). Built design org 1→10 at FourKites through $3M→$100M ARR ($1B+ valuation). 15 years shipping enterprise systems that actually get adopted.</w:t>
+          <w:rFonts w:ascii="Arial Unicode MS" w:cs="Arial Unicode MS" w:eastAsia="Arial Unicode MS" w:hAnsi="Arial Unicode MS"/>
+          <w:color w:val="333333"/>
+          <w:sz w:val="24"/>
+          <w:szCs w:val="24"/>
+          <w:shd w:fill="fafafa" w:val="clear"/>
+          <w:rtl w:val="0"/>
+        </w:rPr>
+        <w:t xml:space="preserve">Staff Product Designer · Founder. Led design for $3.8B platform at Deere (500K users). Built design org 1→10 at FourKites through $3M→$100M ARR ($1B+ valuation). Now founder of Thios — modular structures + agent-native design systems.</w:t>
       </w:r>
       <w:r>
         <w:rPr>
@@ -76,7 +76,7 @@
           <w:highlight w:val="white"/>
           <w:rtl w:val="0"/>
         </w:rPr>
-        <w:t xml:space="preserve">Between enterprise roles — shipped a complete product ecosystem solo using AI tooling to demonstrate full-stack design range.</w:t>
+        <w:t xml:space="preserve">Open-source modular structures (saunas, greenhouses, offices) running on a 5-surface design system where I'm the only designer and agents are the team.</w:t>
       </w:r>
       <w:r>
         <w:rPr>
@@ -94,29 +94,27 @@
         <w:ind w:left="720" w:hanging="360"/>
         <w:rPr>
           <w:color w:val="434343"/>
-          <w:sz w:val="20"/>
-          <w:szCs w:val="20"/>
-        </w:rPr>
-      </w:pPr>
-      <w:r>
-        <w:rPr>
-          <w:b w:val="1"/>
-          <w:bCs w:val="1"/>
-          <w:color w:val="434343"/>
-          <w:sz w:val="20"/>
-          <w:szCs w:val="20"/>
-          <w:rtl w:val="0"/>
-        </w:rPr>
-        <w:t xml:space="preserve">Created complete product ecosystem solo in 18 months</w:t>
-      </w:r>
-      <w:r>
-        <w:rPr>
-          <w:color w:val="434343"/>
-          <w:sz w:val="20"/>
-          <w:szCs w:val="20"/>
-          <w:rtl w:val="0"/>
-        </w:rPr>
-        <w:t xml:space="preserve">: brand identity inspired by early 2000s open-source culture, 3 websites (thios.co, blog, store), 5 shelter variants with CAD models, physical prototype, and handbook generating first revenue</w:t>
+        </w:rPr>
+      </w:pPr>
+      <w:r>
+        <w:rPr>
+          <w:b w:val="1"/>
+          <w:bCs w:val="1"/>
+          <w:color w:val="434343"/>
+          <w:sz w:val="20"/>
+          <w:szCs w:val="20"/>
+          <w:rtl w:val="0"/>
+        </w:rPr>
+        <w:t xml:space="preserve">Shipped a complete product ecosystem solo in 18 months:</w:t>
+      </w:r>
+      <w:r>
+        <w:rPr>
+          <w:color w:val="434343"/>
+          <w:sz w:val="20"/>
+          <w:szCs w:val="20"/>
+          <w:rtl w:val="0"/>
+        </w:rPr>
+        <w:t xml:space="preserve"> brand, 3 websites, 5 shelter variants with CAD models, physical prototype, first revenue</w:t>
       </w:r>
     </w:p>
     <w:p>
@@ -129,30 +127,144 @@
         <w:ind w:left="720" w:hanging="360"/>
         <w:rPr>
           <w:color w:val="434343"/>
-          <w:sz w:val="20"/>
-          <w:szCs w:val="20"/>
-        </w:rPr>
-      </w:pPr>
-      <w:r>
-        <w:rPr>
-          <w:b w:val="1"/>
-          <w:bCs w:val="1"/>
-          <w:color w:val="434343"/>
-          <w:sz w:val="20"/>
-          <w:szCs w:val="20"/>
-          <w:rtl w:val="0"/>
-        </w:rPr>
-        <w:t xml:space="preserve">Applied full career toolkit simultaneously</w:t>
-      </w:r>
-      <w:r>
-        <w:rPr>
-          <w:rFonts w:ascii="Arial Unicode MS" w:cs="Arial Unicode MS" w:eastAsia="Arial Unicode MS" w:hAnsi="Arial Unicode MS"/>
-          <w:color w:val="434343"/>
-          <w:sz w:val="20"/>
-          <w:szCs w:val="20"/>
-          <w:rtl w:val="0"/>
-        </w:rPr>
-        <w:t xml:space="preserve">—product strategy, marketing, and design execution using GitHub Copilot → Cursor → Anti Gravity progression; proving experienced generalists can operate across traditional role boundaries with AI partnership</w:t>
+        </w:rPr>
+      </w:pPr>
+      <w:r>
+        <w:rPr>
+          <w:b w:val="1"/>
+          <w:bCs w:val="1"/>
+          <w:color w:val="434343"/>
+          <w:sz w:val="20"/>
+          <w:szCs w:val="20"/>
+          <w:rtl w:val="0"/>
+        </w:rPr>
+        <w:t xml:space="preserve">Built a 5-surface agent-native design system and published its first Claude Skill </w:t>
+      </w:r>
+      <w:r>
+        <w:rPr>
+          <w:color w:val="434343"/>
+          <w:sz w:val="20"/>
+          <w:szCs w:val="20"/>
+          <w:rtl w:val="0"/>
+        </w:rPr>
+        <w:t xml:space="preserve">(audit-design-token-drift) — catches design-token drift across all canonical surfaces with file:line citations</w:t>
+      </w:r>
+    </w:p>
+    <w:p>
+      <w:pPr>
+        <w:numPr>
+          <w:ilvl w:val="0"/>
+          <w:numId w:val="2"/>
+        </w:numPr>
+        <w:spacing w:after="240" w:before="0" w:beforeAutospacing="0" w:line="240" w:lineRule="auto"/>
+        <w:ind w:left="720" w:hanging="360"/>
+        <w:rPr>
+          <w:color w:val="434343"/>
+          <w:sz w:val="20"/>
+          <w:szCs w:val="20"/>
+          <w:u w:val="none"/>
+        </w:rPr>
+      </w:pPr>
+      <w:r>
+        <w:rPr>
+          <w:b w:val="1"/>
+          <w:bCs w:val="1"/>
+          <w:color w:val="434343"/>
+          <w:sz w:val="20"/>
+          <w:szCs w:val="20"/>
+          <w:rtl w:val="0"/>
+        </w:rPr>
+        <w:t xml:space="preserve">Pre-registered an empirical benchmark on the skill</w:t>
+      </w:r>
+      <w:r>
+        <w:rPr>
+          <w:color w:val="434343"/>
+          <w:sz w:val="20"/>
+          <w:szCs w:val="20"/>
+          <w:rtl w:val="0"/>
+        </w:rPr>
+        <w:t xml:space="preserve"> — published the honest result: the lean variant beat the verbose one on recall</w:t>
+      </w:r>
+    </w:p>
+    <w:p>
+      <w:pPr>
+        <w:spacing w:after="240" w:before="240" w:line="240" w:lineRule="auto"/>
+        <w:ind w:left="-630.0000000000001" w:firstLine="0"/>
+        <w:jc w:val="both"/>
+        <w:rPr>
+          <w:b w:val="1"/>
+          <w:bCs w:val="1"/>
+        </w:rPr>
+      </w:pPr>
+      <w:r>
+        <w:rPr>
+          <w:rtl w:val="0"/>
+        </w:rPr>
+      </w:r>
+    </w:p>
+    <w:p>
+      <w:pPr>
+        <w:spacing w:after="240" w:before="240" w:line="240" w:lineRule="auto"/>
+        <w:ind w:left="-630.0000000000001" w:firstLine="0"/>
+        <w:jc w:val="both"/>
+        <w:rPr/>
+      </w:pPr>
+      <w:r>
+        <w:rPr>
+          <w:b w:val="1"/>
+          <w:bCs w:val="1"/>
+          <w:rtl w:val="0"/>
+        </w:rPr>
+        <w:t xml:space="preserve">JOHN DEERE | Senior Lead UX; Digital Customer Experience</w:t>
+      </w:r>
+      <w:r>
+        <w:rPr>
+          <w:rtl w:val="0"/>
+        </w:rPr>
+        <w:t xml:space="preserve"> | Aug 2020 - Jul 2024 </w:t>
+        <w:br w:type="textWrapping"/>
+        <w:t xml:space="preserve">Embedded with product teams to modernize 20-year-old systems and drive subscription revenue. Proving enterprise design can move fast when you have the right frameworks.</w:t>
+      </w:r>
+    </w:p>
+    <w:p>
+      <w:pPr>
+        <w:numPr>
+          <w:ilvl w:val="0"/>
+          <w:numId w:val="2"/>
+        </w:numPr>
+        <w:spacing w:after="0" w:afterAutospacing="0" w:before="240" w:line="240" w:lineRule="auto"/>
+        <w:ind w:left="720" w:hanging="360"/>
+        <w:rPr>
+          <w:color w:val="434343"/>
+          <w:sz w:val="20"/>
+          <w:szCs w:val="20"/>
+        </w:rPr>
+      </w:pPr>
+      <w:r>
+        <w:rPr>
+          <w:b w:val="1"/>
+          <w:bCs w:val="1"/>
+          <w:color w:val="434343"/>
+          <w:sz w:val="20"/>
+          <w:szCs w:val="20"/>
+          <w:rtl w:val="0"/>
+        </w:rPr>
+        <w:t xml:space="preserve">Redesigned license management system</w:t>
+      </w:r>
+      <w:r>
+        <w:rPr>
+          <w:color w:val="434343"/>
+          <w:sz w:val="20"/>
+          <w:szCs w:val="20"/>
+          <w:rtl w:val="0"/>
+        </w:rPr>
+        <w:t xml:space="preserve"> serving 500K+ users across 12 languages—increased authenticated engagement 34%, reduced support tickets 16%, enabled $3.8B in subscription revenue from Automation and AI services</w:t>
+        <w:br w:type="textWrapping"/>
+      </w:r>
+      <w:r>
+        <w:rPr>
+          <w:rtl w:val="0"/>
+        </w:rPr>
       </w:r>
     </w:p>
     <w:p>
@@ -178,16 +290,22 @@
           <w:szCs w:val="20"/>
           <w:rtl w:val="0"/>
         </w:rPr>
-        <w:t xml:space="preserve">Established AI-augmented workflows</w:t>
-      </w:r>
-      <w:r>
-        <w:rPr>
-          <w:color w:val="434343"/>
-          <w:sz w:val="20"/>
-          <w:szCs w:val="20"/>
-          <w:rtl w:val="0"/>
-        </w:rPr>
-        <w:t xml:space="preserve">: Obsidian MD + AI for project management and research synthesis; Figma Make for design-to-code; compressed prototyping cycles 70% through conversational development in Cursor and Anti-Gravity &amp; Claude Code</w:t>
+        <w:t xml:space="preserve">Built unified account and navigation framework</w:t>
+      </w:r>
+      <w:r>
+        <w:rPr>
+          <w:color w:val="434343"/>
+          <w:sz w:val="20"/>
+          <w:szCs w:val="20"/>
+          <w:rtl w:val="0"/>
+        </w:rPr>
+        <w:t xml:space="preserve"> deployed across 8 product lines (web, mobile, embedded)—consolidated fragmented experiences into single customer view, improved dealer support efficiency 28%</w:t>
+        <w:br w:type="textWrapping"/>
+      </w:r>
+      <w:r>
+        <w:rPr>
+          <w:rtl w:val="0"/>
+        </w:rPr>
       </w:r>
     </w:p>
     <w:p>
@@ -200,27 +318,42 @@
         <w:ind w:left="720" w:hanging="360"/>
         <w:rPr>
           <w:color w:val="434343"/>
-        </w:rPr>
-      </w:pPr>
-      <w:r>
-        <w:rPr>
-          <w:b w:val="1"/>
-          <w:bCs w:val="1"/>
-          <w:color w:val="434343"/>
-          <w:sz w:val="20"/>
-          <w:szCs w:val="20"/>
-          <w:rtl w:val="0"/>
-        </w:rPr>
-        <w:t xml:space="preserve">Outcomes</w:t>
-      </w:r>
-      <w:r>
-        <w:rPr>
-          <w:color w:val="434343"/>
-          <w:sz w:val="20"/>
-          <w:szCs w:val="20"/>
-          <w:rtl w:val="0"/>
-        </w:rPr>
-        <w:t xml:space="preserve">: Validated AI as practical force multiplier for startups; demonstrating how to maintain product quality while working at solo-founder velocity; any prototype is possible</w:t>
+          <w:sz w:val="20"/>
+          <w:szCs w:val="20"/>
+        </w:rPr>
+      </w:pPr>
+      <w:r>
+        <w:rPr>
+          <w:rFonts w:ascii="Roboto" w:cs="Roboto" w:eastAsia="Roboto" w:hAnsi="Roboto"/>
+          <w:b w:val="1"/>
+          <w:bCs w:val="1"/>
+          <w:color w:val="141413"/>
+          <w:sz w:val="21"/>
+          <w:szCs w:val="21"/>
+          <w:highlight w:val="white"/>
+          <w:rtl w:val="0"/>
+        </w:rPr>
+        <w:t xml:space="preserve">Core contributor</w:t>
+      </w:r>
+      <w:r>
+        <w:rPr>
+          <w:rFonts w:ascii="Roboto" w:cs="Roboto" w:eastAsia="Roboto" w:hAnsi="Roboto"/>
+          <w:color w:val="141413"/>
+          <w:sz w:val="21"/>
+          <w:szCs w:val="21"/>
+          <w:highlight w:val="white"/>
+          <w:rtl w:val="0"/>
+        </w:rPr>
+        <w:t xml:space="preserve"> to enterprise design system in Figma spanning 6 brands</w:t>
+      </w:r>
+      <w:r>
+        <w:rPr>
+          <w:color w:val="434343"/>
+          <w:sz w:val="20"/>
+          <w:szCs w:val="20"/>
+          <w:rtl w:val="0"/>
+        </w:rPr>
+        <w:t xml:space="preserve"> and 40+ product teams globally—reduced design-to-development handoff time 45% through standardized components that actually shipped</w:t>
       </w:r>
       <w:r>
         <w:rPr>
@@ -240,6 +373,7 @@
           <w:bCs w:val="1"/>
           <w:rtl w:val="0"/>
         </w:rPr>
+        <w:br w:type="textWrapping"/>
         <w:t xml:space="preserve">FOURKITES | Lead UX / Manager</w:t>
       </w:r>
       <w:r>
@@ -379,156 +513,12 @@
     <w:p>
       <w:pPr>
         <w:spacing w:after="240" w:before="240" w:line="240" w:lineRule="auto"/>
-        <w:ind w:left="-630.0000000000001" w:right="0" w:firstLine="0"/>
-        <w:jc w:val="both"/>
-        <w:rPr/>
-      </w:pPr>
-      <w:r>
-        <w:rPr>
-          <w:b w:val="1"/>
-          <w:bCs w:val="1"/>
-          <w:rtl w:val="0"/>
-        </w:rPr>
-        <w:t xml:space="preserve">JOHN DEERE | Senior Lead UX; Digital Customer Experience</w:t>
-      </w:r>
-      <w:r>
-        <w:rPr>
-          <w:rtl w:val="0"/>
-        </w:rPr>
-        <w:t xml:space="preserve"> | Aug 2020 - Jul 2024 </w:t>
-        <w:br w:type="textWrapping"/>
-        <w:t xml:space="preserve">Embedded with product teams to modernize 20-year-old systems and drive subscription revenue. Proving enterprise design can move fast when you have the right frameworks.</w:t>
-      </w:r>
-    </w:p>
-    <w:p>
-      <w:pPr>
-        <w:numPr>
-          <w:ilvl w:val="0"/>
-          <w:numId w:val="2"/>
-        </w:numPr>
-        <w:spacing w:after="0" w:afterAutospacing="0" w:before="240" w:line="240" w:lineRule="auto"/>
-        <w:ind w:left="720" w:hanging="360"/>
-        <w:rPr>
-          <w:color w:val="434343"/>
-          <w:sz w:val="20"/>
-          <w:szCs w:val="20"/>
-        </w:rPr>
-      </w:pPr>
-      <w:r>
-        <w:rPr>
-          <w:b w:val="1"/>
-          <w:bCs w:val="1"/>
-          <w:color w:val="434343"/>
-          <w:sz w:val="20"/>
-          <w:szCs w:val="20"/>
-          <w:rtl w:val="0"/>
-        </w:rPr>
-        <w:t xml:space="preserve">Redesigned license management system</w:t>
-      </w:r>
-      <w:r>
-        <w:rPr>
-          <w:color w:val="434343"/>
-          <w:sz w:val="20"/>
-          <w:szCs w:val="20"/>
-          <w:rtl w:val="0"/>
-        </w:rPr>
-        <w:t xml:space="preserve"> serving 500K+ users across 12 languages—increased authenticated engagement 34%, reduced support tickets 16%, enabled $3.8B in subscription revenue from Automation and AI services</w:t>
-        <w:br w:type="textWrapping"/>
-      </w:r>
-      <w:r>
-        <w:rPr>
-          <w:rtl w:val="0"/>
-        </w:rPr>
-      </w:r>
-    </w:p>
-    <w:p>
-      <w:pPr>
-        <w:numPr>
-          <w:ilvl w:val="0"/>
-          <w:numId w:val="2"/>
-        </w:numPr>
-        <w:spacing w:after="0" w:afterAutospacing="0" w:before="0" w:beforeAutospacing="0" w:line="240" w:lineRule="auto"/>
-        <w:ind w:left="720" w:hanging="360"/>
-        <w:rPr>
-          <w:color w:val="434343"/>
-          <w:sz w:val="20"/>
-          <w:szCs w:val="20"/>
-        </w:rPr>
-      </w:pPr>
-      <w:r>
-        <w:rPr>
-          <w:b w:val="1"/>
-          <w:bCs w:val="1"/>
-          <w:color w:val="434343"/>
-          <w:sz w:val="20"/>
-          <w:szCs w:val="20"/>
-          <w:rtl w:val="0"/>
-        </w:rPr>
-        <w:t xml:space="preserve">Built unified account and navigation framework</w:t>
-      </w:r>
-      <w:r>
-        <w:rPr>
-          <w:color w:val="434343"/>
-          <w:sz w:val="20"/>
-          <w:szCs w:val="20"/>
-          <w:rtl w:val="0"/>
-        </w:rPr>
-        <w:t xml:space="preserve"> deployed across 8 product lines (web, mobile, embedded)—consolidated fragmented experiences into single customer view, improved dealer support efficiency 28%</w:t>
-        <w:br w:type="textWrapping"/>
-      </w:r>
-      <w:r>
-        <w:rPr>
-          <w:rtl w:val="0"/>
-        </w:rPr>
-      </w:r>
-    </w:p>
-    <w:p>
-      <w:pPr>
-        <w:numPr>
-          <w:ilvl w:val="0"/>
-          <w:numId w:val="2"/>
-        </w:numPr>
-        <w:spacing w:after="240" w:before="0" w:beforeAutospacing="0" w:line="240" w:lineRule="auto"/>
-        <w:ind w:left="720" w:hanging="360"/>
-        <w:rPr>
-          <w:color w:val="434343"/>
-          <w:sz w:val="20"/>
-          <w:szCs w:val="20"/>
-        </w:rPr>
-      </w:pPr>
-      <w:r>
-        <w:rPr>
-          <w:rFonts w:ascii="Roboto" w:cs="Roboto" w:eastAsia="Roboto" w:hAnsi="Roboto"/>
-          <w:b w:val="1"/>
-          <w:bCs w:val="1"/>
-          <w:color w:val="141413"/>
-          <w:sz w:val="21"/>
-          <w:szCs w:val="21"/>
-          <w:highlight w:val="white"/>
-          <w:rtl w:val="0"/>
-        </w:rPr>
-        <w:t xml:space="preserve">Core contributor</w:t>
-      </w:r>
-      <w:r>
-        <w:rPr>
-          <w:rFonts w:ascii="Roboto" w:cs="Roboto" w:eastAsia="Roboto" w:hAnsi="Roboto"/>
-          <w:color w:val="141413"/>
-          <w:sz w:val="21"/>
-          <w:szCs w:val="21"/>
-          <w:highlight w:val="white"/>
-          <w:rtl w:val="0"/>
-        </w:rPr>
-        <w:t xml:space="preserve"> to enterprise design system in Figma spanning 6 brands</w:t>
-      </w:r>
-      <w:r>
-        <w:rPr>
-          <w:color w:val="434343"/>
-          <w:sz w:val="20"/>
-          <w:szCs w:val="20"/>
-          <w:rtl w:val="0"/>
-        </w:rPr>
-        <w:t xml:space="preserve"> and 40+ product teams globally—reduced design-to-development handoff time 45% through standardized components that actually shipped</w:t>
-      </w:r>
+        <w:ind w:left="-540.0000000000001" w:right="-623.3333333333348" w:firstLine="0"/>
+        <w:rPr>
+          <w:b w:val="1"/>
+          <w:bCs w:val="1"/>
+        </w:rPr>
+      </w:pPr>
       <w:r>
         <w:rPr>
           <w:rtl w:val="0"/>

</xml_diff>

<commit_message>
resume binaries: regenerate pdf/docx/odt/rtf/epub/txt
Re-exports from the updated Google Doc source so the downloadable
formats match the .md and resume.php that landed in #13 and #14.

Content changes (already documented in those PRs):
- Section order: Thios → Deere → FourKites → MavenWave
- Summary: founder of Thios (thios.co) — open-hardware framing
- Thios bullets: CAD drives BoM + 3D configurator; CERN-OHL-S
  distribution; "6 sphere variants" (was "5 shelter variants")
- thios.co + thios.co/configurator now appear as visible URL text

Verified against the .txt export: 0 occurrences of audit-design-
token-drift / Pre-registered / agent-native; thios.co appears 3×.
</commit_message>
<xml_diff>
--- a/Peter-Bartsch-Resume.docx
+++ b/Peter-Bartsch-Resume.docx
@@ -20,7 +20,7 @@
           <w:shd w:fill="fafafa" w:val="clear"/>
           <w:rtl w:val="0"/>
         </w:rPr>
-        <w:t xml:space="preserve">Staff Product Designer · Founder. Led design for $3.8B platform at Deere (500K users). Built design org 1→10 at FourKites through $3M→$100M ARR ($1B+ valuation). Now founder of Thios — modular structures + agent-native design systems.</w:t>
+        <w:t xml:space="preserve">Staff Product Designer · Founder. Led design for $3.8B platform at Deere (500K users). Built design org 1→10 at FourKites through $3M→$100M ARR ($1B+ valuation). Now founder of Thios (thios.co) — open-hardware modular structures with a CAD-driven configurator and a 5-surface design system.</w:t>
       </w:r>
       <w:r>
         <w:rPr>
@@ -58,13 +58,13 @@
           <w:bCs w:val="1"/>
           <w:rtl w:val="0"/>
         </w:rPr>
-        <w:t xml:space="preserve">THIOS | Founder &amp; Lead Designer</w:t>
-      </w:r>
-      <w:r>
-        <w:rPr>
-          <w:rtl w:val="0"/>
-        </w:rPr>
-        <w:t xml:space="preserve"> | Aug 2024 - Present </w:t>
+        <w:t xml:space="preserve">THIOS (thios.co) | Founder &amp; Lead Designer </w:t>
+      </w:r>
+      <w:r>
+        <w:rPr>
+          <w:rtl w:val="0"/>
+        </w:rPr>
+        <w:t xml:space="preserve">| Aug 2024 - Present</w:t>
         <w:br w:type="textWrapping"/>
       </w:r>
       <w:r>
@@ -114,7 +114,7 @@
           <w:szCs w:val="20"/>
           <w:rtl w:val="0"/>
         </w:rPr>
-        <w:t xml:space="preserve"> brand, 3 websites, 5 shelter variants with CAD models, physical prototype, first revenue</w:t>
+        <w:t xml:space="preserve"> brand, 3 websites, 6 sphere variants with CAD models, physical prototype, first revenue</w:t>
       </w:r>
     </w:p>
     <w:p>
@@ -138,16 +138,16 @@
           <w:szCs w:val="20"/>
           <w:rtl w:val="0"/>
         </w:rPr>
-        <w:t xml:space="preserve">Built a 5-surface agent-native design system and published its first Claude Skill </w:t>
-      </w:r>
-      <w:r>
-        <w:rPr>
-          <w:color w:val="434343"/>
-          <w:sz w:val="20"/>
-          <w:szCs w:val="20"/>
-          <w:rtl w:val="0"/>
-        </w:rPr>
-        <w:t xml:space="preserve">(audit-design-token-drift) — catches design-token drift across all canonical surfaces with file:line citations</w:t>
+        <w:t xml:space="preserve">One parametric OnShape CAD file drives the bill of materials and the 3D configurator at thios.co/configurator</w:t>
+      </w:r>
+      <w:r>
+        <w:rPr>
+          <w:color w:val="434343"/>
+          <w:sz w:val="20"/>
+          <w:szCs w:val="20"/>
+          <w:rtl w:val="0"/>
+        </w:rPr>
+        <w:t xml:space="preserve"> — customers see actual geometry, not marketing renders</w:t>
       </w:r>
     </w:p>
     <w:p>
@@ -174,28 +174,18 @@
           <w:szCs w:val="20"/>
           <w:rtl w:val="0"/>
         </w:rPr>
-        <w:t xml:space="preserve">Pre-registered an empirical benchmark on the skill</w:t>
-      </w:r>
-      <w:r>
-        <w:rPr>
-          <w:color w:val="434343"/>
-          <w:sz w:val="20"/>
-          <w:szCs w:val="20"/>
-          <w:rtl w:val="0"/>
-        </w:rPr>
-        <w:t xml:space="preserve"> — published the honest result: the lean variant beat the verbose one on recall</w:t>
-      </w:r>
-    </w:p>
-    <w:p>
-      <w:pPr>
-        <w:spacing w:after="240" w:before="240" w:line="240" w:lineRule="auto"/>
-        <w:ind w:left="-630.0000000000001" w:firstLine="0"/>
-        <w:jc w:val="both"/>
-        <w:rPr>
-          <w:b w:val="1"/>
-          <w:bCs w:val="1"/>
-        </w:rPr>
-      </w:pPr>
+        <w:t xml:space="preserve">Open-hardware distribution under CERN-OHL-S v2: </w:t>
+      </w:r>
+      <w:r>
+        <w:rPr>
+          <w:color w:val="434343"/>
+          <w:sz w:val="20"/>
+          <w:szCs w:val="20"/>
+          <w:rtl w:val="0"/>
+        </w:rPr>
+        <w:t xml:space="preserve">license + builder tools route demand to local makers; share-alike modifications loop back into the CAD — capital-light scale without factories</w:t>
+        <w:br w:type="textWrapping"/>
+      </w:r>
       <w:r>
         <w:rPr>
           <w:rtl w:val="0"/>
@@ -1082,7 +1072,7 @@
         <w:szCs w:val="20"/>
         <w:rtl w:val="0"/>
       </w:rPr>
-      <w:t xml:space="preserve">peterbartsch.com</w:t>
+      <w:t xml:space="preserve">petebartsch.com</w:t>
     </w:r>
     <w:r>
       <w:rPr>

</xml_diff>

<commit_message>
resume binaries: re-export docx/rtf/odt/epub/txt to match new PDF
Companion to #20 (which carries the .md, resume.php, .pdf rewrite).
User re-exported the other 5 formats from the canonical source so
the download dropdown serves a consistent resume in every format.

Verified against the .txt export: HERE Maps, Gogo, DEMPSY, Trapster,
Air-to-Ground, UX Systems, AI-Native Workflow, Figma Make,
IoT asset-tracking, "Member, Board of Directors" all present.
Role order: Thios → Deere → FourKites → MavenWave → Nokia/HERE → Gogo.
</commit_message>
<xml_diff>
--- a/Peter-Bartsch-Resume.docx
+++ b/Peter-Bartsch-Resume.docx
@@ -7,20 +7,16 @@
         <w:spacing w:after="240" w:before="240" w:line="240" w:lineRule="auto"/>
         <w:ind w:left="-630.0000000000001" w:right="-623.3333333333348" w:firstLine="0"/>
         <w:rPr>
-          <w:sz w:val="8"/>
-          <w:szCs w:val="8"/>
+          <w:sz w:val="4"/>
+          <w:szCs w:val="4"/>
         </w:rPr>
       </w:pPr>
       <w:r>
         <w:rPr>
           <w:rFonts w:ascii="Arial Unicode MS" w:cs="Arial Unicode MS" w:eastAsia="Arial Unicode MS" w:hAnsi="Arial Unicode MS"/>
-          <w:color w:val="333333"/>
-          <w:sz w:val="24"/>
-          <w:szCs w:val="24"/>
-          <w:shd w:fill="fafafa" w:val="clear"/>
-          <w:rtl w:val="0"/>
-        </w:rPr>
-        <w:t xml:space="preserve">Staff Product Designer · Founder. Led design for $3.8B platform at Deere (500K users). Built design org 1→10 at FourKites through $3M→$100M ARR ($1B+ valuation). Now founder of Thios (thios.co) — open-hardware modular structures with a CAD-driven configurator and a 5-surface design system.</w:t>
+          <w:rtl w:val="0"/>
+        </w:rPr>
+        <w:t xml:space="preserve">Staff Product Designer · UX systems thinker. Led UX for a $3.8B subscription platform at Deere across web, mobile, and embedded equipment systems (500K users, 12 languages). Built design org 1→10 at FourKites scaling a real-time IoT asset-tracking platform processing 10M+ daily events ($3M→$100M ARR, $1B+ valuation). Now founder of Thios — running an AI-native workflow (Claude, Cursor, Figma Make) to ship a CAD-driven configurator, dev-grade design system with its own Claude Skill, and physical hardware.</w:t>
       </w:r>
       <w:r>
         <w:rPr>
@@ -33,25 +29,18 @@
         <w:spacing w:line="240" w:lineRule="auto"/>
         <w:ind w:left="-630" w:right="-720" w:firstLine="0"/>
         <w:jc w:val="both"/>
+        <w:rPr/>
+      </w:pPr>
+      <w:r>
         <w:rPr>
           <w:color w:val="999999"/>
-        </w:rPr>
-      </w:pPr>
-      <w:r>
-        <w:rPr>
-          <w:color w:val="999999"/>
+          <w:sz w:val="20"/>
+          <w:szCs w:val="20"/>
           <w:rtl w:val="0"/>
         </w:rPr>
         <w:t xml:space="preserve">PROFESSIONAL EXPERIENCE</w:t>
-      </w:r>
-    </w:p>
-    <w:p>
-      <w:pPr>
-        <w:spacing w:after="240" w:before="240" w:line="240" w:lineRule="auto"/>
-        <w:ind w:left="-630.0000000000001" w:right="0" w:firstLine="0"/>
-        <w:jc w:val="both"/>
-        <w:rPr/>
-      </w:pPr>
+        <w:br w:type="textWrapping"/>
+      </w:r>
       <w:r>
         <w:rPr>
           <w:b w:val="1"/>
@@ -69,14 +58,11 @@
       </w:r>
       <w:r>
         <w:rPr>
-          <w:rFonts w:ascii="Roboto" w:cs="Roboto" w:eastAsia="Roboto" w:hAnsi="Roboto"/>
-          <w:color w:val="141413"/>
-          <w:sz w:val="21"/>
-          <w:szCs w:val="21"/>
-          <w:highlight w:val="white"/>
-          <w:rtl w:val="0"/>
-        </w:rPr>
-        <w:t xml:space="preserve">Open-source modular structures (saunas, greenhouses, offices) running on a 5-surface design system where I'm the only designer and agents are the team.</w:t>
+          <w:sz w:val="24"/>
+          <w:szCs w:val="24"/>
+          <w:rtl w:val="0"/>
+        </w:rPr>
+        <w:t xml:space="preserve">Open-source modular structures running on a 5-surface design system where I'm the only designer and agents are the engineering team, every surface (dashboard/configurator, docs, marketing, mobile, CAD) ships from one source of truth.</w:t>
       </w:r>
       <w:r>
         <w:rPr>
@@ -88,103 +74,162 @@
       <w:pPr>
         <w:numPr>
           <w:ilvl w:val="0"/>
-          <w:numId w:val="2"/>
+          <w:numId w:val="4"/>
         </w:numPr>
         <w:spacing w:after="0" w:afterAutospacing="0" w:before="240" w:line="240" w:lineRule="auto"/>
-        <w:ind w:left="720" w:hanging="360"/>
-        <w:rPr>
-          <w:color w:val="434343"/>
-        </w:rPr>
-      </w:pPr>
-      <w:r>
-        <w:rPr>
-          <w:b w:val="1"/>
-          <w:bCs w:val="1"/>
-          <w:color w:val="434343"/>
-          <w:sz w:val="20"/>
-          <w:szCs w:val="20"/>
-          <w:rtl w:val="0"/>
-        </w:rPr>
-        <w:t xml:space="preserve">Shipped a complete product ecosystem solo in 18 months:</w:t>
-      </w:r>
-      <w:r>
-        <w:rPr>
-          <w:color w:val="434343"/>
-          <w:sz w:val="20"/>
-          <w:szCs w:val="20"/>
-          <w:rtl w:val="0"/>
-        </w:rPr>
-        <w:t xml:space="preserve"> brand, 3 websites, 6 sphere variants with CAD models, physical prototype, first revenue</w:t>
+        <w:ind w:left="0" w:hanging="360"/>
+        <w:rPr>
+          <w:color w:val="434343"/>
+          <w:sz w:val="20"/>
+          <w:szCs w:val="20"/>
+        </w:rPr>
+      </w:pPr>
+      <w:r>
+        <w:rPr>
+          <w:b w:val="1"/>
+          <w:bCs w:val="1"/>
+          <w:sz w:val="20"/>
+          <w:szCs w:val="20"/>
+          <w:rtl w:val="0"/>
+        </w:rPr>
+        <w:t xml:space="preserve">Shipped a complete product ecosystem solo in 18 months</w:t>
+      </w:r>
+      <w:r>
+        <w:rPr>
+          <w:sz w:val="20"/>
+          <w:szCs w:val="20"/>
+          <w:rtl w:val="0"/>
+        </w:rPr>
+        <w:t xml:space="preserve"> across every surface — dashboard/configurator, docs, marketing sites, mobile, and physical hardware (6 sphere variants with CAD models, prototype, first revenue)</w:t>
       </w:r>
     </w:p>
     <w:p>
       <w:pPr>
         <w:numPr>
           <w:ilvl w:val="0"/>
-          <w:numId w:val="2"/>
+          <w:numId w:val="4"/>
         </w:numPr>
         <w:spacing w:after="0" w:afterAutospacing="0" w:before="0" w:beforeAutospacing="0" w:line="240" w:lineRule="auto"/>
-        <w:ind w:left="720" w:hanging="360"/>
-        <w:rPr>
-          <w:color w:val="434343"/>
-        </w:rPr>
-      </w:pPr>
-      <w:r>
-        <w:rPr>
-          <w:b w:val="1"/>
-          <w:bCs w:val="1"/>
-          <w:color w:val="434343"/>
-          <w:sz w:val="20"/>
-          <w:szCs w:val="20"/>
-          <w:rtl w:val="0"/>
-        </w:rPr>
-        <w:t xml:space="preserve">One parametric OnShape CAD file drives the bill of materials and the 3D configurator at thios.co/configurator</w:t>
-      </w:r>
-      <w:r>
-        <w:rPr>
-          <w:color w:val="434343"/>
-          <w:sz w:val="20"/>
-          <w:szCs w:val="20"/>
-          <w:rtl w:val="0"/>
-        </w:rPr>
-        <w:t xml:space="preserve"> — customers see actual geometry, not marketing renders</w:t>
+        <w:ind w:left="0" w:hanging="360"/>
+        <w:rPr>
+          <w:color w:val="434343"/>
+          <w:sz w:val="20"/>
+          <w:szCs w:val="20"/>
+        </w:rPr>
+      </w:pPr>
+      <w:r>
+        <w:rPr>
+          <w:b w:val="1"/>
+          <w:bCs w:val="1"/>
+          <w:sz w:val="20"/>
+          <w:szCs w:val="20"/>
+          <w:rtl w:val="0"/>
+        </w:rPr>
+        <w:t xml:space="preserve">Designed and built parametric OnShape CAD as the single source of truth</w:t>
+      </w:r>
+      <w:r>
+        <w:rPr>
+          <w:sz w:val="20"/>
+          <w:szCs w:val="20"/>
+          <w:rtl w:val="0"/>
+        </w:rPr>
+        <w:t xml:space="preserve"> driving BOM and the 3D configurator at thios.co/configurator — customers manipulate real geometry with full configuration state (valid/invalid combinations, loading, error, empty, BOM hand-off), not marketing renders</w:t>
       </w:r>
     </w:p>
     <w:p>
       <w:pPr>
         <w:numPr>
           <w:ilvl w:val="0"/>
-          <w:numId w:val="2"/>
+          <w:numId w:val="4"/>
+        </w:numPr>
+        <w:spacing w:after="0" w:afterAutospacing="0" w:before="0" w:beforeAutospacing="0" w:line="240" w:lineRule="auto"/>
+        <w:ind w:left="0" w:hanging="360"/>
+        <w:rPr>
+          <w:color w:val="434343"/>
+          <w:sz w:val="20"/>
+          <w:szCs w:val="20"/>
+        </w:rPr>
+      </w:pPr>
+      <w:r>
+        <w:rPr>
+          <w:b w:val="1"/>
+          <w:bCs w:val="1"/>
+          <w:sz w:val="20"/>
+          <w:szCs w:val="20"/>
+          <w:rtl w:val="0"/>
+        </w:rPr>
+        <w:t xml:space="preserve">Built a 5-surface, dev-grade design system</w:t>
+      </w:r>
+      <w:r>
+        <w:rPr>
+          <w:sz w:val="20"/>
+          <w:szCs w:val="20"/>
+          <w:rtl w:val="0"/>
+        </w:rPr>
+        <w:t xml:space="preserve">, published its first Claude Skill (</w:t>
+      </w:r>
+      <w:r>
+        <w:rPr>
+          <w:rFonts w:ascii="Roboto Mono" w:cs="Roboto Mono" w:eastAsia="Roboto Mono" w:hAnsi="Roboto Mono"/>
+          <w:sz w:val="20"/>
+          <w:szCs w:val="20"/>
+          <w:rtl w:val="0"/>
+        </w:rPr>
+        <w:t xml:space="preserve">audit-design-token-drift</w:t>
+      </w:r>
+      <w:r>
+        <w:rPr>
+          <w:sz w:val="20"/>
+          <w:szCs w:val="20"/>
+          <w:rtl w:val="0"/>
+        </w:rPr>
+        <w:t xml:space="preserve">) that catches design-token drift across canonical surfaces with file:line citations. Design system as dev tooling, not a Figma library nobody opens — </w:t>
+      </w:r>
+      <w:r>
+        <w:rPr>
+          <w:sz w:val="20"/>
+          <w:szCs w:val="20"/>
+          <w:rtl w:val="0"/>
+        </w:rPr>
+        <w:t xml:space="preserve">https://www.thios.co/design-system-architecture.html</w:t>
+      </w:r>
+      <w:r>
+        <w:rPr>
+          <w:rtl w:val="0"/>
+        </w:rPr>
+      </w:r>
+    </w:p>
+    <w:p>
+      <w:pPr>
+        <w:numPr>
+          <w:ilvl w:val="0"/>
+          <w:numId w:val="4"/>
         </w:numPr>
         <w:spacing w:after="240" w:before="0" w:beforeAutospacing="0" w:line="240" w:lineRule="auto"/>
-        <w:ind w:left="720" w:hanging="360"/>
-        <w:rPr>
-          <w:color w:val="434343"/>
-          <w:sz w:val="20"/>
-          <w:szCs w:val="20"/>
-          <w:u w:val="none"/>
-        </w:rPr>
-      </w:pPr>
-      <w:r>
-        <w:rPr>
-          <w:b w:val="1"/>
-          <w:bCs w:val="1"/>
-          <w:color w:val="434343"/>
-          <w:sz w:val="20"/>
-          <w:szCs w:val="20"/>
-          <w:rtl w:val="0"/>
-        </w:rPr>
-        <w:t xml:space="preserve">Open-hardware distribution under CERN-OHL-S v2: </w:t>
-      </w:r>
-      <w:r>
-        <w:rPr>
-          <w:color w:val="434343"/>
-          <w:sz w:val="20"/>
-          <w:szCs w:val="20"/>
-          <w:rtl w:val="0"/>
-        </w:rPr>
-        <w:t xml:space="preserve">license + builder tools route demand to local makers; share-alike modifications loop back into the CAD — capital-light scale without factories</w:t>
-        <w:br w:type="textWrapping"/>
+        <w:ind w:left="0" w:hanging="360"/>
+        <w:rPr>
+          <w:color w:val="434343"/>
+          <w:sz w:val="20"/>
+          <w:szCs w:val="20"/>
+        </w:rPr>
+      </w:pPr>
+      <w:r>
+        <w:rPr>
+          <w:b w:val="1"/>
+          <w:bCs w:val="1"/>
+          <w:sz w:val="20"/>
+          <w:szCs w:val="20"/>
+          <w:rtl w:val="0"/>
+        </w:rPr>
+        <w:t xml:space="preserve">Operate an end-to-end AI-native workflow</w:t>
+      </w:r>
+      <w:r>
+        <w:rPr>
+          <w:sz w:val="20"/>
+          <w:szCs w:val="20"/>
+          <w:rtl w:val="0"/>
+        </w:rPr>
+        <w:t xml:space="preserve"> (Claude, Cursor, Figma Make, Adobe Firefly, Obsidian) from research and IA through dev-ready handoff — agents implement while I own systems thinking, journey mapping, state coverage, and edge cases</w:t>
       </w:r>
       <w:r>
         <w:rPr>
@@ -213,142 +258,124 @@
         </w:rPr>
         <w:t xml:space="preserve"> | Aug 2020 - Jul 2024 </w:t>
         <w:br w:type="textWrapping"/>
-        <w:t xml:space="preserve">Embedded with product teams to modernize 20-year-old systems and drive subscription revenue. Proving enterprise design can move fast when you have the right frameworks.</w:t>
+      </w:r>
+      <w:r>
+        <w:rPr>
+          <w:sz w:val="24"/>
+          <w:szCs w:val="24"/>
+          <w:rtl w:val="0"/>
+        </w:rPr>
+        <w:t xml:space="preserve">Embedded with product teams to modernize 20-year-old systems and drive subscription revenue across connected agricultural equipment. Proving enterprise design can move fast with the right frameworks.</w:t>
+      </w:r>
+      <w:r>
+        <w:rPr>
+          <w:rtl w:val="0"/>
+        </w:rPr>
       </w:r>
     </w:p>
     <w:p>
       <w:pPr>
         <w:numPr>
           <w:ilvl w:val="0"/>
-          <w:numId w:val="2"/>
+          <w:numId w:val="4"/>
         </w:numPr>
         <w:spacing w:after="0" w:afterAutospacing="0" w:before="240" w:line="240" w:lineRule="auto"/>
-        <w:ind w:left="720" w:hanging="360"/>
-        <w:rPr>
-          <w:color w:val="434343"/>
-          <w:sz w:val="20"/>
-          <w:szCs w:val="20"/>
-        </w:rPr>
-      </w:pPr>
-      <w:r>
-        <w:rPr>
-          <w:b w:val="1"/>
-          <w:bCs w:val="1"/>
-          <w:color w:val="434343"/>
-          <w:sz w:val="20"/>
-          <w:szCs w:val="20"/>
-          <w:rtl w:val="0"/>
-        </w:rPr>
-        <w:t xml:space="preserve">Redesigned license management system</w:t>
-      </w:r>
-      <w:r>
-        <w:rPr>
-          <w:color w:val="434343"/>
-          <w:sz w:val="20"/>
-          <w:szCs w:val="20"/>
-          <w:rtl w:val="0"/>
-        </w:rPr>
-        <w:t xml:space="preserve"> serving 500K+ users across 12 languages—increased authenticated engagement 34%, reduced support tickets 16%, enabled $3.8B in subscription revenue from Automation and AI services</w:t>
-        <w:br w:type="textWrapping"/>
-      </w:r>
-      <w:r>
-        <w:rPr>
-          <w:rtl w:val="0"/>
-        </w:rPr>
+        <w:ind w:left="0" w:hanging="360"/>
+        <w:rPr>
+          <w:color w:val="434343"/>
+          <w:sz w:val="20"/>
+          <w:szCs w:val="20"/>
+        </w:rPr>
+      </w:pPr>
+      <w:r>
+        <w:rPr>
+          <w:b w:val="1"/>
+          <w:bCs w:val="1"/>
+          <w:color w:val="434343"/>
+          <w:sz w:val="20"/>
+          <w:szCs w:val="20"/>
+          <w:rtl w:val="0"/>
+        </w:rPr>
+        <w:t xml:space="preserve">Redesigned the license management system</w:t>
+      </w:r>
+      <w:r>
+        <w:rPr>
+          <w:color w:val="434343"/>
+          <w:sz w:val="20"/>
+          <w:szCs w:val="20"/>
+          <w:rtl w:val="0"/>
+        </w:rPr>
+        <w:t xml:space="preserve"> for connected ag equipment (Automation/AI services) serving 500K+ users across 12 languages — mapped flows, license states, and edge cases (expired/renewed/transferred/dealer-managed); +34% authenticated engagement, –16% support tickets, enabled $3.8B in subscription revenue</w:t>
       </w:r>
     </w:p>
     <w:p>
       <w:pPr>
         <w:numPr>
           <w:ilvl w:val="0"/>
-          <w:numId w:val="2"/>
+          <w:numId w:val="4"/>
         </w:numPr>
         <w:spacing w:after="0" w:afterAutospacing="0" w:before="0" w:beforeAutospacing="0" w:line="240" w:lineRule="auto"/>
-        <w:ind w:left="720" w:hanging="360"/>
-        <w:rPr>
-          <w:color w:val="434343"/>
-          <w:sz w:val="20"/>
-          <w:szCs w:val="20"/>
-        </w:rPr>
-      </w:pPr>
-      <w:r>
-        <w:rPr>
-          <w:b w:val="1"/>
-          <w:bCs w:val="1"/>
-          <w:color w:val="434343"/>
-          <w:sz w:val="20"/>
-          <w:szCs w:val="20"/>
-          <w:rtl w:val="0"/>
-        </w:rPr>
-        <w:t xml:space="preserve">Built unified account and navigation framework</w:t>
-      </w:r>
-      <w:r>
-        <w:rPr>
-          <w:color w:val="434343"/>
-          <w:sz w:val="20"/>
-          <w:szCs w:val="20"/>
-          <w:rtl w:val="0"/>
-        </w:rPr>
-        <w:t xml:space="preserve"> deployed across 8 product lines (web, mobile, embedded)—consolidated fragmented experiences into single customer view, improved dealer support efficiency 28%</w:t>
-        <w:br w:type="textWrapping"/>
-      </w:r>
-      <w:r>
-        <w:rPr>
-          <w:rtl w:val="0"/>
-        </w:rPr>
+        <w:ind w:left="0" w:hanging="360"/>
+        <w:rPr>
+          <w:color w:val="434343"/>
+          <w:sz w:val="20"/>
+          <w:szCs w:val="20"/>
+        </w:rPr>
+      </w:pPr>
+      <w:r>
+        <w:rPr>
+          <w:b w:val="1"/>
+          <w:bCs w:val="1"/>
+          <w:color w:val="434343"/>
+          <w:sz w:val="20"/>
+          <w:szCs w:val="20"/>
+          <w:rtl w:val="0"/>
+        </w:rPr>
+        <w:t xml:space="preserve">Built a unified account and navigation framework</w:t>
+      </w:r>
+      <w:r>
+        <w:rPr>
+          <w:color w:val="434343"/>
+          <w:sz w:val="20"/>
+          <w:szCs w:val="20"/>
+          <w:rtl w:val="0"/>
+        </w:rPr>
+        <w:t xml:space="preserve"> deployed across 8 product lines spanning web, mobile, and embedded equipment systems — consolidated fragmented experiences into a single customer view; +28% dealer support efficiency</w:t>
       </w:r>
     </w:p>
     <w:p>
       <w:pPr>
         <w:numPr>
           <w:ilvl w:val="0"/>
-          <w:numId w:val="2"/>
+          <w:numId w:val="4"/>
         </w:numPr>
         <w:spacing w:after="240" w:before="0" w:beforeAutospacing="0" w:line="240" w:lineRule="auto"/>
-        <w:ind w:left="720" w:hanging="360"/>
-        <w:rPr>
-          <w:color w:val="434343"/>
-          <w:sz w:val="20"/>
-          <w:szCs w:val="20"/>
-        </w:rPr>
-      </w:pPr>
-      <w:r>
-        <w:rPr>
-          <w:rFonts w:ascii="Roboto" w:cs="Roboto" w:eastAsia="Roboto" w:hAnsi="Roboto"/>
-          <w:b w:val="1"/>
-          <w:bCs w:val="1"/>
-          <w:color w:val="141413"/>
-          <w:sz w:val="21"/>
-          <w:szCs w:val="21"/>
-          <w:highlight w:val="white"/>
-          <w:rtl w:val="0"/>
-        </w:rPr>
-        <w:t xml:space="preserve">Core contributor</w:t>
-      </w:r>
-      <w:r>
-        <w:rPr>
-          <w:rFonts w:ascii="Roboto" w:cs="Roboto" w:eastAsia="Roboto" w:hAnsi="Roboto"/>
-          <w:color w:val="141413"/>
-          <w:sz w:val="21"/>
-          <w:szCs w:val="21"/>
-          <w:highlight w:val="white"/>
-          <w:rtl w:val="0"/>
-        </w:rPr>
-        <w:t xml:space="preserve"> to enterprise design system in Figma spanning 6 brands</w:t>
-      </w:r>
-      <w:r>
-        <w:rPr>
-          <w:color w:val="434343"/>
-          <w:sz w:val="20"/>
-          <w:szCs w:val="20"/>
-          <w:rtl w:val="0"/>
-        </w:rPr>
-        <w:t xml:space="preserve"> and 40+ product teams globally—reduced design-to-development handoff time 45% through standardized components that actually shipped</w:t>
-      </w:r>
-      <w:r>
-        <w:rPr>
-          <w:rtl w:val="0"/>
-        </w:rPr>
+        <w:ind w:left="0" w:hanging="360"/>
+        <w:rPr>
+          <w:color w:val="434343"/>
+          <w:sz w:val="20"/>
+          <w:szCs w:val="20"/>
+        </w:rPr>
+      </w:pPr>
+      <w:r>
+        <w:rPr>
+          <w:b w:val="1"/>
+          <w:bCs w:val="1"/>
+          <w:color w:val="434343"/>
+          <w:sz w:val="20"/>
+          <w:szCs w:val="20"/>
+          <w:rtl w:val="0"/>
+        </w:rPr>
+        <w:t xml:space="preserve">Core contributor to the enterprise design system in Figma</w:t>
+      </w:r>
+      <w:r>
+        <w:rPr>
+          <w:color w:val="434343"/>
+          <w:sz w:val="20"/>
+          <w:szCs w:val="20"/>
+          <w:rtl w:val="0"/>
+        </w:rPr>
+        <w:t xml:space="preserve"> spanning 6 brands and 40+ product teams globally — produced dev-ready handoffs (tokens, prop specs, full state coverage) that reduced design-to-development time 45% on components that actually shipped</w:t>
       </w:r>
     </w:p>
     <w:p>
@@ -363,7 +390,6 @@
           <w:bCs w:val="1"/>
           <w:rtl w:val="0"/>
         </w:rPr>
-        <w:br w:type="textWrapping"/>
         <w:t xml:space="preserve">FOURKITES | Lead UX / Manager</w:t>
       </w:r>
       <w:r>
@@ -372,23 +398,20 @@
         </w:rPr>
         <w:t xml:space="preserve"> | Jan 2017 - Jan 2020</w:t>
         <w:br w:type="textWrapping"/>
-        <w:t xml:space="preserve">Employee #28 during hypergrowth, $3M to $100M ARR (</w:t>
-      </w:r>
-      <w:r>
-        <w:rPr>
-          <w:color w:val="333333"/>
+      </w:r>
+      <w:r>
+        <w:rPr>
+          <w:rFonts w:ascii="Arial Unicode MS" w:cs="Arial Unicode MS" w:eastAsia="Arial Unicode MS" w:hAnsi="Arial Unicode MS"/>
           <w:sz w:val="24"/>
           <w:szCs w:val="24"/>
-          <w:shd w:fill="fafafa" w:val="clear"/>
-          <w:rtl w:val="0"/>
-        </w:rPr>
-        <w:t xml:space="preserve">$1B+ valuation</w:t>
-      </w:r>
-      <w:r>
-        <w:rPr>
-          <w:rtl w:val="0"/>
-        </w:rPr>
-        <w:t xml:space="preserve">). Built design function from scratch—founding designer to 10-person global team.</w:t>
+          <w:rtl w:val="0"/>
+        </w:rPr>
+        <w:t xml:space="preserve">Employee #28 during hypergrowth, $3M → $100M ARR ($1B+ valuation). Built the design function from scratch — founding designer to a 10-person global team.</w:t>
+      </w:r>
+      <w:r>
+        <w:rPr>
+          <w:rtl w:val="0"/>
+        </w:rPr>
       </w:r>
     </w:p>
     <w:p>
@@ -398,11 +421,9 @@
           <w:numId w:val="1"/>
         </w:numPr>
         <w:spacing w:after="0" w:afterAutospacing="0" w:before="240" w:line="240" w:lineRule="auto"/>
-        <w:ind w:left="720" w:hanging="360"/>
-        <w:rPr>
-          <w:color w:val="434343"/>
-          <w:sz w:val="20"/>
-          <w:szCs w:val="20"/>
+        <w:ind w:left="0" w:hanging="360"/>
+        <w:rPr>
+          <w:color w:val="434343"/>
         </w:rPr>
       </w:pPr>
       <w:r>
@@ -415,16 +436,16 @@
           <w:szCs w:val="20"/>
           <w:rtl w:val="0"/>
         </w:rPr>
-        <w:t xml:space="preserve">Designed flagship products from 0→1</w:t>
-      </w:r>
-      <w:r>
-        <w:rPr>
-          <w:color w:val="434343"/>
-          <w:sz w:val="20"/>
-          <w:szCs w:val="20"/>
-          <w:rtl w:val="0"/>
-        </w:rPr>
-        <w:t xml:space="preserve">: Real-time supply chain control tower and related mobile apps processing 10M+ daily tracking events for 30+ Fortune 2000 companies (Anheuser-Busch, Georgia-Pacific, Tyson); products became primary driver of 3x customer expansion</w:t>
+        <w:t xml:space="preserve">Designed flagship IoT asset-tracking platform 0→1 </w:t>
+      </w:r>
+      <w:r>
+        <w:rPr>
+          <w:color w:val="434343"/>
+          <w:sz w:val="20"/>
+          <w:szCs w:val="20"/>
+          <w:rtl w:val="0"/>
+        </w:rPr>
+        <w:t xml:space="preserve">— real-time supply chain control tower (web) and mobile apps processing 10M+ daily GPS/telematics events for 30+ Fortune 2000 customers (Anheuser-Busch, Georgia-Pacific, Tyson); high-density dashboards with map, list, and timeline views became the primary driver of 3x customer expansion</w:t>
       </w:r>
     </w:p>
     <w:p>
@@ -434,32 +455,30 @@
           <w:numId w:val="1"/>
         </w:numPr>
         <w:spacing w:after="0" w:afterAutospacing="0" w:before="0" w:beforeAutospacing="0" w:line="240" w:lineRule="auto"/>
-        <w:ind w:left="720" w:hanging="360"/>
-        <w:rPr>
-          <w:color w:val="434343"/>
-          <w:sz w:val="20"/>
-          <w:szCs w:val="20"/>
-        </w:rPr>
-      </w:pPr>
-      <w:r>
-        <w:rPr>
-          <w:b w:val="1"/>
-          <w:bCs w:val="1"/>
-          <w:color w:val="434343"/>
-          <w:sz w:val="20"/>
-          <w:szCs w:val="20"/>
-          <w:rtl w:val="0"/>
-        </w:rPr>
-        <w:t xml:space="preserve">Led bespoke predictive analytics dashboard products</w:t>
-      </w:r>
-      <w:r>
-        <w:rPr>
-          <w:color w:val="434343"/>
-          <w:sz w:val="20"/>
-          <w:szCs w:val="20"/>
-          <w:rtl w:val="0"/>
-        </w:rPr>
-        <w:t xml:space="preserve"> identifying shipment delays 6-12 hours earlier than competitors; increased customer retention 41% and expanded average contract value $120K annually</w:t>
+        <w:ind w:left="0" w:hanging="360"/>
+        <w:rPr>
+          <w:color w:val="434343"/>
+        </w:rPr>
+      </w:pPr>
+      <w:r>
+        <w:rPr>
+          <w:b w:val="1"/>
+          <w:bCs w:val="1"/>
+          <w:color w:val="434343"/>
+          <w:sz w:val="20"/>
+          <w:szCs w:val="20"/>
+          <w:rtl w:val="0"/>
+        </w:rPr>
+        <w:t xml:space="preserve">Led predictive analytics dashboards</w:t>
+      </w:r>
+      <w:r>
+        <w:rPr>
+          <w:color w:val="434343"/>
+          <w:sz w:val="20"/>
+          <w:szCs w:val="20"/>
+          <w:rtl w:val="0"/>
+        </w:rPr>
+        <w:t xml:space="preserve"> (data viz, anomaly states, alerting workflows) that identified shipment delays 6–12 hours earlier than competitors; +41% retention, +$120K avg ACV</w:t>
       </w:r>
     </w:p>
     <w:p>
@@ -469,50 +488,30 @@
           <w:numId w:val="1"/>
         </w:numPr>
         <w:spacing w:after="240" w:before="0" w:beforeAutospacing="0" w:line="240" w:lineRule="auto"/>
-        <w:ind w:left="720" w:hanging="360"/>
-        <w:rPr>
-          <w:color w:val="434343"/>
-        </w:rPr>
-      </w:pPr>
-      <w:r>
-        <w:rPr>
-          <w:b w:val="1"/>
-          <w:bCs w:val="1"/>
-          <w:color w:val="434343"/>
-          <w:sz w:val="20"/>
-          <w:szCs w:val="20"/>
-          <w:rtl w:val="0"/>
-        </w:rPr>
-        <w:t xml:space="preserve">Scaled design org</w:t>
-      </w:r>
-      <w:r>
-        <w:rPr>
-          <w:color w:val="434343"/>
-          <w:sz w:val="20"/>
-          <w:szCs w:val="20"/>
-          <w:rtl w:val="0"/>
-        </w:rPr>
-        <w:t xml:space="preserve">: Hired and managed team across Chicago and Chennai; established component library, design operations, and hiring framework—reduced design inconsistencies 65% while maintaining startup velocity</w:t>
-      </w:r>
-      <w:r>
-        <w:rPr>
-          <w:rtl w:val="0"/>
-        </w:rPr>
-      </w:r>
-    </w:p>
-    <w:p>
-      <w:pPr>
-        <w:spacing w:after="240" w:before="240" w:line="240" w:lineRule="auto"/>
-        <w:ind w:left="-540.0000000000001" w:right="-623.3333333333348" w:firstLine="0"/>
-        <w:rPr>
-          <w:b w:val="1"/>
-          <w:bCs w:val="1"/>
-        </w:rPr>
-      </w:pPr>
-      <w:r>
-        <w:rPr>
-          <w:rtl w:val="0"/>
-        </w:rPr>
+        <w:ind w:left="0" w:hanging="360"/>
+        <w:rPr>
+          <w:color w:val="434343"/>
+        </w:rPr>
+      </w:pPr>
+      <w:r>
+        <w:rPr>
+          <w:b w:val="1"/>
+          <w:bCs w:val="1"/>
+          <w:color w:val="434343"/>
+          <w:sz w:val="20"/>
+          <w:szCs w:val="20"/>
+          <w:rtl w:val="0"/>
+        </w:rPr>
+        <w:t xml:space="preserve">Scaled the design org across Chicago and Chennai </w:t>
+      </w:r>
+      <w:r>
+        <w:rPr>
+          <w:color w:val="434343"/>
+          <w:sz w:val="20"/>
+          <w:szCs w:val="20"/>
+          <w:rtl w:val="0"/>
+        </w:rPr>
+        <w:t xml:space="preserve">embedded in engineering sprint cadence; established component library, design ops, and hiring framework — –65% design inconsistencies while maintaining startup velocity</w:t>
       </w:r>
     </w:p>
     <w:p>
@@ -527,14 +526,6 @@
           <w:bCs w:val="1"/>
           <w:rtl w:val="0"/>
         </w:rPr>
-        <w:br w:type="textWrapping"/>
-      </w:r>
-      <w:r>
-        <w:rPr>
-          <w:b w:val="1"/>
-          <w:bCs w:val="1"/>
-          <w:rtl w:val="0"/>
-        </w:rPr>
         <w:t xml:space="preserve">MAVENWAVE PARTNERS | Senior UX + Agile Lead (Consultant)</w:t>
       </w:r>
       <w:r>
@@ -543,7 +534,372 @@
         </w:rPr>
         <w:t xml:space="preserve"> | Jan 2014 - Jan 2017 </w:t>
         <w:br w:type="textWrapping"/>
-        <w:t xml:space="preserve">Led digital product design for Fortune 500 healthcare and pharmaceutical clients. Fast iteration in slow-moving industries.</w:t>
+      </w:r>
+      <w:r>
+        <w:rPr>
+          <w:sz w:val="24"/>
+          <w:szCs w:val="24"/>
+          <w:rtl w:val="0"/>
+        </w:rPr>
+        <w:t xml:space="preserve">Led digital product design for Fortune 500 healthcare and pharma clients. Fast iteration in slow-moving industries.</w:t>
+      </w:r>
+      <w:r>
+        <w:rPr>
+          <w:rtl w:val="0"/>
+        </w:rPr>
+      </w:r>
+    </w:p>
+    <w:p>
+      <w:pPr>
+        <w:numPr>
+          <w:ilvl w:val="0"/>
+          <w:numId w:val="5"/>
+        </w:numPr>
+        <w:spacing w:after="0" w:afterAutospacing="0" w:before="240" w:line="240" w:lineRule="auto"/>
+        <w:ind w:left="0" w:hanging="360"/>
+        <w:rPr>
+          <w:color w:val="434343"/>
+          <w:sz w:val="20"/>
+          <w:szCs w:val="20"/>
+        </w:rPr>
+      </w:pPr>
+      <w:r>
+        <w:rPr>
+          <w:b w:val="1"/>
+          <w:bCs w:val="1"/>
+          <w:color w:val="434343"/>
+          <w:sz w:val="20"/>
+          <w:szCs w:val="20"/>
+          <w:rtl w:val="0"/>
+        </w:rPr>
+        <w:t xml:space="preserve">Designed 6 internal portals for AbbVie</w:t>
+      </w:r>
+      <w:r>
+        <w:rPr>
+          <w:color w:val="434343"/>
+          <w:sz w:val="20"/>
+          <w:szCs w:val="20"/>
+          <w:rtl w:val="0"/>
+        </w:rPr>
+        <w:t xml:space="preserve"> supporting 200K+ users across clinical trials and patient support programs — improved medication adherence tracking, –12% hospital readmissions</w:t>
+      </w:r>
+    </w:p>
+    <w:p>
+      <w:pPr>
+        <w:numPr>
+          <w:ilvl w:val="0"/>
+          <w:numId w:val="5"/>
+        </w:numPr>
+        <w:spacing w:after="0" w:afterAutospacing="0" w:before="0" w:beforeAutospacing="0" w:line="240" w:lineRule="auto"/>
+        <w:ind w:left="0" w:hanging="360"/>
+        <w:rPr>
+          <w:color w:val="434343"/>
+          <w:sz w:val="20"/>
+          <w:szCs w:val="20"/>
+        </w:rPr>
+      </w:pPr>
+      <w:r>
+        <w:rPr>
+          <w:color w:val="434343"/>
+          <w:sz w:val="20"/>
+          <w:szCs w:val="20"/>
+          <w:rtl w:val="0"/>
+        </w:rPr>
+        <w:t xml:space="preserve">Rebuilt OptumRx pharmacy formulary platform processing 1.4B prescriptions annually — created the company's first patient-facing product; –15% fulfillment errors via improved drug-interaction warnings</w:t>
+      </w:r>
+    </w:p>
+    <w:p>
+      <w:pPr>
+        <w:numPr>
+          <w:ilvl w:val="0"/>
+          <w:numId w:val="5"/>
+        </w:numPr>
+        <w:spacing w:after="240" w:before="0" w:beforeAutospacing="0" w:line="240" w:lineRule="auto"/>
+        <w:ind w:left="0" w:hanging="360"/>
+        <w:rPr>
+          <w:color w:val="434343"/>
+          <w:sz w:val="20"/>
+          <w:szCs w:val="20"/>
+        </w:rPr>
+      </w:pPr>
+      <w:r>
+        <w:rPr>
+          <w:b w:val="1"/>
+          <w:bCs w:val="1"/>
+          <w:color w:val="434343"/>
+          <w:sz w:val="20"/>
+          <w:szCs w:val="20"/>
+          <w:rtl w:val="0"/>
+        </w:rPr>
+        <w:t xml:space="preserve">Established Lean UX </w:t>
+      </w:r>
+      <w:r>
+        <w:rPr>
+          <w:color w:val="434343"/>
+          <w:sz w:val="20"/>
+          <w:szCs w:val="20"/>
+          <w:rtl w:val="0"/>
+        </w:rPr>
+        <w:t xml:space="preserve">and Agile/sprint-cadence practices across client engagements while mentoring junior designers and leading cross-functional design sprints</w:t>
+      </w:r>
+    </w:p>
+    <w:p>
+      <w:pPr>
+        <w:spacing w:line="240" w:lineRule="auto"/>
+        <w:ind w:hanging="540"/>
+        <w:rPr>
+          <w:i w:val="1"/>
+          <w:iCs w:val="1"/>
+          <w:color w:val="434343"/>
+          <w:sz w:val="20"/>
+          <w:szCs w:val="20"/>
+        </w:rPr>
+      </w:pPr>
+      <w:r>
+        <w:rPr>
+          <w:b w:val="1"/>
+          <w:bCs w:val="1"/>
+          <w:color w:val="434343"/>
+          <w:rtl w:val="0"/>
+        </w:rPr>
+        <w:t xml:space="preserve">NOKIA / HERE MAPS | </w:t>
+      </w:r>
+      <w:r>
+        <w:rPr>
+          <w:b w:val="1"/>
+          <w:bCs w:val="1"/>
+          <w:color w:val="434343"/>
+          <w:rtl w:val="0"/>
+        </w:rPr>
+        <w:t xml:space="preserve">Product Marketing Manager, HERE Traffic</w:t>
+      </w:r>
+      <w:r>
+        <w:rPr>
+          <w:color w:val="434343"/>
+          <w:rtl w:val="0"/>
+        </w:rPr>
+        <w:t xml:space="preserve"> | Aug 2012 - Jan 2014</w:t>
+      </w:r>
+      <w:r>
+        <w:rPr>
+          <w:rtl w:val="0"/>
+        </w:rPr>
+      </w:r>
+    </w:p>
+    <w:p>
+      <w:pPr>
+        <w:spacing w:line="276" w:lineRule="auto"/>
+        <w:ind w:left="-540" w:firstLine="0"/>
+        <w:rPr>
+          <w:color w:val="434343"/>
+          <w:sz w:val="8"/>
+          <w:szCs w:val="8"/>
+        </w:rPr>
+      </w:pPr>
+      <w:r>
+        <w:rPr>
+          <w:sz w:val="24"/>
+          <w:szCs w:val="24"/>
+          <w:rtl w:val="0"/>
+        </w:rPr>
+        <w:t xml:space="preserve">Product work across real-time vehicle-telematics data products and an open-source distributed computing project (DEMPSY, a Hadoop alternative).</w:t>
+      </w:r>
+      <w:r>
+        <w:rPr>
+          <w:rtl w:val="0"/>
+        </w:rPr>
+      </w:r>
+    </w:p>
+    <w:p>
+      <w:pPr>
+        <w:numPr>
+          <w:ilvl w:val="0"/>
+          <w:numId w:val="2"/>
+        </w:numPr>
+        <w:ind w:left="0" w:hanging="360"/>
+        <w:rPr>
+          <w:color w:val="434343"/>
+          <w:sz w:val="20"/>
+          <w:szCs w:val="20"/>
+        </w:rPr>
+      </w:pPr>
+      <w:r>
+        <w:rPr>
+          <w:b w:val="1"/>
+          <w:bCs w:val="1"/>
+          <w:color w:val="434343"/>
+          <w:sz w:val="20"/>
+          <w:szCs w:val="20"/>
+          <w:rtl w:val="0"/>
+        </w:rPr>
+        <w:t xml:space="preserve">Designed GPS probe visualizations</w:t>
+      </w:r>
+      <w:r>
+        <w:rPr>
+          <w:color w:val="434343"/>
+          <w:sz w:val="20"/>
+          <w:szCs w:val="20"/>
+          <w:rtl w:val="0"/>
+        </w:rPr>
+        <w:t xml:space="preserve"> and a probe viewer app for real-time connected-vehicle telematics analysis</w:t>
+      </w:r>
+    </w:p>
+    <w:p>
+      <w:pPr>
+        <w:numPr>
+          <w:ilvl w:val="0"/>
+          <w:numId w:val="2"/>
+        </w:numPr>
+        <w:ind w:left="0" w:hanging="360"/>
+        <w:rPr>
+          <w:color w:val="434343"/>
+          <w:sz w:val="20"/>
+          <w:szCs w:val="20"/>
+        </w:rPr>
+      </w:pPr>
+      <w:r>
+        <w:rPr>
+          <w:b w:val="1"/>
+          <w:bCs w:val="1"/>
+          <w:color w:val="434343"/>
+          <w:sz w:val="20"/>
+          <w:szCs w:val="20"/>
+          <w:rtl w:val="0"/>
+        </w:rPr>
+        <w:t xml:space="preserve">Wireframed and led project delivery for HERE Real-Time Traffic and Trapster app</w:t>
+      </w:r>
+      <w:r>
+        <w:rPr>
+          <w:color w:val="434343"/>
+          <w:sz w:val="20"/>
+          <w:szCs w:val="20"/>
+          <w:rtl w:val="0"/>
+        </w:rPr>
+        <w:t xml:space="preserve"> integrations across connected-vehicle data products</w:t>
+      </w:r>
+    </w:p>
+    <w:p>
+      <w:pPr>
+        <w:numPr>
+          <w:ilvl w:val="0"/>
+          <w:numId w:val="2"/>
+        </w:numPr>
+        <w:ind w:left="0" w:hanging="360"/>
+        <w:rPr>
+          <w:color w:val="434343"/>
+          <w:sz w:val="20"/>
+          <w:szCs w:val="20"/>
+        </w:rPr>
+      </w:pPr>
+      <w:r>
+        <w:rPr>
+          <w:b w:val="1"/>
+          <w:bCs w:val="1"/>
+          <w:color w:val="434343"/>
+          <w:sz w:val="20"/>
+          <w:szCs w:val="20"/>
+          <w:rtl w:val="0"/>
+        </w:rPr>
+        <w:t xml:space="preserve">Owned go-to-market for DEMPSY,</w:t>
+      </w:r>
+      <w:r>
+        <w:rPr>
+          <w:color w:val="434343"/>
+          <w:sz w:val="20"/>
+          <w:szCs w:val="20"/>
+          <w:rtl w:val="0"/>
+        </w:rPr>
+        <w:t xml:space="preserve"> an open-source distributed computing platform — early exposure to designing for developer audiences</w:t>
+      </w:r>
+    </w:p>
+    <w:p>
+      <w:pPr>
+        <w:spacing w:line="240" w:lineRule="auto"/>
+        <w:ind w:hanging="540"/>
+        <w:rPr>
+          <w:b w:val="1"/>
+          <w:bCs w:val="1"/>
+          <w:color w:val="434343"/>
+        </w:rPr>
+      </w:pPr>
+      <w:r>
+        <w:rPr>
+          <w:rtl w:val="0"/>
+        </w:rPr>
+      </w:r>
+    </w:p>
+    <w:p>
+      <w:pPr>
+        <w:spacing w:line="240" w:lineRule="auto"/>
+        <w:ind w:hanging="540"/>
+        <w:rPr>
+          <w:color w:val="434343"/>
+        </w:rPr>
+      </w:pPr>
+      <w:r>
+        <w:rPr>
+          <w:b w:val="1"/>
+          <w:bCs w:val="1"/>
+          <w:color w:val="434343"/>
+          <w:rtl w:val="0"/>
+        </w:rPr>
+        <w:t xml:space="preserve">GOGO INFLIGHT INTERNET | </w:t>
+      </w:r>
+      <w:r>
+        <w:rPr>
+          <w:b w:val="1"/>
+          <w:bCs w:val="1"/>
+          <w:color w:val="434343"/>
+          <w:rtl w:val="0"/>
+        </w:rPr>
+        <w:t xml:space="preserve">Product Manager - Signature Services</w:t>
+      </w:r>
+      <w:r>
+        <w:rPr>
+          <w:color w:val="434343"/>
+          <w:rtl w:val="0"/>
+        </w:rPr>
+        <w:t xml:space="preserve"> |</w:t>
+      </w:r>
+      <w:r>
+        <w:rPr>
+          <w:b w:val="1"/>
+          <w:bCs w:val="1"/>
+          <w:color w:val="434343"/>
+          <w:rtl w:val="0"/>
+        </w:rPr>
+        <w:t xml:space="preserve"> </w:t>
+      </w:r>
+      <w:r>
+        <w:rPr>
+          <w:color w:val="434343"/>
+          <w:rtl w:val="0"/>
+        </w:rPr>
+        <w:t xml:space="preserve">Apr 2008 - Aug 2012</w:t>
+      </w:r>
+    </w:p>
+    <w:p>
+      <w:pPr>
+        <w:spacing w:line="276" w:lineRule="auto"/>
+        <w:ind w:left="-540" w:firstLine="0"/>
+        <w:rPr>
+          <w:color w:val="434343"/>
+          <w:sz w:val="6"/>
+          <w:szCs w:val="6"/>
+        </w:rPr>
+      </w:pPr>
+      <w:r>
+        <w:rPr>
+          <w:sz w:val="24"/>
+          <w:szCs w:val="24"/>
+          <w:rtl w:val="0"/>
+        </w:rPr>
+        <w:t xml:space="preserve">Aerospace connectivity: launched in-flight internet across major US airlines — onboard hardware + Air-to-Ground RF network. $700M go-to-market.</w:t>
+      </w:r>
+      <w:r>
+        <w:rPr>
+          <w:rtl w:val="0"/>
+        </w:rPr>
       </w:r>
     </w:p>
     <w:p>
@@ -552,33 +908,32 @@
           <w:ilvl w:val="0"/>
           <w:numId w:val="3"/>
         </w:numPr>
-        <w:spacing w:after="0" w:afterAutospacing="0" w:before="240" w:line="240" w:lineRule="auto"/>
-        <w:ind w:left="720" w:hanging="360"/>
-        <w:rPr>
-          <w:color w:val="434343"/>
-          <w:sz w:val="20"/>
-          <w:szCs w:val="20"/>
-        </w:rPr>
-      </w:pPr>
-      <w:r>
-        <w:rPr>
-          <w:b w:val="1"/>
-          <w:bCs w:val="1"/>
-          <w:color w:val="434343"/>
-          <w:sz w:val="20"/>
-          <w:szCs w:val="20"/>
-          <w:rtl w:val="0"/>
-        </w:rPr>
-        <w:t xml:space="preserve">Designed 6 internal portals for AbbVie</w:t>
-      </w:r>
-      <w:r>
-        <w:rPr>
-          <w:color w:val="434343"/>
-          <w:sz w:val="20"/>
-          <w:szCs w:val="20"/>
-          <w:rtl w:val="0"/>
-        </w:rPr>
-        <w:t xml:space="preserve"> supporting 200K+ users across clinical trials and patient support programs—improved medication adherence tracking, reduced hospital readmissions 12%</w:t>
+        <w:ind w:left="0" w:hanging="360"/>
+        <w:rPr>
+          <w:color w:val="434343"/>
+          <w:sz w:val="20"/>
+          <w:szCs w:val="20"/>
+        </w:rPr>
+      </w:pPr>
+      <w:r>
+        <w:rPr>
+          <w:b w:val="1"/>
+          <w:bCs w:val="1"/>
+          <w:color w:val="434343"/>
+          <w:sz w:val="20"/>
+          <w:szCs w:val="20"/>
+          <w:rtl w:val="0"/>
+        </w:rPr>
+        <w:t xml:space="preserve">Owned airborne products and onboard hardware UX</w:t>
+      </w:r>
+      <w:r>
+        <w:rPr>
+          <w:color w:val="434343"/>
+          <w:sz w:val="20"/>
+          <w:szCs w:val="20"/>
+          <w:rtl w:val="0"/>
+        </w:rPr>
+        <w:t xml:space="preserve"> for major US airlines, including initial rollout testing across fleets</w:t>
       </w:r>
     </w:p>
     <w:p>
@@ -587,33 +942,32 @@
           <w:ilvl w:val="0"/>
           <w:numId w:val="3"/>
         </w:numPr>
-        <w:spacing w:after="0" w:afterAutospacing="0" w:before="0" w:beforeAutospacing="0" w:line="240" w:lineRule="auto"/>
-        <w:ind w:left="720" w:hanging="360"/>
-        <w:rPr>
-          <w:color w:val="434343"/>
-          <w:sz w:val="20"/>
-          <w:szCs w:val="20"/>
-        </w:rPr>
-      </w:pPr>
-      <w:r>
-        <w:rPr>
-          <w:b w:val="1"/>
-          <w:bCs w:val="1"/>
-          <w:color w:val="434343"/>
-          <w:sz w:val="20"/>
-          <w:szCs w:val="20"/>
-          <w:rtl w:val="0"/>
-        </w:rPr>
-        <w:t xml:space="preserve">Rebuilt OptumRx pharmacy formulary platform</w:t>
-      </w:r>
-      <w:r>
-        <w:rPr>
-          <w:color w:val="434343"/>
-          <w:sz w:val="20"/>
-          <w:szCs w:val="20"/>
-          <w:rtl w:val="0"/>
-        </w:rPr>
-        <w:t xml:space="preserve"> processing 1.4B prescriptions annually—created company's first patient-facing product, reduced fulfillment errors 15% through improved drug interaction warnings</w:t>
+        <w:ind w:left="0" w:hanging="360"/>
+        <w:rPr>
+          <w:color w:val="434343"/>
+          <w:sz w:val="20"/>
+          <w:szCs w:val="20"/>
+        </w:rPr>
+      </w:pPr>
+      <w:r>
+        <w:rPr>
+          <w:b w:val="1"/>
+          <w:bCs w:val="1"/>
+          <w:color w:val="434343"/>
+          <w:sz w:val="20"/>
+          <w:szCs w:val="20"/>
+          <w:rtl w:val="0"/>
+        </w:rPr>
+        <w:t xml:space="preserve">Authored FAA-approved documentation</w:t>
+      </w:r>
+      <w:r>
+        <w:rPr>
+          <w:color w:val="434343"/>
+          <w:sz w:val="20"/>
+          <w:szCs w:val="20"/>
+          <w:rtl w:val="0"/>
+        </w:rPr>
+        <w:t xml:space="preserve"> for business and commercial fleet Air-to-Ground (ATG) RF connectivity systems</w:t>
       </w:r>
     </w:p>
     <w:p>
@@ -622,33 +976,177 @@
           <w:ilvl w:val="0"/>
           <w:numId w:val="3"/>
         </w:numPr>
-        <w:spacing w:after="240" w:before="0" w:beforeAutospacing="0" w:line="240" w:lineRule="auto"/>
-        <w:ind w:left="720" w:hanging="360"/>
-        <w:rPr>
-          <w:color w:val="434343"/>
-          <w:sz w:val="20"/>
-          <w:szCs w:val="20"/>
-        </w:rPr>
-      </w:pPr>
-      <w:r>
-        <w:rPr>
-          <w:b w:val="1"/>
-          <w:bCs w:val="1"/>
-          <w:color w:val="434343"/>
-          <w:sz w:val="20"/>
-          <w:szCs w:val="20"/>
-          <w:rtl w:val="0"/>
-        </w:rPr>
-        <w:t xml:space="preserve">Established Lean UX and Agile practices</w:t>
-      </w:r>
-      <w:r>
-        <w:rPr>
-          <w:color w:val="434343"/>
-          <w:sz w:val="20"/>
-          <w:szCs w:val="20"/>
-          <w:rtl w:val="0"/>
-        </w:rPr>
-        <w:t xml:space="preserve"> across client engagements while mentoring junior designers and leading cross-functional design sprints</w:t>
+        <w:ind w:left="0" w:hanging="360"/>
+        <w:rPr>
+          <w:color w:val="434343"/>
+          <w:sz w:val="20"/>
+          <w:szCs w:val="20"/>
+        </w:rPr>
+      </w:pPr>
+      <w:r>
+        <w:rPr>
+          <w:rFonts w:ascii="Arial Unicode MS" w:cs="Arial Unicode MS" w:eastAsia="Arial Unicode MS" w:hAnsi="Arial Unicode MS"/>
+          <w:b w:val="1"/>
+          <w:bCs w:val="1"/>
+          <w:color w:val="434343"/>
+          <w:sz w:val="20"/>
+          <w:szCs w:val="20"/>
+          <w:rtl w:val="0"/>
+        </w:rPr>
+        <w:t xml:space="preserve">Designed an in-flight flight tracker 0→1 </w:t>
+      </w:r>
+      <w:r>
+        <w:rPr>
+          <w:color w:val="434343"/>
+          <w:sz w:val="20"/>
+          <w:szCs w:val="20"/>
+          <w:rtl w:val="0"/>
+        </w:rPr>
+        <w:t xml:space="preserve">(real-time positional data + passenger UX) that drove successful sponsorship deals</w:t>
+      </w:r>
+    </w:p>
+    <w:p>
+      <w:pPr>
+        <w:ind w:left="-630" w:right="0" w:firstLine="0"/>
+        <w:rPr>
+          <w:color w:val="434343"/>
+          <w:sz w:val="18"/>
+          <w:szCs w:val="18"/>
+        </w:rPr>
+      </w:pPr>
+      <w:r>
+        <w:rPr>
+          <w:color w:val="999999"/>
+          <w:sz w:val="20"/>
+          <w:szCs w:val="20"/>
+          <w:rtl w:val="0"/>
+        </w:rPr>
+        <w:br w:type="textWrapping"/>
+      </w:r>
+      <w:r>
+        <w:rPr>
+          <w:color w:val="999999"/>
+          <w:sz w:val="20"/>
+          <w:szCs w:val="20"/>
+          <w:rtl w:val="0"/>
+        </w:rPr>
+        <w:t xml:space="preserve">SKILLS</w:t>
+      </w:r>
+      <w:r>
+        <w:rPr>
+          <w:rtl w:val="0"/>
+        </w:rPr>
+      </w:r>
+    </w:p>
+    <w:p>
+      <w:pPr>
+        <w:ind w:left="0" w:hanging="630"/>
+        <w:rPr>
+          <w:sz w:val="18"/>
+          <w:szCs w:val="18"/>
+        </w:rPr>
+      </w:pPr>
+      <w:r>
+        <w:rPr>
+          <w:b w:val="1"/>
+          <w:bCs w:val="1"/>
+          <w:sz w:val="18"/>
+          <w:szCs w:val="18"/>
+          <w:rtl w:val="0"/>
+        </w:rPr>
+        <w:t xml:space="preserve">UX Systems:</w:t>
+      </w:r>
+      <w:r>
+        <w:rPr>
+          <w:sz w:val="18"/>
+          <w:szCs w:val="18"/>
+          <w:rtl w:val="0"/>
+        </w:rPr>
+        <w:t xml:space="preserve"> User flows · journey mapping · IA · interaction design · state management · edge-case coverage (idle/loading/success/error/empty) · information density · dashboards · enterprise design systems · design tokens · accessibility (WCAG 2.1)</w:t>
+      </w:r>
+    </w:p>
+    <w:p>
+      <w:pPr>
+        <w:ind w:left="0" w:hanging="630"/>
+        <w:rPr>
+          <w:sz w:val="18"/>
+          <w:szCs w:val="18"/>
+        </w:rPr>
+      </w:pPr>
+      <w:r>
+        <w:rPr>
+          <w:b w:val="1"/>
+          <w:bCs w:val="1"/>
+          <w:sz w:val="18"/>
+          <w:szCs w:val="18"/>
+          <w:rtl w:val="0"/>
+        </w:rPr>
+        <w:t xml:space="preserve">Research &amp; Methods:</w:t>
+      </w:r>
+      <w:r>
+        <w:rPr>
+          <w:sz w:val="18"/>
+          <w:szCs w:val="18"/>
+          <w:rtl w:val="0"/>
+        </w:rPr>
+        <w:t xml:space="preserve"> User interviews · usability testing · design sprints · Lean UX · Agile/Scrum sprint cadence · PRD/RFC participation</w:t>
+      </w:r>
+    </w:p>
+    <w:p>
+      <w:pPr>
+        <w:ind w:left="0" w:hanging="630"/>
+        <w:rPr>
+          <w:sz w:val="18"/>
+          <w:szCs w:val="18"/>
+        </w:rPr>
+      </w:pPr>
+      <w:r>
+        <w:rPr>
+          <w:b w:val="1"/>
+          <w:bCs w:val="1"/>
+          <w:sz w:val="18"/>
+          <w:szCs w:val="18"/>
+          <w:rtl w:val="0"/>
+        </w:rPr>
+        <w:t xml:space="preserve">AI-Native Workflow:</w:t>
+      </w:r>
+      <w:r>
+        <w:rPr>
+          <w:sz w:val="18"/>
+          <w:szCs w:val="18"/>
+          <w:rtl w:val="0"/>
+        </w:rPr>
+        <w:t xml:space="preserve"> Claude (incl. authoring custom Claude Skills) · Cursor · Figma Make · Adobe Firefly · Midjourney · Obsidian as knowledge base</w:t>
+      </w:r>
+    </w:p>
+    <w:p>
+      <w:pPr>
+        <w:ind w:left="0" w:hanging="630"/>
+        <w:rPr>
+          <w:b w:val="1"/>
+          <w:bCs w:val="1"/>
+          <w:color w:val="434343"/>
+          <w:sz w:val="18"/>
+          <w:szCs w:val="18"/>
+        </w:rPr>
+      </w:pPr>
+      <w:r>
+        <w:rPr>
+          <w:b w:val="1"/>
+          <w:bCs w:val="1"/>
+          <w:sz w:val="18"/>
+          <w:szCs w:val="18"/>
+          <w:rtl w:val="0"/>
+        </w:rPr>
+        <w:t xml:space="preserve">Tools:</w:t>
+      </w:r>
+      <w:r>
+        <w:rPr>
+          <w:sz w:val="18"/>
+          <w:szCs w:val="18"/>
+          <w:rtl w:val="0"/>
+        </w:rPr>
+        <w:t xml:space="preserve"> Figma · OnShape CAD · Blender 3D · HTML/CSS · Adobe Creative Suite</w:t>
       </w:r>
       <w:r>
         <w:rPr>
@@ -662,181 +1160,10 @@
         <w:jc w:val="both"/>
         <w:rPr>
           <w:color w:val="999999"/>
-        </w:rPr>
-      </w:pPr>
-      <w:r>
-        <w:rPr>
-          <w:rtl w:val="0"/>
-        </w:rPr>
-      </w:r>
-    </w:p>
-    <w:p>
-      <w:pPr>
-        <w:ind w:left="-630" w:right="0" w:firstLine="0"/>
-        <w:rPr>
-          <w:color w:val="434343"/>
-          <w:sz w:val="20"/>
-          <w:szCs w:val="20"/>
-        </w:rPr>
-      </w:pPr>
-      <w:r>
-        <w:rPr>
-          <w:color w:val="999999"/>
-          <w:rtl w:val="0"/>
-        </w:rPr>
-        <w:t xml:space="preserve">SKILLS</w:t>
-      </w:r>
-      <w:r>
-        <w:rPr>
-          <w:rtl w:val="0"/>
-        </w:rPr>
-      </w:r>
-    </w:p>
-    <w:p>
-      <w:pPr>
-        <w:rPr>
-          <w:b w:val="1"/>
-          <w:bCs w:val="1"/>
-          <w:color w:val="434343"/>
-        </w:rPr>
-      </w:pPr>
-      <w:r>
-        <w:rPr>
-          <w:b w:val="1"/>
-          <w:bCs w:val="1"/>
-          <w:color w:val="434343"/>
-          <w:rtl w:val="0"/>
-        </w:rPr>
-        <w:t xml:space="preserve">Design Leadership</w:t>
-      </w:r>
-    </w:p>
-    <w:p>
-      <w:pPr>
-        <w:ind w:left="360" w:firstLine="0"/>
-        <w:rPr>
-          <w:color w:val="999999"/>
-        </w:rPr>
-      </w:pPr>
-      <w:r>
-        <w:rPr>
-          <w:color w:val="434343"/>
-          <w:sz w:val="20"/>
-          <w:szCs w:val="20"/>
-          <w:rtl w:val="0"/>
-        </w:rPr>
-        <w:t xml:space="preserve">Enterprise Design Systems • Cross-functional Team Building • Design Operations • Information Architecture • Data Visualization • Accessibility (WCAG 2.1)</w:t>
-      </w:r>
-      <w:r>
-        <w:rPr>
-          <w:rtl w:val="0"/>
-        </w:rPr>
-      </w:r>
-    </w:p>
-    <w:p>
-      <w:pPr>
-        <w:ind w:left="-630" w:right="0" w:firstLine="0"/>
-        <w:rPr>
-          <w:color w:val="434343"/>
-          <w:sz w:val="8"/>
-          <w:szCs w:val="8"/>
-        </w:rPr>
-      </w:pPr>
-      <w:r>
-        <w:rPr>
-          <w:rtl w:val="0"/>
-        </w:rPr>
-      </w:r>
-    </w:p>
-    <w:p>
-      <w:pPr>
-        <w:rPr>
-          <w:b w:val="1"/>
-          <w:bCs w:val="1"/>
-          <w:color w:val="434343"/>
-        </w:rPr>
-      </w:pPr>
-      <w:r>
-        <w:rPr>
-          <w:b w:val="1"/>
-          <w:bCs w:val="1"/>
-          <w:color w:val="434343"/>
-          <w:rtl w:val="0"/>
-        </w:rPr>
-        <w:t xml:space="preserve">Research &amp; Strategy</w:t>
-      </w:r>
-    </w:p>
-    <w:p>
-      <w:pPr>
-        <w:ind w:left="360" w:firstLine="0"/>
-        <w:rPr>
-          <w:color w:val="999999"/>
-        </w:rPr>
-      </w:pPr>
-      <w:r>
-        <w:rPr>
-          <w:color w:val="434343"/>
-          <w:sz w:val="20"/>
-          <w:szCs w:val="20"/>
-          <w:rtl w:val="0"/>
-        </w:rPr>
-        <w:t xml:space="preserve">User Research • Usability Testing • Journey Mapping • Design Sprints • Lean UX • Agile/Scrum</w:t>
-      </w:r>
-      <w:r>
-        <w:rPr>
-          <w:rtl w:val="0"/>
-        </w:rPr>
-      </w:r>
-    </w:p>
-    <w:p>
-      <w:pPr>
-        <w:ind w:left="-630" w:right="0" w:firstLine="0"/>
-        <w:rPr>
-          <w:color w:val="434343"/>
-          <w:sz w:val="8"/>
-          <w:szCs w:val="8"/>
-        </w:rPr>
-      </w:pPr>
-      <w:r>
-        <w:rPr>
-          <w:rtl w:val="0"/>
-        </w:rPr>
-      </w:r>
-    </w:p>
-    <w:p>
-      <w:pPr>
-        <w:ind w:left="0" w:right="0" w:firstLine="0"/>
-        <w:rPr>
-          <w:b w:val="1"/>
-          <w:bCs w:val="1"/>
-          <w:color w:val="434343"/>
-        </w:rPr>
-      </w:pPr>
-      <w:r>
-        <w:rPr>
-          <w:b w:val="1"/>
-          <w:bCs w:val="1"/>
-          <w:color w:val="434343"/>
-          <w:rtl w:val="0"/>
-        </w:rPr>
-        <w:t xml:space="preserve">Tools</w:t>
-      </w:r>
-    </w:p>
-    <w:p>
-      <w:pPr>
-        <w:ind w:left="360" w:right="0" w:firstLine="0"/>
-        <w:rPr>
-          <w:color w:val="434343"/>
-        </w:rPr>
-      </w:pPr>
-      <w:r>
-        <w:rPr>
-          <w:color w:val="434343"/>
-          <w:sz w:val="20"/>
-          <w:szCs w:val="20"/>
-          <w:rtl w:val="0"/>
-        </w:rPr>
-        <w:t xml:space="preserve">Figma • Adobe Creative Suite • CAD/3D (OnShape) • HTML/CSS • AI Tools (Claude, Cursor) • Prototyping • AI-Augmented Workflows • AI-Integrated Design • Blender 3D</w:t>
-      </w:r>
+          <w:sz w:val="20"/>
+          <w:szCs w:val="20"/>
+        </w:rPr>
+      </w:pPr>
       <w:r>
         <w:rPr>
           <w:rtl w:val="0"/>
@@ -848,9 +1175,65 @@
         <w:ind w:left="-630" w:right="-720" w:firstLine="0"/>
         <w:jc w:val="both"/>
         <w:rPr>
+          <w:color w:val="666666"/>
+        </w:rPr>
+      </w:pPr>
+      <w:r>
+        <w:rPr>
           <w:color w:val="999999"/>
-        </w:rPr>
-      </w:pPr>
+          <w:sz w:val="20"/>
+          <w:szCs w:val="20"/>
+          <w:rtl w:val="0"/>
+        </w:rPr>
+        <w:t xml:space="preserve">EDUCATION</w:t>
+      </w:r>
+      <w:r>
+        <w:rPr>
+          <w:color w:val="999999"/>
+          <w:rtl w:val="0"/>
+        </w:rPr>
+        <w:t xml:space="preserve">: </w:t>
+      </w:r>
+      <w:r>
+        <w:rPr>
+          <w:b w:val="1"/>
+          <w:bCs w:val="1"/>
+          <w:color w:val="434343"/>
+          <w:sz w:val="20"/>
+          <w:szCs w:val="20"/>
+          <w:rtl w:val="0"/>
+        </w:rPr>
+        <w:t xml:space="preserve">Arizona State University</w:t>
+      </w:r>
+      <w:r>
+        <w:rPr>
+          <w:color w:val="434343"/>
+          <w:sz w:val="20"/>
+          <w:szCs w:val="20"/>
+          <w:rtl w:val="0"/>
+        </w:rPr>
+        <w:t xml:space="preserve"> </w:t>
+      </w:r>
+      <w:r>
+        <w:rPr>
+          <w:b w:val="1"/>
+          <w:bCs w:val="1"/>
+          <w:color w:val="434343"/>
+          <w:sz w:val="20"/>
+          <w:szCs w:val="20"/>
+          <w:rtl w:val="0"/>
+        </w:rPr>
+        <w:t xml:space="preserve">| </w:t>
+      </w:r>
+      <w:r>
+        <w:rPr>
+          <w:color w:val="434343"/>
+          <w:sz w:val="20"/>
+          <w:szCs w:val="20"/>
+          <w:rtl w:val="0"/>
+        </w:rPr>
+        <w:t xml:space="preserve">Bachelor of Arts, Humanities and Architectural Theory</w:t>
+      </w:r>
       <w:r>
         <w:rPr>
           <w:rtl w:val="0"/>
@@ -870,111 +1253,31 @@
       <w:r>
         <w:rPr>
           <w:color w:val="999999"/>
-          <w:rtl w:val="0"/>
-        </w:rPr>
-        <w:t xml:space="preserve">EDUCATION</w:t>
-        <w:br w:type="textWrapping"/>
-      </w:r>
-      <w:r>
-        <w:rPr>
-          <w:b w:val="1"/>
-          <w:bCs w:val="1"/>
-          <w:color w:val="434343"/>
-          <w:sz w:val="20"/>
-          <w:szCs w:val="20"/>
-          <w:rtl w:val="0"/>
-        </w:rPr>
-        <w:t xml:space="preserve">Arizona State University</w:t>
-      </w:r>
-      <w:r>
-        <w:rPr>
-          <w:color w:val="434343"/>
-          <w:sz w:val="20"/>
-          <w:szCs w:val="20"/>
-          <w:rtl w:val="0"/>
-        </w:rPr>
-        <w:t xml:space="preserve"> </w:t>
-      </w:r>
-      <w:r>
-        <w:rPr>
-          <w:b w:val="1"/>
-          <w:bCs w:val="1"/>
-          <w:color w:val="434343"/>
-          <w:sz w:val="20"/>
-          <w:szCs w:val="20"/>
-          <w:rtl w:val="0"/>
-        </w:rPr>
-        <w:t xml:space="preserve">| </w:t>
-      </w:r>
-      <w:r>
-        <w:rPr>
-          <w:color w:val="434343"/>
-          <w:sz w:val="20"/>
-          <w:szCs w:val="20"/>
-          <w:rtl w:val="0"/>
-        </w:rPr>
-        <w:t xml:space="preserve">Bachelor of Arts, Humanities and Architectural Theory</w:t>
-      </w:r>
-    </w:p>
-    <w:p>
-      <w:pPr>
-        <w:ind w:left="-630" w:right="-720" w:firstLine="0"/>
-        <w:jc w:val="both"/>
-        <w:rPr>
-          <w:color w:val="666666"/>
-        </w:rPr>
-      </w:pPr>
-      <w:r>
-        <w:rPr>
-          <w:rtl w:val="0"/>
-        </w:rPr>
-      </w:r>
-    </w:p>
-    <w:p>
-      <w:pPr>
-        <w:ind w:left="-630" w:right="-720" w:firstLine="0"/>
-        <w:jc w:val="both"/>
-        <w:rPr>
-          <w:color w:val="999999"/>
-        </w:rPr>
-      </w:pPr>
-      <w:r>
-        <w:rPr>
-          <w:color w:val="999999"/>
-          <w:rtl w:val="0"/>
-        </w:rPr>
-        <w:t xml:space="preserve">COMMUNITY</w:t>
-      </w:r>
-    </w:p>
-    <w:p>
-      <w:pPr>
-        <w:ind w:left="-630" w:right="-720" w:firstLine="0"/>
-        <w:jc w:val="both"/>
-        <w:rPr>
-          <w:color w:val="434343"/>
-          <w:sz w:val="20"/>
-          <w:szCs w:val="20"/>
-        </w:rPr>
-      </w:pPr>
-      <w:r>
-        <w:rPr>
-          <w:b w:val="1"/>
-          <w:bCs w:val="1"/>
-          <w:color w:val="434343"/>
-          <w:sz w:val="20"/>
-          <w:szCs w:val="20"/>
-          <w:rtl w:val="0"/>
-        </w:rPr>
-        <w:t xml:space="preserve">Board Director | </w:t>
-      </w:r>
-      <w:r>
-        <w:rPr>
-          <w:color w:val="434343"/>
-          <w:sz w:val="20"/>
-          <w:szCs w:val="20"/>
-          <w:rtl w:val="0"/>
-        </w:rPr>
-        <w:t xml:space="preserve">How Weird Street Faire 501(c)(3) SF street fair with successful 20 year run (2004 - 2024)</w:t>
+          <w:sz w:val="20"/>
+          <w:szCs w:val="20"/>
+          <w:rtl w:val="0"/>
+        </w:rPr>
+        <w:t xml:space="preserve">COMMUNITY: </w:t>
+      </w:r>
+      <w:r>
+        <w:rPr>
+          <w:b w:val="1"/>
+          <w:bCs w:val="1"/>
+          <w:color w:val="434343"/>
+          <w:sz w:val="20"/>
+          <w:szCs w:val="20"/>
+          <w:rtl w:val="0"/>
+        </w:rPr>
+        <w:t xml:space="preserve">Member, Board of Directors | </w:t>
+      </w:r>
+      <w:r>
+        <w:rPr>
+          <w:color w:val="434343"/>
+          <w:sz w:val="20"/>
+          <w:szCs w:val="20"/>
+          <w:rtl w:val="0"/>
+        </w:rPr>
+        <w:t xml:space="preserve">How Weird Street Faire 501(c)(3) San Francisco Street Fair 2000 - 2024</w:t>
       </w:r>
     </w:p>
     <w:sectPr>
@@ -1419,6 +1722,226 @@
       </w:rPr>
     </w:lvl>
   </w:abstractNum>
+  <w:abstractNum w:abstractNumId="4">
+    <w:lvl w:ilvl="0">
+      <w:start w:val="1"/>
+      <w:numFmt w:val="bullet"/>
+      <w:lvlText w:val="●"/>
+      <w:lvlJc w:val="left"/>
+      <w:pPr>
+        <w:ind w:left="720" w:hanging="360"/>
+      </w:pPr>
+      <w:rPr>
+        <w:u w:val="none"/>
+      </w:rPr>
+    </w:lvl>
+    <w:lvl w:ilvl="1">
+      <w:start w:val="1"/>
+      <w:numFmt w:val="bullet"/>
+      <w:lvlText w:val="○"/>
+      <w:lvlJc w:val="left"/>
+      <w:pPr>
+        <w:ind w:left="1440" w:hanging="360"/>
+      </w:pPr>
+      <w:rPr>
+        <w:u w:val="none"/>
+      </w:rPr>
+    </w:lvl>
+    <w:lvl w:ilvl="2">
+      <w:start w:val="1"/>
+      <w:numFmt w:val="bullet"/>
+      <w:lvlText w:val="■"/>
+      <w:lvlJc w:val="left"/>
+      <w:pPr>
+        <w:ind w:left="2160" w:hanging="360"/>
+      </w:pPr>
+      <w:rPr>
+        <w:u w:val="none"/>
+      </w:rPr>
+    </w:lvl>
+    <w:lvl w:ilvl="3">
+      <w:start w:val="1"/>
+      <w:numFmt w:val="bullet"/>
+      <w:lvlText w:val="●"/>
+      <w:lvlJc w:val="left"/>
+      <w:pPr>
+        <w:ind w:left="2880" w:hanging="360"/>
+      </w:pPr>
+      <w:rPr>
+        <w:u w:val="none"/>
+      </w:rPr>
+    </w:lvl>
+    <w:lvl w:ilvl="4">
+      <w:start w:val="1"/>
+      <w:numFmt w:val="bullet"/>
+      <w:lvlText w:val="○"/>
+      <w:lvlJc w:val="left"/>
+      <w:pPr>
+        <w:ind w:left="3600" w:hanging="360"/>
+      </w:pPr>
+      <w:rPr>
+        <w:u w:val="none"/>
+      </w:rPr>
+    </w:lvl>
+    <w:lvl w:ilvl="5">
+      <w:start w:val="1"/>
+      <w:numFmt w:val="bullet"/>
+      <w:lvlText w:val="■"/>
+      <w:lvlJc w:val="left"/>
+      <w:pPr>
+        <w:ind w:left="4320" w:hanging="360"/>
+      </w:pPr>
+      <w:rPr>
+        <w:u w:val="none"/>
+      </w:rPr>
+    </w:lvl>
+    <w:lvl w:ilvl="6">
+      <w:start w:val="1"/>
+      <w:numFmt w:val="bullet"/>
+      <w:lvlText w:val="●"/>
+      <w:lvlJc w:val="left"/>
+      <w:pPr>
+        <w:ind w:left="5040" w:hanging="360"/>
+      </w:pPr>
+      <w:rPr>
+        <w:u w:val="none"/>
+      </w:rPr>
+    </w:lvl>
+    <w:lvl w:ilvl="7">
+      <w:start w:val="1"/>
+      <w:numFmt w:val="bullet"/>
+      <w:lvlText w:val="○"/>
+      <w:lvlJc w:val="left"/>
+      <w:pPr>
+        <w:ind w:left="5760" w:hanging="360"/>
+      </w:pPr>
+      <w:rPr>
+        <w:u w:val="none"/>
+      </w:rPr>
+    </w:lvl>
+    <w:lvl w:ilvl="8">
+      <w:start w:val="1"/>
+      <w:numFmt w:val="bullet"/>
+      <w:lvlText w:val="■"/>
+      <w:lvlJc w:val="left"/>
+      <w:pPr>
+        <w:ind w:left="6480" w:hanging="360"/>
+      </w:pPr>
+      <w:rPr>
+        <w:u w:val="none"/>
+      </w:rPr>
+    </w:lvl>
+  </w:abstractNum>
+  <w:abstractNum w:abstractNumId="5">
+    <w:lvl w:ilvl="0">
+      <w:start w:val="1"/>
+      <w:numFmt w:val="bullet"/>
+      <w:lvlText w:val="●"/>
+      <w:lvlJc w:val="left"/>
+      <w:pPr>
+        <w:ind w:left="720" w:hanging="360"/>
+      </w:pPr>
+      <w:rPr>
+        <w:u w:val="none"/>
+      </w:rPr>
+    </w:lvl>
+    <w:lvl w:ilvl="1">
+      <w:start w:val="1"/>
+      <w:numFmt w:val="bullet"/>
+      <w:lvlText w:val="○"/>
+      <w:lvlJc w:val="left"/>
+      <w:pPr>
+        <w:ind w:left="1440" w:hanging="360"/>
+      </w:pPr>
+      <w:rPr>
+        <w:u w:val="none"/>
+      </w:rPr>
+    </w:lvl>
+    <w:lvl w:ilvl="2">
+      <w:start w:val="1"/>
+      <w:numFmt w:val="bullet"/>
+      <w:lvlText w:val="■"/>
+      <w:lvlJc w:val="left"/>
+      <w:pPr>
+        <w:ind w:left="2160" w:hanging="360"/>
+      </w:pPr>
+      <w:rPr>
+        <w:u w:val="none"/>
+      </w:rPr>
+    </w:lvl>
+    <w:lvl w:ilvl="3">
+      <w:start w:val="1"/>
+      <w:numFmt w:val="bullet"/>
+      <w:lvlText w:val="●"/>
+      <w:lvlJc w:val="left"/>
+      <w:pPr>
+        <w:ind w:left="2880" w:hanging="360"/>
+      </w:pPr>
+      <w:rPr>
+        <w:u w:val="none"/>
+      </w:rPr>
+    </w:lvl>
+    <w:lvl w:ilvl="4">
+      <w:start w:val="1"/>
+      <w:numFmt w:val="bullet"/>
+      <w:lvlText w:val="○"/>
+      <w:lvlJc w:val="left"/>
+      <w:pPr>
+        <w:ind w:left="3600" w:hanging="360"/>
+      </w:pPr>
+      <w:rPr>
+        <w:u w:val="none"/>
+      </w:rPr>
+    </w:lvl>
+    <w:lvl w:ilvl="5">
+      <w:start w:val="1"/>
+      <w:numFmt w:val="bullet"/>
+      <w:lvlText w:val="■"/>
+      <w:lvlJc w:val="left"/>
+      <w:pPr>
+        <w:ind w:left="4320" w:hanging="360"/>
+      </w:pPr>
+      <w:rPr>
+        <w:u w:val="none"/>
+      </w:rPr>
+    </w:lvl>
+    <w:lvl w:ilvl="6">
+      <w:start w:val="1"/>
+      <w:numFmt w:val="bullet"/>
+      <w:lvlText w:val="●"/>
+      <w:lvlJc w:val="left"/>
+      <w:pPr>
+        <w:ind w:left="5040" w:hanging="360"/>
+      </w:pPr>
+      <w:rPr>
+        <w:u w:val="none"/>
+      </w:rPr>
+    </w:lvl>
+    <w:lvl w:ilvl="7">
+      <w:start w:val="1"/>
+      <w:numFmt w:val="bullet"/>
+      <w:lvlText w:val="○"/>
+      <w:lvlJc w:val="left"/>
+      <w:pPr>
+        <w:ind w:left="5760" w:hanging="360"/>
+      </w:pPr>
+      <w:rPr>
+        <w:u w:val="none"/>
+      </w:rPr>
+    </w:lvl>
+    <w:lvl w:ilvl="8">
+      <w:start w:val="1"/>
+      <w:numFmt w:val="bullet"/>
+      <w:lvlText w:val="■"/>
+      <w:lvlJc w:val="left"/>
+      <w:pPr>
+        <w:ind w:left="6480" w:hanging="360"/>
+      </w:pPr>
+      <w:rPr>
+        <w:u w:val="none"/>
+      </w:rPr>
+    </w:lvl>
+  </w:abstractNum>
   <w:num w:numId="1">
     <w:abstractNumId w:val="1"/>
   </w:num>
@@ -1427,6 +1950,12 @@
   </w:num>
   <w:num w:numId="3">
     <w:abstractNumId w:val="3"/>
+  </w:num>
+  <w:num w:numId="4">
+    <w:abstractNumId w:val="4"/>
+  </w:num>
+  <w:num w:numId="5">
+    <w:abstractNumId w:val="5"/>
   </w:num>
 </w:numbering>
 </file>

</xml_diff>

<commit_message>
Site positioning: single spine narrative + 6-surface Thios + resume sync
- Homepage hero/About/title/meta lead with "make complex systems usable & adopted at scale"; AI subordinated to evidence (per VP-Design review)

- Position as Staff IC with proven team leadership as range; "Principal" only in OPEN TO; de-aged "30 years" -> "6 Web eras, one operator"

- Thios case study + homepage: 5->6 surfaces (Figma now built/live)

- resume.php synced; all 7 resume binaries regenerated

Co-Authored-By: Claude Opus 4.8 (1M context) <noreply@anthropic.com>
</commit_message>
<xml_diff>
--- a/Peter-Bartsch-Resume.docx
+++ b/Peter-Bartsch-Resume.docx
@@ -26,7 +26,7 @@
           <w:color w:val="434343"/>
           <w:rtl w:val="0"/>
         </w:rPr>
-        <w:t xml:space="preserve">. Led UX for a $3.8B subscription platform at Deere across web, mobile, and embedded equipment systems (500K users, 12 languages). Built design org 1→10 at FourKites scaling a real-time IoT asset-tracking platform processing 10M+ daily events ($3M→$100M ARR, $1B+ valuation). Now founder of Thios — running an AI-native workflow (Claude, Cursor, Figma Make) to ship a CAD-driven configurator, dev-grade design system with its own Claude Skill, and physical hardware.</w:t>
+        <w:t xml:space="preserve">. Led UX for a $3.8B subscription platform at Deere across web, mobile, and embedded equipment systems (500K users, 12 languages). Built design org 1→10 at FourKites scaling a real-time IoT asset-tracking platform processing 10M+ daily events ($3M→$100M ARR, $1B+ valuation). Now founder of Thios — running an AI-native workflow (Claude, Cursor, Figma Make) to ship a CAD-driven configurator, a dev-grade design system with its own Claude Skill, and physical hardware.</w:t>
       </w:r>
       <w:r>
         <w:rPr>
@@ -86,7 +86,7 @@
           <w:color w:val="434343"/>
           <w:rtl w:val="0"/>
         </w:rPr>
-        <w:t xml:space="preserve">Open-source modular structures running on a 5-surface design system where I'm the only designer and agents are the engineering team, every surface (DESIGN.md ↔ tokens.json ↔ main.css ↔ design-system.html ↔ OnShape) ships from one source of truth.</w:t>
+        <w:t xml:space="preserve">Open-source modular structures running on a 6-surface design system where I'm the only designer and agents are the engineering team, every surface (DESIGN.md ↔ tokens.json ↔ main.css ↔ design-system.html ↔ OnShape ↔ Figma) ships from one source of truth.</w:t>
       </w:r>
       <w:r>
         <w:rPr>
@@ -117,7 +117,7 @@
           <w:szCs w:val="20"/>
           <w:rtl w:val="0"/>
         </w:rPr>
-        <w:t xml:space="preserve">Shipped a complete product ecosystem solo in 21 months</w:t>
+        <w:t xml:space="preserve">Shipped a complete product ecosystem solo in nearly 2 years</w:t>
       </w:r>
       <w:r>
         <w:rPr>
@@ -187,7 +187,7 @@
           <w:szCs w:val="20"/>
           <w:rtl w:val="0"/>
         </w:rPr>
-        <w:t xml:space="preserve">Built a 5-surface, dev-grade design system</w:t>
+        <w:t xml:space="preserve">Built a 6-surface, dev-grade design system</w:t>
       </w:r>
       <w:r>
         <w:rPr>
@@ -523,7 +523,7 @@
           <w:szCs w:val="20"/>
           <w:rtl w:val="0"/>
         </w:rPr>
-        <w:t xml:space="preserve">embedded in engineering sprint cadence; established component library, design ops, and hiring framework,  –65% one-off component variants while maintaining startup velocity</w:t>
+        <w:t xml:space="preserve">embedded in engineering sprint cadence; established component library, design ops, and hiring framework;  –65% one-off component variants while maintaining startup velocity</w:t>
       </w:r>
     </w:p>
     <w:p>
@@ -559,7 +559,7 @@
           <w:color w:val="434343"/>
           <w:rtl w:val="0"/>
         </w:rPr>
-        <w:t xml:space="preserve">MAVENWAVE PARTNERS | Senior UX + Agile Lead </w:t>
+        <w:t xml:space="preserve">MAVENWAVE PARTNERS | Senior UX + Agile Lead</w:t>
       </w:r>
       <w:r>
         <w:rPr>

</xml_diff>

<commit_message>
Resume binaries: refreshed exports (pdf/docx/rtf/epub/md)
Co-Authored-By: Claude Opus 4.8 (1M context) <noreply@anthropic.com>
</commit_message>
<xml_diff>
--- a/Peter-Bartsch-Resume.docx
+++ b/Peter-Bartsch-Resume.docx
@@ -15,10 +15,22 @@
       </w:pPr>
       <w:r>
         <w:rPr>
-          <w:color w:val="434343"/>
-          <w:rtl w:val="0"/>
-        </w:rPr>
-        <w:t xml:space="preserve">Staff Product Designer — design systems · AI-native workflow</w:t>
+          <w:rFonts w:ascii="Roboto" w:cs="Roboto" w:eastAsia="Roboto" w:hAnsi="Roboto"/>
+          <w:b w:val="1"/>
+          <w:bCs w:val="1"/>
+          <w:color w:val="0a0a0a"/>
+          <w:sz w:val="21"/>
+          <w:szCs w:val="21"/>
+          <w:rtl w:val="0"/>
+        </w:rPr>
+        <w:t xml:space="preserve">Staff / Principal Product Designer</w:t>
+      </w:r>
+      <w:r>
+        <w:rPr>
+          <w:color w:val="434343"/>
+          <w:rtl w:val="0"/>
+        </w:rPr>
+        <w:t xml:space="preserve"> — design systems · AI-native workflow</w:t>
       </w:r>
       <w:r>
         <w:rPr>

</xml_diff>

<commit_message>
Site: deck sync, native diagrams, calm pass, résumé sync, review fixes
- Sync homepage + case pages to the portfolio deck: "Five patterns" thesis,
  verbatim outcome headlines, closing statement, 4th receipt, MyBoards framing.
- Four native HTML/CSS "thinking" diagrams: Deere license-state, Deere-nav
  convergence, FourKites confidence-routing, Thios Figma->DESIGN.md inversion.
- Case-page judgment layers (Ruled Out / The Bet / what-flopped) on the featured cases.
- Calm pass: de-bold cards + experience, more section whitespace, lifted case panel.
- Web résumé synced to the aligned downloadable (enterprise-platforms opener,
  "helped drive 3x", Build & Technical skills; connected-services standardized).
- Review fixes: How-I-Think leads, Thios-as-proof availability framing, sharper ask,
  centered single-line metric labels, tightened capability band.

Co-Authored-By: Claude Opus 4.8 (1M context) <noreply@anthropic.com>
</commit_message>
<xml_diff>
--- a/Peter-Bartsch-Resume.docx
+++ b/Peter-Bartsch-Resume.docx
@@ -16,6 +16,7 @@
     <w:p>
       <w:pPr>
         <w:spacing w:after="120" w:before="0" w:lineRule="auto"/>
+        <w:jc w:val="both"/>
         <w:rPr/>
       </w:pPr>
       <w:r>
@@ -28,7 +29,7 @@
           <w:szCs w:val="20"/>
           <w:rtl w:val="0"/>
         </w:rPr>
-        <w:t xml:space="preserve">Staff / Principal Product Designer — design systems · AI-native workflow. </w:t>
+        <w:t xml:space="preserve">Staff / Principal Product Designer — design systems · enterprise platforms. </w:t>
       </w:r>
       <w:r>
         <w:rPr>
@@ -38,7 +39,7 @@
           <w:szCs w:val="20"/>
           <w:rtl w:val="0"/>
         </w:rPr>
-        <w:t xml:space="preserve">Led UX for a $3.8B platform at Deere across web, mobile, and embedded equipment systems (500K users, 12 languages). Built design org 1→10 at FourKites scaling a real-time IoT asset-tracking platform processing 10M+ daily events ($3M→$100M ARR, $1B+ valuation). Now founder of Thios — running an AI-native workflow (Claude, Cursor, Figma Make) to ship a CAD-driven configurator, a dev-grade design system with its own Claude Skill, and physical hardware.</w:t>
+        <w:t xml:space="preserve">I make complex enterprise systems usable and get them adopted at scale — then build them, not just spec them: front-end, design systems in code, parametric CAD, and physical hardware, with AI-native tooling to ship solo. Led UX for a $3.8B connected-services platform at Deere (500K users; web, mobile, embedded), built the design org 1→10 at FourKites scaling a real-time IoT platform ($3M→$100M ARR, $1B+ valuation), and now founder of Thios (thios.co) — shipping a CAD-driven product line, a dev-grade design system, and physical hardware end to end.</w:t>
       </w:r>
       <w:r>
         <w:rPr>
@@ -112,7 +113,7 @@
           <w:szCs w:val="20"/>
           <w:rtl w:val="0"/>
         </w:rPr>
-        <w:t xml:space="preserve">Founder &amp; Lead Designer  </w:t>
+        <w:t xml:space="preserve">Founder &amp; Lead Designer   </w:t>
       </w:r>
       <w:r>
         <w:rPr>
@@ -422,7 +423,7 @@
           <w:szCs w:val="20"/>
           <w:rtl w:val="0"/>
         </w:rPr>
-        <w:t xml:space="preserve">JOHN DEERE | Senior Lead UX; Digital Customer Experience  </w:t>
+        <w:t xml:space="preserve">JOHN DEERE | Senior Lead UX; Digital Customer Experience   </w:t>
       </w:r>
       <w:r>
         <w:rPr>
@@ -633,7 +634,7 @@
           <w:szCs w:val="20"/>
           <w:rtl w:val="0"/>
         </w:rPr>
-        <w:t xml:space="preserve">FOURKITES | Lead UX / Manager  </w:t>
+        <w:t xml:space="preserve">FOURKITES | Lead UX / Manager   </w:t>
       </w:r>
       <w:r>
         <w:rPr>
@@ -714,7 +715,7 @@
           <w:vertAlign w:val="baseline"/>
           <w:rtl w:val="0"/>
         </w:rPr>
-        <w:t xml:space="preserve">Designed flagship IoT asset-tracking platform 0→1 — real-time supply chain control tower (web) and mobile apps processing 10M+ daily GPS/telematics events for 30+ Fortune 2000 customers (Anheuser-Busch, Georgia-Pacific, Tyson); high-density dashboards with map, list, and timeline views became the primary driver of 3x customer expansion.</w:t>
+        <w:t xml:space="preserve">Designed flagship IoT asset-tracking platform 0→1 — real-time supply chain control tower (web) and mobile apps processing 10M+ daily GPS/telematics events for 30+ Fortune 2000 customers (Anheuser-Busch, Georgia-Pacific, Tyson); high-density dashboards with map, list, and timeline views helped drive 3× customer expansion.</w:t>
       </w:r>
       <w:r>
         <w:rPr>
@@ -844,7 +845,7 @@
           <w:szCs w:val="20"/>
           <w:rtl w:val="0"/>
         </w:rPr>
-        <w:t xml:space="preserve">MAVENWAVE PARTNERS | Senior UX + Agile Lead  </w:t>
+        <w:t xml:space="preserve">MAVENWAVE PARTNERS | Senior UX + Agile Lead   </w:t>
       </w:r>
       <w:r>
         <w:rPr>
@@ -1115,6 +1116,7 @@
           <w:rtl w:val="0"/>
         </w:rPr>
         <w:t xml:space="preserve">Product Marketing Manager, HERE Traffic | GPS probe visualizations, real-time vehicle-telematics data products, and go-to-market for DEMPSY (open-source distributed computing).  </w:t>
+        <w:br w:type="textWrapping"/>
       </w:r>
       <w:r>
         <w:rPr>
@@ -1159,10 +1161,73 @@
         </w:tabs>
         <w:spacing w:after="40" w:before="80" w:lineRule="auto"/>
         <w:ind w:left="720" w:firstLine="0"/>
-        <w:rPr>
+        <w:rPr/>
+      </w:pPr>
+      <w:r>
+        <w:rPr>
+          <w:rFonts w:ascii="Arial" w:cs="Arial" w:eastAsia="Arial" w:hAnsi="Arial"/>
           <w:b w:val="1"/>
           <w:bCs w:val="1"/>
-        </w:rPr>
+          <w:color w:val="2d2d2d"/>
+          <w:sz w:val="19"/>
+          <w:szCs w:val="19"/>
+          <w:rtl w:val="0"/>
+        </w:rPr>
+        <w:t xml:space="preserve">GOGO INFLIGHT INTERNET | </w:t>
+      </w:r>
+      <w:r>
+        <w:rPr>
+          <w:rFonts w:ascii="Arial Unicode MS" w:cs="Arial Unicode MS" w:eastAsia="Arial Unicode MS" w:hAnsi="Arial Unicode MS"/>
+          <w:color w:val="555555"/>
+          <w:sz w:val="19"/>
+          <w:szCs w:val="19"/>
+          <w:rtl w:val="0"/>
+        </w:rPr>
+        <w:t xml:space="preserve">Product Manager – Signature Services | Launched in-flight internet across major US airlines; onboard hardware UX + Air-to-Ground RF network; FAA-approved documentation; 0→1 in-flight tracker driving sponsorship deals.  </w:t>
+        <w:br w:type="textWrapping"/>
+      </w:r>
+      <w:r>
+        <w:rPr>
+          <w:rFonts w:ascii="Arial" w:cs="Arial" w:eastAsia="Arial" w:hAnsi="Arial"/>
+          <w:color w:val="888888"/>
+          <w:sz w:val="19"/>
+          <w:szCs w:val="19"/>
+          <w:rtl w:val="0"/>
+        </w:rPr>
+        <w:t xml:space="preserve">Apr 2008 – Aug 2012</w:t>
+      </w:r>
+      <w:r>
+        <w:rPr>
+          <w:rtl w:val="0"/>
+        </w:rPr>
+      </w:r>
+    </w:p>
+    <w:p>
+      <w:pPr>
+        <w:spacing w:after="0" w:before="80" w:lineRule="auto"/>
+        <w:rPr/>
+      </w:pPr>
+      <w:r>
+        <w:rPr>
+          <w:rtl w:val="0"/>
+        </w:rPr>
+      </w:r>
+    </w:p>
+    <w:p>
+      <w:pPr>
+        <w:spacing w:after="0" w:before="80" w:lineRule="auto"/>
+        <w:rPr/>
+      </w:pPr>
+      <w:r>
+        <w:rPr>
+          <w:rtl w:val="0"/>
+        </w:rPr>
+      </w:r>
+    </w:p>
+    <w:p>
+      <w:pPr>
+        <w:spacing w:after="60" w:before="160" w:lineRule="auto"/>
+        <w:rPr/>
       </w:pPr>
       <w:r>
         <w:rPr>
@@ -1170,58 +1235,127 @@
           <w:b w:val="1"/>
           <w:bCs w:val="1"/>
           <w:color w:val="2d2d2d"/>
-          <w:sz w:val="19"/>
-          <w:szCs w:val="19"/>
-          <w:rtl w:val="0"/>
-        </w:rPr>
-        <w:t xml:space="preserve">GOGO INFLIGHT INTERNET | </w:t>
-      </w:r>
-      <w:r>
-        <w:rPr>
-          <w:rFonts w:ascii="Arial Unicode MS" w:cs="Arial Unicode MS" w:eastAsia="Arial Unicode MS" w:hAnsi="Arial Unicode MS"/>
+          <w:sz w:val="20"/>
+          <w:szCs w:val="20"/>
+          <w:rtl w:val="0"/>
+        </w:rPr>
+        <w:t xml:space="preserve">SKILLS</w:t>
+      </w:r>
+      <w:r>
+        <w:rPr>
+          <w:rtl w:val="0"/>
+        </w:rPr>
+      </w:r>
+    </w:p>
+    <w:p>
+      <w:pPr>
+        <w:spacing w:after="40" w:before="40" w:lineRule="auto"/>
+        <w:ind w:left="720" w:firstLine="0"/>
+        <w:rPr>
+          <w:rFonts w:ascii="Arial" w:cs="Arial" w:eastAsia="Arial" w:hAnsi="Arial"/>
           <w:color w:val="555555"/>
           <w:sz w:val="19"/>
           <w:szCs w:val="19"/>
-          <w:rtl w:val="0"/>
-        </w:rPr>
-        <w:t xml:space="preserve">Product Manager – Signature Services | Launched in-flight internet across major US airlines; onboard hardware UX + Air-to-Ground RF network; FAA-approved documentation; 0→1 in-flight tracker driving sponsorship deals.  </w:t>
-      </w:r>
-      <w:r>
-        <w:rPr>
-          <w:rFonts w:ascii="Arial" w:cs="Arial" w:eastAsia="Arial" w:hAnsi="Arial"/>
-          <w:color w:val="888888"/>
-          <w:sz w:val="19"/>
-          <w:szCs w:val="19"/>
-          <w:rtl w:val="0"/>
-        </w:rPr>
-        <w:t xml:space="preserve">Apr 2008 – Aug 2012</w:t>
-      </w:r>
-      <w:r>
-        <w:rPr>
-          <w:rtl w:val="0"/>
-        </w:rPr>
-      </w:r>
-    </w:p>
-    <w:p>
-      <w:pPr>
-        <w:spacing w:after="60" w:before="160" w:lineRule="auto"/>
-        <w:rPr>
+        </w:rPr>
+      </w:pPr>
+      <w:r>
+        <w:rPr>
+          <w:rFonts w:ascii="Arial" w:cs="Arial" w:eastAsia="Arial" w:hAnsi="Arial"/>
           <w:b w:val="1"/>
           <w:bCs w:val="1"/>
-        </w:rPr>
-      </w:pPr>
-      <w:r>
-        <w:rPr>
-          <w:rtl w:val="0"/>
-        </w:rPr>
-      </w:r>
-    </w:p>
-    <w:p>
-      <w:pPr>
-        <w:spacing w:after="60" w:before="160" w:lineRule="auto"/>
-        <w:rPr>
+          <w:color w:val="2d2d2d"/>
+          <w:sz w:val="19"/>
+          <w:szCs w:val="19"/>
+          <w:rtl w:val="0"/>
+        </w:rPr>
+        <w:t xml:space="preserve">UX Systems: </w:t>
+      </w:r>
+      <w:r>
+        <w:rPr>
+          <w:rFonts w:ascii="Arial" w:cs="Arial" w:eastAsia="Arial" w:hAnsi="Arial"/>
+          <w:color w:val="555555"/>
+          <w:sz w:val="19"/>
+          <w:szCs w:val="19"/>
+          <w:rtl w:val="0"/>
+        </w:rPr>
+        <w:t xml:space="preserve">User flows · journey mapping · IA · interaction design · state management · edge-case coverage (idle/loading/success/error/empty) · information density · dashboards · enterprise design systems · design tokens · accessibility (WCAG 2.1)</w:t>
+      </w:r>
+    </w:p>
+    <w:p>
+      <w:pPr>
+        <w:spacing w:after="40" w:before="40" w:lineRule="auto"/>
+        <w:ind w:left="720" w:firstLine="0"/>
+        <w:rPr>
+          <w:color w:val="555555"/>
+          <w:sz w:val="19"/>
+          <w:szCs w:val="19"/>
+        </w:rPr>
+      </w:pPr>
+      <w:r>
+        <w:rPr>
+          <w:rtl w:val="0"/>
+        </w:rPr>
+      </w:r>
+    </w:p>
+    <w:p>
+      <w:pPr>
+        <w:spacing w:after="40" w:before="40" w:lineRule="auto"/>
+        <w:ind w:left="720" w:firstLine="0"/>
+        <w:rPr>
+          <w:rFonts w:ascii="Arial" w:cs="Arial" w:eastAsia="Arial" w:hAnsi="Arial"/>
+          <w:color w:val="555555"/>
+          <w:sz w:val="19"/>
+          <w:szCs w:val="19"/>
+        </w:rPr>
+      </w:pPr>
+      <w:r>
+        <w:rPr>
+          <w:rFonts w:ascii="Arial" w:cs="Arial" w:eastAsia="Arial" w:hAnsi="Arial"/>
           <w:b w:val="1"/>
           <w:bCs w:val="1"/>
+          <w:color w:val="2d2d2d"/>
+          <w:sz w:val="19"/>
+          <w:szCs w:val="19"/>
+          <w:rtl w:val="0"/>
+        </w:rPr>
+        <w:t xml:space="preserve">Research &amp; Methods: </w:t>
+      </w:r>
+      <w:r>
+        <w:rPr>
+          <w:rFonts w:ascii="Arial" w:cs="Arial" w:eastAsia="Arial" w:hAnsi="Arial"/>
+          <w:color w:val="555555"/>
+          <w:sz w:val="19"/>
+          <w:szCs w:val="19"/>
+          <w:rtl w:val="0"/>
+        </w:rPr>
+        <w:t xml:space="preserve">User interviews · usability testing · design sprints · Lean UX · Agile/Scrum sprint cadence · PRD/RFC participation</w:t>
+      </w:r>
+    </w:p>
+    <w:p>
+      <w:pPr>
+        <w:spacing w:after="40" w:before="40" w:lineRule="auto"/>
+        <w:ind w:left="720" w:firstLine="0"/>
+        <w:rPr>
+          <w:color w:val="555555"/>
+          <w:sz w:val="19"/>
+          <w:szCs w:val="19"/>
+        </w:rPr>
+      </w:pPr>
+      <w:r>
+        <w:rPr>
+          <w:rtl w:val="0"/>
+        </w:rPr>
+      </w:r>
+    </w:p>
+    <w:p>
+      <w:pPr>
+        <w:spacing w:after="40" w:before="40" w:lineRule="auto"/>
+        <w:ind w:left="720" w:firstLine="0"/>
+        <w:rPr>
+          <w:rFonts w:ascii="Arial" w:cs="Arial" w:eastAsia="Arial" w:hAnsi="Arial"/>
+          <w:color w:val="555555"/>
+          <w:sz w:val="19"/>
+          <w:szCs w:val="19"/>
         </w:rPr>
       </w:pPr>
       <w:r>
@@ -1230,25 +1364,93 @@
           <w:b w:val="1"/>
           <w:bCs w:val="1"/>
           <w:color w:val="2d2d2d"/>
-          <w:sz w:val="20"/>
-          <w:szCs w:val="20"/>
-          <w:rtl w:val="0"/>
-        </w:rPr>
-        <w:t xml:space="preserve">SKILLS</w:t>
-      </w:r>
-      <w:r>
-        <w:rPr>
+          <w:sz w:val="19"/>
+          <w:szCs w:val="19"/>
+          <w:rtl w:val="0"/>
+        </w:rPr>
+        <w:t xml:space="preserve">AI-Native Workflow: </w:t>
+      </w:r>
+      <w:r>
+        <w:rPr>
+          <w:rFonts w:ascii="Arial" w:cs="Arial" w:eastAsia="Arial" w:hAnsi="Arial"/>
+          <w:color w:val="555555"/>
+          <w:sz w:val="19"/>
+          <w:szCs w:val="19"/>
+          <w:rtl w:val="0"/>
+        </w:rPr>
+        <w:t xml:space="preserve">Claude (incl. authoring custom Claude Skill) · Cursor · Figma Make · Adobe Firefly · Midjourney · Obsidian as knowledge base</w:t>
+      </w:r>
+    </w:p>
+    <w:p>
+      <w:pPr>
+        <w:spacing w:after="40" w:before="40" w:lineRule="auto"/>
+        <w:ind w:left="720" w:firstLine="0"/>
+        <w:rPr>
+          <w:color w:val="555555"/>
+          <w:sz w:val="19"/>
+          <w:szCs w:val="19"/>
+        </w:rPr>
+      </w:pPr>
+      <w:r>
+        <w:rPr>
+          <w:rtl w:val="0"/>
+        </w:rPr>
+      </w:r>
+    </w:p>
+    <w:p>
+      <w:pPr>
+        <w:spacing w:after="40" w:before="40" w:lineRule="auto"/>
+        <w:ind w:left="720" w:firstLine="0"/>
+        <w:rPr>
+          <w:rFonts w:ascii="Arial" w:cs="Arial" w:eastAsia="Arial" w:hAnsi="Arial"/>
+          <w:color w:val="555555"/>
+          <w:sz w:val="19"/>
+          <w:szCs w:val="19"/>
+        </w:rPr>
+      </w:pPr>
+      <w:r>
+        <w:rPr>
+          <w:rFonts w:ascii="Arial" w:cs="Arial" w:eastAsia="Arial" w:hAnsi="Arial"/>
           <w:b w:val="1"/>
           <w:bCs w:val="1"/>
-          <w:rtl w:val="0"/>
-        </w:rPr>
-        <w:br w:type="textWrapping"/>
+          <w:color w:val="2d2d2d"/>
+          <w:sz w:val="19"/>
+          <w:szCs w:val="19"/>
+          <w:rtl w:val="0"/>
+        </w:rPr>
+        <w:t xml:space="preserve">Build &amp; Technical: </w:t>
+      </w:r>
+      <w:r>
+        <w:rPr>
+          <w:rFonts w:ascii="Arial" w:cs="Arial" w:eastAsia="Arial" w:hAnsi="Arial"/>
+          <w:color w:val="555555"/>
+          <w:sz w:val="19"/>
+          <w:szCs w:val="19"/>
+          <w:rtl w:val="0"/>
+        </w:rPr>
+        <w:t xml:space="preserve">Front-end — HTML · CSS · JavaScript · React / Three.js prototyping · parametric CAD (OnShape) · 3D (Blender) · physical prototyping &amp; fabrication</w:t>
       </w:r>
     </w:p>
     <w:p>
       <w:pPr>
         <w:spacing w:after="40" w:before="40" w:lineRule="auto"/>
         <w:ind w:left="720" w:firstLine="0"/>
+        <w:rPr>
+          <w:color w:val="555555"/>
+          <w:sz w:val="19"/>
+          <w:szCs w:val="19"/>
+        </w:rPr>
+      </w:pPr>
+      <w:r>
+        <w:rPr>
+          <w:rtl w:val="0"/>
+        </w:rPr>
+      </w:r>
+    </w:p>
+    <w:p>
+      <w:pPr>
+        <w:spacing w:after="40" w:before="40" w:lineRule="auto"/>
+        <w:ind w:left="720" w:firstLine="0"/>
         <w:rPr/>
       </w:pPr>
       <w:r>
@@ -1261,7 +1463,7 @@
           <w:szCs w:val="19"/>
           <w:rtl w:val="0"/>
         </w:rPr>
-        <w:t xml:space="preserve">UX Systems: </w:t>
+        <w:t xml:space="preserve">Tools: </w:t>
       </w:r>
       <w:r>
         <w:rPr>
@@ -1271,182 +1473,32 @@
           <w:szCs w:val="19"/>
           <w:rtl w:val="0"/>
         </w:rPr>
-        <w:t xml:space="preserve">User flows · journey mapping · IA · interaction design · state management · edge-case coverage (idle/loading/success/error/empty) · information density · dashboards · enterprise design systems · design tokens · accessibility (WCAG 2.1)</w:t>
-      </w:r>
-      <w:r>
-        <w:rPr>
-          <w:rtl w:val="0"/>
-        </w:rPr>
-      </w:r>
-    </w:p>
-    <w:p>
-      <w:pPr>
-        <w:spacing w:after="40" w:before="40" w:lineRule="auto"/>
-        <w:ind w:left="720" w:firstLine="0"/>
+        <w:t xml:space="preserve">Figma · OnShape CAD · Blender 3D · Adobe Creative Suite</w:t>
+      </w:r>
+      <w:r>
+        <w:rPr>
+          <w:rtl w:val="0"/>
+        </w:rPr>
+      </w:r>
+    </w:p>
+    <w:p>
+      <w:pPr>
+        <w:spacing w:after="0" w:before="80" w:lineRule="auto"/>
+        <w:rPr/>
+      </w:pPr>
+      <w:r>
+        <w:rPr>
+          <w:rtl w:val="0"/>
+        </w:rPr>
+      </w:r>
+    </w:p>
+    <w:p>
+      <w:pPr>
+        <w:spacing w:after="60" w:before="160" w:lineRule="auto"/>
         <w:rPr>
           <w:b w:val="1"/>
           <w:bCs w:val="1"/>
-          <w:sz w:val="19"/>
-          <w:szCs w:val="19"/>
-        </w:rPr>
-      </w:pPr>
-      <w:r>
-        <w:rPr>
-          <w:rtl w:val="0"/>
-        </w:rPr>
-      </w:r>
-    </w:p>
-    <w:p>
-      <w:pPr>
-        <w:spacing w:after="40" w:before="40" w:lineRule="auto"/>
-        <w:ind w:left="720" w:firstLine="0"/>
-        <w:rPr/>
-      </w:pPr>
-      <w:r>
-        <w:rPr>
-          <w:rFonts w:ascii="Arial" w:cs="Arial" w:eastAsia="Arial" w:hAnsi="Arial"/>
-          <w:b w:val="1"/>
-          <w:bCs w:val="1"/>
-          <w:color w:val="2d2d2d"/>
-          <w:sz w:val="19"/>
-          <w:szCs w:val="19"/>
-          <w:rtl w:val="0"/>
-        </w:rPr>
-        <w:t xml:space="preserve">Research &amp; Methods: </w:t>
-      </w:r>
-      <w:r>
-        <w:rPr>
-          <w:rFonts w:ascii="Arial" w:cs="Arial" w:eastAsia="Arial" w:hAnsi="Arial"/>
-          <w:color w:val="555555"/>
-          <w:sz w:val="19"/>
-          <w:szCs w:val="19"/>
-          <w:rtl w:val="0"/>
-        </w:rPr>
-        <w:t xml:space="preserve">User interviews · usability testing · design sprints · Lean UX · Agile/Scrum sprint cadence · PRD/RFC participation</w:t>
-      </w:r>
-      <w:r>
-        <w:rPr>
-          <w:rtl w:val="0"/>
-        </w:rPr>
-      </w:r>
-    </w:p>
-    <w:p>
-      <w:pPr>
-        <w:spacing w:after="40" w:before="40" w:lineRule="auto"/>
-        <w:ind w:left="720" w:firstLine="0"/>
-        <w:rPr>
-          <w:b w:val="1"/>
-          <w:bCs w:val="1"/>
-          <w:sz w:val="19"/>
-          <w:szCs w:val="19"/>
-        </w:rPr>
-      </w:pPr>
-      <w:r>
-        <w:rPr>
-          <w:rtl w:val="0"/>
-        </w:rPr>
-      </w:r>
-    </w:p>
-    <w:p>
-      <w:pPr>
-        <w:spacing w:after="40" w:before="40" w:lineRule="auto"/>
-        <w:ind w:left="720" w:firstLine="0"/>
-        <w:rPr/>
-      </w:pPr>
-      <w:r>
-        <w:rPr>
-          <w:rFonts w:ascii="Arial" w:cs="Arial" w:eastAsia="Arial" w:hAnsi="Arial"/>
-          <w:b w:val="1"/>
-          <w:bCs w:val="1"/>
-          <w:color w:val="2d2d2d"/>
-          <w:sz w:val="19"/>
-          <w:szCs w:val="19"/>
-          <w:rtl w:val="0"/>
-        </w:rPr>
-        <w:t xml:space="preserve">AI-Native Workflow: </w:t>
-      </w:r>
-      <w:r>
-        <w:rPr>
-          <w:rFonts w:ascii="Arial" w:cs="Arial" w:eastAsia="Arial" w:hAnsi="Arial"/>
-          <w:color w:val="555555"/>
-          <w:sz w:val="19"/>
-          <w:szCs w:val="19"/>
-          <w:rtl w:val="0"/>
-        </w:rPr>
-        <w:t xml:space="preserve">Claude (incl. authoring custom Claude Skill) · Cursor · Figma Make · Adobe Firefly · Midjourney · Obsidian as knowledge base</w:t>
-      </w:r>
-      <w:r>
-        <w:rPr>
-          <w:rtl w:val="0"/>
-        </w:rPr>
-      </w:r>
-    </w:p>
-    <w:p>
-      <w:pPr>
-        <w:spacing w:after="40" w:before="40" w:lineRule="auto"/>
-        <w:ind w:left="720" w:firstLine="0"/>
-        <w:rPr>
-          <w:b w:val="1"/>
-          <w:bCs w:val="1"/>
-          <w:sz w:val="19"/>
-          <w:szCs w:val="19"/>
-        </w:rPr>
-      </w:pPr>
-      <w:r>
-        <w:rPr>
-          <w:rtl w:val="0"/>
-        </w:rPr>
-      </w:r>
-    </w:p>
-    <w:p>
-      <w:pPr>
-        <w:spacing w:after="40" w:before="40" w:lineRule="auto"/>
-        <w:ind w:left="720" w:firstLine="0"/>
-        <w:rPr/>
-      </w:pPr>
-      <w:r>
-        <w:rPr>
-          <w:rFonts w:ascii="Arial" w:cs="Arial" w:eastAsia="Arial" w:hAnsi="Arial"/>
-          <w:b w:val="1"/>
-          <w:bCs w:val="1"/>
-          <w:color w:val="2d2d2d"/>
-          <w:sz w:val="19"/>
-          <w:szCs w:val="19"/>
-          <w:rtl w:val="0"/>
-        </w:rPr>
-        <w:t xml:space="preserve">Tools: </w:t>
-      </w:r>
-      <w:r>
-        <w:rPr>
-          <w:rFonts w:ascii="Arial" w:cs="Arial" w:eastAsia="Arial" w:hAnsi="Arial"/>
-          <w:color w:val="555555"/>
-          <w:sz w:val="19"/>
-          <w:szCs w:val="19"/>
-          <w:rtl w:val="0"/>
-        </w:rPr>
-        <w:t xml:space="preserve">Figma · OnShape CAD · Blender 3D · HTML/CSS · Adobe Creative Suite</w:t>
-      </w:r>
-      <w:r>
-        <w:rPr>
-          <w:rtl w:val="0"/>
-        </w:rPr>
-      </w:r>
-    </w:p>
-    <w:p>
-      <w:pPr>
-        <w:spacing w:after="60" w:before="160" w:lineRule="auto"/>
-        <w:rPr/>
-      </w:pPr>
-      <w:r>
-        <w:rPr>
-          <w:rtl w:val="0"/>
-        </w:rPr>
-      </w:r>
-    </w:p>
-    <w:p>
-      <w:pPr>
-        <w:spacing w:after="60" w:before="160" w:lineRule="auto"/>
-        <w:rPr/>
+        </w:rPr>
       </w:pPr>
       <w:r>
         <w:rPr>
@@ -1504,25 +1556,19 @@
     </w:p>
     <w:p>
       <w:pPr>
-        <w:spacing w:after="60" w:before="160" w:lineRule="auto"/>
-        <w:rPr>
-          <w:b w:val="1"/>
-          <w:bCs w:val="1"/>
-        </w:rPr>
-      </w:pPr>
-      <w:r>
-        <w:rPr>
-          <w:rtl w:val="0"/>
-        </w:rPr>
-      </w:r>
-    </w:p>
-    <w:p>
-      <w:pPr>
-        <w:spacing w:after="60" w:before="160" w:lineRule="auto"/>
-        <w:rPr>
-          <w:b w:val="1"/>
-          <w:bCs w:val="1"/>
-        </w:rPr>
+        <w:spacing w:after="0" w:before="80" w:lineRule="auto"/>
+        <w:rPr/>
+      </w:pPr>
+      <w:r>
+        <w:rPr>
+          <w:rtl w:val="0"/>
+        </w:rPr>
+      </w:r>
+    </w:p>
+    <w:p>
+      <w:pPr>
+        <w:spacing w:after="0" w:before="80" w:lineRule="auto"/>
+        <w:rPr/>
       </w:pPr>
       <w:r>
         <w:rPr>
@@ -1603,7 +1649,7 @@
         <w:szCs w:val="36"/>
         <w:rtl w:val="0"/>
       </w:rPr>
-      <w:t xml:space="preserve">Peter Bartsch</w:t>
+      <w:t xml:space="preserve">PETER BARTSCH</w:t>
     </w:r>
     <w:r>
       <w:rPr>

</xml_diff>